<commit_message>
docs: update interim report with README, owners and PR annex (#27)
Co-Authored-By: Claude Sonnet 5.5 <noreply@anthropic.com>
</commit_message>
<xml_diff>
--- a/Fase 2/Informe intermedio de avance - ShelfVision AI.docx
+++ b/Fase 2/Informe intermedio de avance - ShelfVision AI.docx
@@ -1866,7 +1866,7 @@
         <w:t>main</w:t>
       </w:r>
       <w:r>
-        <w:t>. Entre el 2026-09-07 y el 2026-10-20 se integraron 33 Pull Requests (anexo A). Lo realizado, por área:</w:t>
+        <w:t>. Entre el 2026-09-07 y el 2026-10-20 se integraron 36 Pull Requests (anexo A). Lo realizado, por área:</w:t>
       </w:r>
     </w:p>
     <w:p>
@@ -3199,7 +3199,7 @@
                 <w:sz w:val="20"/>
                 <w:szCs w:val="20"/>
               </w:rPr>
-              <w:t>README, plan de pruebas, guía de entrenamiento y datasets. README completo en curso (#35).</w:t>
+              <w:t>README, plan de pruebas, guía de entrenamiento y datasets. README completo (#35, integrado el 2026-10-20).</w:t>
             </w:r>
           </w:p>
         </w:tc>
@@ -4358,7 +4358,7 @@
         <w:t>Pendientes con fecha:</w:t>
       </w:r>
       <w:r>
-        <w:t xml:space="preserve"> README completo y video (2026-10-21), evidencias de avance (2026-10-26), reportes (2026-10-27) y primer demo ante Walmart (2026-10-31).</w:t>
+        <w:t xml:space="preserve"> Video (2026-10-21), evidencias de avance (2026-10-26), reportes (2026-10-27) y primer demo ante Walmart (2026-10-31).</w:t>
       </w:r>
     </w:p>
     <w:p>
@@ -5982,7 +5982,7 @@
                 <w:sz w:val="20"/>
                 <w:szCs w:val="20"/>
               </w:rPr>
-              <w:t>README completo</w:t>
+              <w:t>README completo (cumplido)</w:t>
             </w:r>
           </w:p>
         </w:tc>
@@ -6140,7 +6140,7 @@
                 <w:sz w:val="20"/>
                 <w:szCs w:val="20"/>
               </w:rPr>
-              <w:t>Francisco</w:t>
+              <w:t>Nicko</w:t>
             </w:r>
           </w:p>
         </w:tc>
@@ -6961,7 +6961,7 @@
         <w:t>README.md</w:t>
       </w:r>
       <w:r>
-        <w:t xml:space="preserve"> del repositorio describe el problema, los objetivos, los requisitos (RF01-RF06 y RNF), los acuerdos con Walmart, la arquitectura, los datasets y la ejecución local. Se está completando en el ítem #35 con la justificación de cada decisión y los diagramas de componentes y de flujo. Las decisiones principales y su justificación:</w:t>
+        <w:t xml:space="preserve"> del repositorio describe el problema, los objetivos, los requisitos (RF01-RF06 y RNF), los acuerdos con Walmart, la arquitectura, los datasets y la ejecución local. El ítem #35 (2026-10-20) lo completó con la justificación de cada decisión, los diagramas de componentes y de flujo, la tabla de datasets (origen, cantidad, limpieza, etiquetado y preparación), el estado operativo y un ejemplo para reproducir la ejecución. Las decisiones principales y su justificación:</w:t>
       </w:r>
     </w:p>
     <w:tbl>
@@ -15812,7 +15812,7 @@
         <w:rPr>
           <w:highlight w:val="yellow"/>
         </w:rPr>
-        <w:t>Video en preparación (ítem #36, 2026-10-21); enlace por agregar.</w:t>
+        <w:t>Video en preparación (ítem #36, a cargo de Nicko, 2026-10-21); enlace por agregar.</w:t>
       </w:r>
       <w:r>
         <w:t xml:space="preserve"> El video (5 a 10 minutos) muestra solo lo que la aplicación hace hoy, con fotos que se pueden mostrar (no SKU-110K): inicio de sesión por perfil, creación de un usuario, análisis de una foto con su vista anotada, % libre y alerta, ciclo de la alerta desde la vista del reponedor, y la evaluación por lotes desde la línea de comandos.</w:t>
@@ -15899,7 +15899,7 @@
         <w:rPr>
           <w:highlight w:val="yellow"/>
         </w:rPr>
-        <w:t>Pending.</w:t>
+        <w:t>Draft, to be reviewed by Francisco. I worked on the computer-vision core and its integration: image correction, automatic shelf segmentation, the YOLO26 training on SKU-110K, the availability calculation, the end-to-end pipeline and the first version of the Django web app. The most valuable lesson was that a good detector metric does not guarantee a good system: the detector reaches 0.95 mAP50 on SKU-110K, yet on our own Kaggle photos its recall drops to 0.64 and every missed product turns into a false alert. Measuring this honestly, with the 10 best and 10 worst cases, changed our priorities: we now plan fine-tuning with photos outside SKU-110K and we declared loose fruit and vegetables out of scope. I also learned to write down every decision with its evidence, because the client changed the scope twice (whole-gondola alert, fixed depth) and the written reasoning made those changes cheap. Next, I want to measure real stock-outs with the Roboflow dataset and our own photos, and to help the team install the application on the CITT server.</w:t>
       </w:r>
     </w:p>
     <w:p>
@@ -18748,6 +18748,246 @@
                 <w:szCs w:val="20"/>
               </w:rPr>
               <w:t>feat: Django web app with role login, user CRUD and stock-out alerts (#28)</w:t>
+            </w:r>
+          </w:p>
+        </w:tc>
+      </w:tr>
+      <w:tr>
+        <w:tc>
+          <w:tcPr>
+            <w:tcW w:w="722" w:type="dxa"/>
+            <w:tcBorders>
+              <w:top w:val="single" w:sz="4" w:space="0" w:color="A6A6A6"/>
+              <w:left w:val="single" w:sz="4" w:space="0" w:color="A6A6A6"/>
+              <w:bottom w:val="single" w:sz="4" w:space="0" w:color="A6A6A6"/>
+              <w:right w:val="single" w:sz="4" w:space="0" w:color="A6A6A6"/>
+            </w:tcBorders>
+            <w:tcMar>
+              <w:top w:w="60" w:type="dxa"/>
+              <w:left w:w="100" w:type="dxa"/>
+              <w:bottom w:w="60" w:type="dxa"/>
+              <w:right w:w="100" w:type="dxa"/>
+            </w:tcMar>
+          </w:tcPr>
+          <w:p>
+            <w:r>
+              <w:rPr>
+                <w:sz w:val="20"/>
+                <w:szCs w:val="20"/>
+              </w:rPr>
+              <w:t>#36</w:t>
+            </w:r>
+          </w:p>
+        </w:tc>
+        <w:tc>
+          <w:tcPr>
+            <w:tcW w:w="1444" w:type="dxa"/>
+            <w:tcBorders>
+              <w:top w:val="single" w:sz="4" w:space="0" w:color="A6A6A6"/>
+              <w:left w:val="single" w:sz="4" w:space="0" w:color="A6A6A6"/>
+              <w:bottom w:val="single" w:sz="4" w:space="0" w:color="A6A6A6"/>
+              <w:right w:val="single" w:sz="4" w:space="0" w:color="A6A6A6"/>
+            </w:tcBorders>
+            <w:tcMar>
+              <w:top w:w="60" w:type="dxa"/>
+              <w:left w:w="100" w:type="dxa"/>
+              <w:bottom w:w="60" w:type="dxa"/>
+              <w:right w:w="100" w:type="dxa"/>
+            </w:tcMar>
+          </w:tcPr>
+          <w:p>
+            <w:r>
+              <w:rPr>
+                <w:sz w:val="20"/>
+                <w:szCs w:val="20"/>
+              </w:rPr>
+              <w:t>2026-10-20</w:t>
+            </w:r>
+          </w:p>
+        </w:tc>
+        <w:tc>
+          <w:tcPr>
+            <w:tcW w:w="6860" w:type="dxa"/>
+            <w:tcBorders>
+              <w:top w:val="single" w:sz="4" w:space="0" w:color="A6A6A6"/>
+              <w:left w:val="single" w:sz="4" w:space="0" w:color="A6A6A6"/>
+              <w:bottom w:val="single" w:sz="4" w:space="0" w:color="A6A6A6"/>
+              <w:right w:val="single" w:sz="4" w:space="0" w:color="A6A6A6"/>
+            </w:tcBorders>
+            <w:tcMar>
+              <w:top w:w="60" w:type="dxa"/>
+              <w:left w:w="100" w:type="dxa"/>
+              <w:bottom w:w="60" w:type="dxa"/>
+              <w:right w:w="100" w:type="dxa"/>
+            </w:tcMar>
+          </w:tcPr>
+          <w:p>
+            <w:r>
+              <w:rPr>
+                <w:sz w:val="20"/>
+                <w:szCs w:val="20"/>
+              </w:rPr>
+              <w:t>docs: interim report draft and results analysis on Kaggle photos (#27, #34)</w:t>
+            </w:r>
+          </w:p>
+        </w:tc>
+      </w:tr>
+      <w:tr>
+        <w:tc>
+          <w:tcPr>
+            <w:tcW w:w="722" w:type="dxa"/>
+            <w:tcBorders>
+              <w:top w:val="single" w:sz="4" w:space="0" w:color="A6A6A6"/>
+              <w:left w:val="single" w:sz="4" w:space="0" w:color="A6A6A6"/>
+              <w:bottom w:val="single" w:sz="4" w:space="0" w:color="A6A6A6"/>
+              <w:right w:val="single" w:sz="4" w:space="0" w:color="A6A6A6"/>
+            </w:tcBorders>
+            <w:tcMar>
+              <w:top w:w="60" w:type="dxa"/>
+              <w:left w:w="100" w:type="dxa"/>
+              <w:bottom w:w="60" w:type="dxa"/>
+              <w:right w:w="100" w:type="dxa"/>
+            </w:tcMar>
+          </w:tcPr>
+          <w:p>
+            <w:r>
+              <w:rPr>
+                <w:sz w:val="20"/>
+                <w:szCs w:val="20"/>
+              </w:rPr>
+              <w:t>#37</w:t>
+            </w:r>
+          </w:p>
+        </w:tc>
+        <w:tc>
+          <w:tcPr>
+            <w:tcW w:w="1444" w:type="dxa"/>
+            <w:tcBorders>
+              <w:top w:val="single" w:sz="4" w:space="0" w:color="A6A6A6"/>
+              <w:left w:val="single" w:sz="4" w:space="0" w:color="A6A6A6"/>
+              <w:bottom w:val="single" w:sz="4" w:space="0" w:color="A6A6A6"/>
+              <w:right w:val="single" w:sz="4" w:space="0" w:color="A6A6A6"/>
+            </w:tcBorders>
+            <w:tcMar>
+              <w:top w:w="60" w:type="dxa"/>
+              <w:left w:w="100" w:type="dxa"/>
+              <w:bottom w:w="60" w:type="dxa"/>
+              <w:right w:w="100" w:type="dxa"/>
+            </w:tcMar>
+          </w:tcPr>
+          <w:p>
+            <w:r>
+              <w:rPr>
+                <w:sz w:val="20"/>
+                <w:szCs w:val="20"/>
+              </w:rPr>
+              <w:t>2026-10-20</w:t>
+            </w:r>
+          </w:p>
+        </w:tc>
+        <w:tc>
+          <w:tcPr>
+            <w:tcW w:w="6860" w:type="dxa"/>
+            <w:tcBorders>
+              <w:top w:val="single" w:sz="4" w:space="0" w:color="A6A6A6"/>
+              <w:left w:val="single" w:sz="4" w:space="0" w:color="A6A6A6"/>
+              <w:bottom w:val="single" w:sz="4" w:space="0" w:color="A6A6A6"/>
+              <w:right w:val="single" w:sz="4" w:space="0" w:color="A6A6A6"/>
+            </w:tcBorders>
+            <w:tcMar>
+              <w:top w:w="60" w:type="dxa"/>
+              <w:left w:w="100" w:type="dxa"/>
+              <w:bottom w:w="60" w:type="dxa"/>
+              <w:right w:w="100" w:type="dxa"/>
+            </w:tcMar>
+          </w:tcPr>
+          <w:p>
+            <w:r>
+              <w:rPr>
+                <w:sz w:val="20"/>
+                <w:szCs w:val="20"/>
+              </w:rPr>
+              <w:t>docs: complete README for the interim report (#35)</w:t>
+            </w:r>
+          </w:p>
+        </w:tc>
+      </w:tr>
+      <w:tr>
+        <w:tc>
+          <w:tcPr>
+            <w:tcW w:w="722" w:type="dxa"/>
+            <w:tcBorders>
+              <w:top w:val="single" w:sz="4" w:space="0" w:color="A6A6A6"/>
+              <w:left w:val="single" w:sz="4" w:space="0" w:color="A6A6A6"/>
+              <w:bottom w:val="single" w:sz="4" w:space="0" w:color="A6A6A6"/>
+              <w:right w:val="single" w:sz="4" w:space="0" w:color="A6A6A6"/>
+            </w:tcBorders>
+            <w:tcMar>
+              <w:top w:w="60" w:type="dxa"/>
+              <w:left w:w="100" w:type="dxa"/>
+              <w:bottom w:w="60" w:type="dxa"/>
+              <w:right w:w="100" w:type="dxa"/>
+            </w:tcMar>
+          </w:tcPr>
+          <w:p>
+            <w:r>
+              <w:rPr>
+                <w:sz w:val="20"/>
+                <w:szCs w:val="20"/>
+              </w:rPr>
+              <w:t>#38</w:t>
+            </w:r>
+          </w:p>
+        </w:tc>
+        <w:tc>
+          <w:tcPr>
+            <w:tcW w:w="1444" w:type="dxa"/>
+            <w:tcBorders>
+              <w:top w:val="single" w:sz="4" w:space="0" w:color="A6A6A6"/>
+              <w:left w:val="single" w:sz="4" w:space="0" w:color="A6A6A6"/>
+              <w:bottom w:val="single" w:sz="4" w:space="0" w:color="A6A6A6"/>
+              <w:right w:val="single" w:sz="4" w:space="0" w:color="A6A6A6"/>
+            </w:tcBorders>
+            <w:tcMar>
+              <w:top w:w="60" w:type="dxa"/>
+              <w:left w:w="100" w:type="dxa"/>
+              <w:bottom w:w="60" w:type="dxa"/>
+              <w:right w:w="100" w:type="dxa"/>
+            </w:tcMar>
+          </w:tcPr>
+          <w:p>
+            <w:r>
+              <w:rPr>
+                <w:sz w:val="20"/>
+                <w:szCs w:val="20"/>
+              </w:rPr>
+              <w:t>2026-10-20</w:t>
+            </w:r>
+          </w:p>
+        </w:tc>
+        <w:tc>
+          <w:tcPr>
+            <w:tcW w:w="6860" w:type="dxa"/>
+            <w:tcBorders>
+              <w:top w:val="single" w:sz="4" w:space="0" w:color="A6A6A6"/>
+              <w:left w:val="single" w:sz="4" w:space="0" w:color="A6A6A6"/>
+              <w:bottom w:val="single" w:sz="4" w:space="0" w:color="A6A6A6"/>
+              <w:right w:val="single" w:sz="4" w:space="0" w:color="A6A6A6"/>
+            </w:tcBorders>
+            <w:tcMar>
+              <w:top w:w="60" w:type="dxa"/>
+              <w:left w:w="100" w:type="dxa"/>
+              <w:bottom w:w="60" w:type="dxa"/>
+              <w:right w:w="100" w:type="dxa"/>
+            </w:tcMar>
+          </w:tcPr>
+          <w:p>
+            <w:r>
+              <w:rPr>
+                <w:sz w:val="20"/>
+                <w:szCs w:val="20"/>
+              </w:rPr>
+              <w:t>docs: reassign demo video (#36) to Nicko</w:t>
             </w:r>
           </w:p>
         </w:tc>

</xml_diff>

<commit_message>
docs: add Mariana's reflection and mark improvement plan done in interim report (#27)
Fill Mariana's individual reflection in English (section 7) and fix the
improvement plan (#26), which was still listed as overdue although PR #45
completed it on 2026-10-20: Table 11, the Gantt summary counts (33 done,
4 in progress, 7 pending, 1 blocked) and the delays paragraph.
</commit_message>
<xml_diff>
--- a/Fase 2/Informe intermedio de avance - ShelfVision AI.docx
+++ b/Fase 2/Informe intermedio de avance - ShelfVision AI.docx
@@ -4301,7 +4301,7 @@
           <w:b/>
           <w:bCs/>
         </w:rPr>
-        <w:t>31 cumplidas, 4 en curso, 8 pendientes, 1 atrasada y 1 bloqueada.</w:t>
+        <w:t>33 cumplidas, 4 en curso, 7 pendientes y 1 bloqueada.</w:t>
       </w:r>
     </w:p>
     <w:p>
@@ -4339,7 +4339,7 @@
         <w:t>Retrasos:</w:t>
       </w:r>
       <w:r>
-        <w:t xml:space="preserve"> el plan de mejoras de la Fase 1 (#26) debía empezar a más tardar el 2026-10-09 y sigue atrasado. La aplicación web (#28) se esperaba antes y se completó el 2026-10-19. El informe de avance (#27) se reasignó el 2026-10-19 para no depender de otros ítems.</w:t>
+        <w:t xml:space="preserve"> el plan de mejoras de la Fase 1 (#26) debía empezar a más tardar el 2026-10-09 y se completó con atraso el 2026-10-20 (PR #45). La aplicación web (#28) se esperaba antes y se completó el 2026-10-19. El informe de avance (#27) se reasignó el 2026-10-19 para no depender de otros ítems.</w:t>
       </w:r>
     </w:p>
     <w:p>
@@ -15767,7 +15767,7 @@
                 <w:sz w:val="20"/>
                 <w:szCs w:val="20"/>
               </w:rPr>
-              <w:t>Overdue</w:t>
+              <w:t>Done (2026-10-20)</w:t>
             </w:r>
           </w:p>
         </w:tc>
@@ -15875,10 +15875,7 @@
         <w:jc w:val="both"/>
       </w:pPr>
       <w:r>
-        <w:rPr>
-          <w:highlight w:val="yellow"/>
-        </w:rPr>
-        <w:t>Pending.</w:t>
+        <w:t>My work focused on the quality and organization of the project: I set up continuous integration with GitHub Actions and the protection of the main branch, corrected outdated data in our documents, evaluated the shelf segmentation against the SHARD dataset, prepared the Phase 1 improvement plan and the progress evidence, and reviewed and merged pull requests. The hardest part for me was the SHARD evaluation. At first the segmentation found shelf lines that did not exist, like diagonal lines and lines in the middle of stacked boxes, and I did not know how to prove if it was really working. I solved it by comparing our lines with the annotated ones using precision, recall and F1, and then adding a filter that only keeps lines supported by a real edge along most of the shelf. I learned a lot of things: that a result is not good until you measure it, that automated tests and pull requests avoid many problems when three people work at the same time, and that writing down every decision helps when the client changes the scope. If I could do something differently, I would have also tried YOLOv8, or combining it with YOLO26, because we only compared two variants of YOLO26 and maybe another model could give better results on our own photos. Now I want to finish developing the missing items, like the exportable reports and the dashboard, and help improve the precision of the model with photos outside SKU-110K.</w:t>
       </w:r>
     </w:p>
     <w:p>

</xml_diff>

<commit_message>
docs: pasa todo el informe intermedio a español (#27)
Ningún mensaje del profesor ni del cliente pide inglés. Se traducen las conclusiones, el plan de mejora y las reflexiones, y se quita el abstract en inglés (el resumen ya está en español). La rúbrica 2.2 y 2.3 sí menciona inglés: queda como pregunta abierta en docs/curso.md.
</commit_message>
<xml_diff>
--- a/Fase 2/Informe intermedio de avance - ShelfVision AI.docx
+++ b/Fase 2/Informe intermedio de avance - ShelfVision AI.docx
@@ -237,67 +237,6 @@
               <w:noProof/>
             </w:rPr>
           </w:pPr>
-          <w:hyperlink w:anchor="_Toc243351100" w:history="1">
-            <w:r>
-              <w:rPr>
-                <w:rStyle w:val="Hipervnculo"/>
-                <w:noProof/>
-              </w:rPr>
-              <w:t>Abstract</w:t>
-            </w:r>
-            <w:r>
-              <w:rPr>
-                <w:noProof/>
-              </w:rPr>
-              <w:tab/>
-            </w:r>
-            <w:r>
-              <w:rPr>
-                <w:noProof/>
-              </w:rPr>
-              <w:fldChar w:fldCharType="begin"/>
-            </w:r>
-            <w:r>
-              <w:rPr>
-                <w:noProof/>
-              </w:rPr>
-              <w:instrText xml:space="preserve"> PAGEREF _Toc243351100 \h </w:instrText>
-            </w:r>
-            <w:r>
-              <w:rPr>
-                <w:noProof/>
-              </w:rPr>
-            </w:r>
-            <w:r>
-              <w:rPr>
-                <w:noProof/>
-              </w:rPr>
-              <w:fldChar w:fldCharType="separate"/>
-            </w:r>
-            <w:r>
-              <w:rPr>
-                <w:noProof/>
-              </w:rPr>
-              <w:t>3</w:t>
-            </w:r>
-            <w:r>
-              <w:rPr>
-                <w:noProof/>
-              </w:rPr>
-              <w:fldChar w:fldCharType="end"/>
-            </w:r>
-          </w:hyperlink>
-        </w:p>
-        <w:p>
-          <w:pPr>
-            <w:pStyle w:val="TDC1"/>
-            <w:tabs>
-              <w:tab w:val="right" w:leader="dot" w:pos="9016"/>
-            </w:tabs>
-            <w:rPr>
-              <w:noProof/>
-            </w:rPr>
-          </w:pPr>
           <w:hyperlink w:anchor="_Toc243351101" w:history="1">
             <w:r>
               <w:rPr>
@@ -1280,7 +1219,7 @@
                 <w:rStyle w:val="Hipervnculo"/>
                 <w:noProof/>
               </w:rPr>
-              <w:t>5. Conclusions and improvement plan</w:t>
+              <w:t>5. Conclusiones y plan de mejora</w:t>
             </w:r>
             <w:r>
               <w:rPr>
@@ -1402,7 +1341,7 @@
                 <w:rStyle w:val="Hipervnculo"/>
                 <w:noProof/>
               </w:rPr>
-              <w:t>7. Individual reflections</w:t>
+              <w:t>7. Reflexiones individuales</w:t>
             </w:r>
             <w:r>
               <w:rPr>
@@ -1781,24 +1720,6 @@
       </w:pPr>
       <w:r>
         <w:t xml:space="preserve">ShelfVision AI detecta quiebres de stock en góndolas de alimentos no perecibles a partir de una foto. El sistema corrige la imagen con visión clásica (OpenCV: corrección de lente y CLAHE), segmenta automáticamente la góndola y sus repisas, detecta los productos con YOLO26 y mide el espacio libre a lo largo de cada repisa. Informa una alerta cuando el espacio libre de la góndola completa es igual o mayor al 30% de su frente. A la fecha de corte están operativos el pipeline completo por foto (con evaluación por lotes contra anotaciones, por IoU) y una aplicación web Django con inicio de sesión por perfil, administración de usuarios y roles, análisis de fotos, ciclo de alertas y reportes exportables en Excel, CSV y PDF. El detector entrenado alcanza mAP50 de 0,950 en el conjunto de prueba de SKU-110K y 0,713 en 45 fotos de otro dominio (Kaggle). Su fine-tuning con fotos de Kaggle sube el mAP50 en 12 fotos de prueba de 0,809 a 0,854 de frente y de 0,701 a 0,818 a 35°, a cambio de bajar el mAP50-95 en SKU-110K de 0,610 a 0,533. Con productos envasados, el sistema completo acierta la alerta en el 92% de las 36 fotos de esa categoría, con un error medio de 6 puntos de espacio libre; sus errores vienen de productos que el detector no encuentra (recall 0,71), de frutas y verduras sueltas (fuera del alcance) y de refrigeradores con vidrio. Faltan el dashboard, la configuración de umbral y cámaras, la instalación en el servidor del CITT y corregir los hallazgos de la auditoría de la aplicación web del 2026-10-21. Este informe resume el avance real, sus evidencias, las dificultades y el plan para llegar al primer demo ante Walmart (a más tardar el 2026-10-31).</w:t>
-      </w:r>
-    </w:p>
-    <w:p>
-      <w:pPr>
-        <w:pStyle w:val="Ttulo1"/>
-      </w:pPr>
-      <w:bookmarkStart w:id="1" w:name="_Toc243351100"/>
-      <w:r>
-        <w:t>Abstract</w:t>
-      </w:r>
-      <w:bookmarkEnd w:id="1"/>
-    </w:p>
-    <w:p>
-      <w:pPr>
-        <w:jc w:val="both"/>
-      </w:pPr>
-      <w:r>
-        <w:t xml:space="preserve">ShelfVision AI detects out-of-stock situations on shelves of non-perishable food from a single photo. The system corrects the image with classical computer vision (OpenCV lens correction and CLAHE), automatically segments the gondola and its shelves, detects products with YOLO26, and measures free space along each shelf. It raises an alert when the free space of the whole gondola reaches 30% of its front or more. As of the cut-off date, the full per-photo pipeline (including batch evaluation against annotations by IoU) and a Django web application with role-based login, user and role management, photo analysis, an alert workflow and exportable reports in Excel, CSV and PDF are operational. The trained detector reaches 0.950 mAP50 on the SKU-110K test split and 0.713 on 45 photos from another domain (Kaggle). Fine-tuning it with Kaggle photos raises mAP50 on 12 held-out photos from 0.809 to 0.854 (front view) and from 0.701 to 0.818 (35° view), at the cost of lowering mAP50-95 on SKU-110K from 0.610 to 0.533. On packaged products, the full system gets the alert right on 92% of the 36 photos of that category, with a mean free-space error of 6 points; its errors come from products the detector misses (recall 0.71), from loose fruit and vegetables (out of scope) and from glass-door refrigerators. The dashboard, threshold and camera settings, deployment on the CITT server and the fixes for the findings of the 2026-10-21 web application audit are still pending. This report summarizes the actual progress, its evidence, the difficulties found and the plan to reach the first demo for Walmart (no later than 2026-10-31).</w:t>
       </w:r>
     </w:p>
     <w:p>
@@ -16867,7 +16788,7 @@
       <w:bookmarkStart w:id="18" w:name="_Toc243351117"/>
       <w:r>
         <w:lastRenderedPageBreak/>
-        <w:t>5. Conclusions and improvement plan</w:t>
+        <w:t>5. Conclusiones y plan de mejora</w:t>
       </w:r>
       <w:bookmarkEnd w:id="18"/>
     </w:p>
@@ -16880,10 +16801,10 @@
           <w:b/>
           <w:bCs/>
         </w:rPr>
-        <w:t xml:space="preserve">Objectives achieved.</w:t>
-      </w:r>
-      <w:r>
-        <w:t xml:space="preserve"> The hybrid pipeline required by the project (classical preprocessing, YOLO26 detection, availability post-processing) is complete and runs end to end on a single photo in about 0.7 s on CPU. The detector was trained, compared against a second variant and fine-tuned on photos outside SKU-110K, the shelf segmentation was measured against an external annotated dataset, and the stock-out alert follows the latest scope (whole gondola). A web application with role-based login, user management, photo analysis, alerts and exportable reports is operational, and every change goes through pull requests with automated tests and a Docker build.</w:t>
+        <w:t xml:space="preserve">Objetivos alcanzados.</w:t>
+      </w:r>
+      <w:r>
+        <w:t xml:space="preserve"> El pipeline híbrido que exige el proyecto (pre-procesamiento clásico, detección con YOLO26 y post-procesamiento de disponibilidad) está completo y corre de punta a punta sobre una foto en cerca de 0,7 s en CPU. El detector se entrenó, se comparó con una segunda variante y se afinó con fotos fuera de SKU-110K; la segmentación de repisas se midió contra un dataset externo anotado, y la alerta de quiebre sigue el último alcance (góndola completa). Una aplicación web con login por perfil, administración de usuarios, análisis de fotos, alertas y reportes exportables está operativa, y todo cambio pasa por pull requests con pruebas automáticas y construcción de la imagen Docker.</w:t>
       </w:r>
     </w:p>
     <w:p>
@@ -16895,10 +16816,10 @@
           <w:b/>
           <w:bCs/>
         </w:rPr>
-        <w:t xml:space="preserve">What really works today.</w:t>
-      </w:r>
-      <w:r>
-        <w:t xml:space="preserve"> CU00, CU01, CU04, CU06 and CU07 are implemented and CU02 is partial: five of eight use cases, which exceeds the 50% asked for Evaluation 2. Fine-tuning improved the detector outside SKU-110K (mAP50 from 0.809 to 0.854 on the front view and from 0.701 to 0.818 at 35° on 12 held-out photos), at the cost of mAP50-95 on SKU-110K (0.610 to 0.533), which we accepted because SKU-110K is not Walmart’s domain.</w:t>
+        <w:t xml:space="preserve">Qué funciona hoy.</w:t>
+      </w:r>
+      <w:r>
+        <w:t xml:space="preserve"> CU00, CU01, CU04, CU06 y CU07 están implementados y CU02 es parcial: cinco de ocho casos de uso, sobre el 50% que pide la Evaluación 2. El fine-tuning mejoró el detector fuera de SKU-110K (mAP50 de 0,809 a 0,854 de frente y de 0,701 a 0,818 a 35° en 12 fotos de prueba), a costa del mAP50-95 en SKU-110K (de 0,610 a 0,533), que aceptamos porque SKU-110K no es el dominio de Walmart.</w:t>
       </w:r>
     </w:p>
     <w:p>
@@ -16910,10 +16831,10 @@
           <w:b/>
           <w:bCs/>
         </w:rPr>
-        <w:t xml:space="preserve">Pending difficulties.</w:t>
-      </w:r>
-      <w:r>
-        <w:t xml:space="preserve"> The fine-tuned detector has only been measured on 12 photos, with clean images and no real store-camera images; the noise of a fixed room camera is not yet in training or tests (#55). Glass-door refrigerators and the reserve storage above the gondola cause false alerts. The web application audit of 2026-10-21 found real risks that must be closed before installing it on the CITT server: non-atomic alerts (#49), insecure default settings (#50), account lockout by a third party (#51), a photo without products raising a critical alert (#52) and robustness issues (#53, #54). The dashboard, threshold and camera configuration, and the deployment on the CITT server are missing.</w:t>
+        <w:t xml:space="preserve">Dificultades pendientes.</w:t>
+      </w:r>
+      <w:r>
+        <w:t xml:space="preserve"> El detector afinado solo se midió con 12 fotos, limpias y sin imágenes reales de cámaras de tienda; el ruido de una cámara fija de sala todavía no está en el entrenamiento ni en las pruebas (#55). Los refrigeradores con puerta de vidrio y la bodega de reserva sobre la góndola causan falsas alertas. La auditoría de la aplicación web del 2026-10-21 encontró riesgos reales que hay que cerrar antes de instalarla en el servidor del CITT: alertas no atómicas (#49), configuración insegura por defecto (#50), bloqueo de cuentas por un tercero (#51), una foto sin productos que dispara una alerta crítica (#52) y problemas de robustez (#53, #54). Faltan el dashboard, la configuración de umbral y cámaras, y la instalación en el servidor del CITT.</w:t>
       </w:r>
     </w:p>
     <w:p>
@@ -16925,10 +16846,10 @@
           <w:b/>
           <w:bCs/>
         </w:rPr>
-        <w:t xml:space="preserve">Improvements to prioritize.</w:t>
-      </w:r>
-      <w:r>
-        <w:t xml:space="preserve"> First the web application fixes (#49 to #53), because they block the installation on the CITT server; then the dashboard and threshold configuration, and then measuring and improving the detector with photos of our own and with room-camera noise (#32, #55).</w:t>
+        <w:t xml:space="preserve">Mejoras a priorizar.</w:t>
+      </w:r>
+      <w:r>
+        <w:t xml:space="preserve"> Primero las correcciones de la aplicación web (#49 a #53), porque bloquean la instalación en el servidor del CITT; luego el dashboard y la configuración del umbral, y después medir y mejorar el detector con fotos propias y con ruido de cámara de sala (#32, #55).</w:t>
       </w:r>
     </w:p>
     <w:p>
@@ -16940,10 +16861,10 @@
           <w:b/>
           <w:bCs/>
         </w:rPr>
-        <w:t xml:space="preserve">What the MVP still needs.</w:t>
-      </w:r>
-      <w:r>
-        <w:t xml:space="preserve"> The availability dashboard (CU03), threshold configuration (CU05), the audit fixes, the installation on the CITT server and the first operational demo for Walmart. Scope viability: the core is done, so the remaining MVP items are mostly web features on top of a working pipeline; they are feasible before the end of Phase 2 (week 15) if they are spread across the three members. Camera calibration and real CCTV validation depend on Walmart and stay out of the MVP.</w:t>
+        <w:t xml:space="preserve">Lo que falta para el MVP.</w:t>
+      </w:r>
+      <w:r>
+        <w:t xml:space="preserve"> El dashboard de disponibilidad (CU03), la configuración del umbral (CU05), las correcciones de la auditoría, la instalación en el servidor del CITT y el primer demo operativo ante Walmart. Viabilidad del alcance: el núcleo está hecho, así que lo que falta del MVP son sobre todo funciones web sobre un pipeline que ya funciona; es factible antes del fin de la Fase 2 (semana 15) si se reparte entre los tres integrantes. La calibración de cámaras y la validación con CCTV real dependen de Walmart y quedan fuera del MVP.</w:t>
       </w:r>
     </w:p>
     <w:tbl>
@@ -16995,7 +16916,7 @@
                 <w:sz w:val="20"/>
                 <w:szCs w:val="20"/>
               </w:rPr>
-              <w:t>Activity</w:t>
+              <w:t xml:space="preserve">Actividad</w:t>
             </w:r>
           </w:p>
         </w:tc>
@@ -17025,7 +16946,7 @@
                 <w:sz w:val="20"/>
                 <w:szCs w:val="20"/>
               </w:rPr>
-              <w:t>Item</w:t>
+              <w:t xml:space="preserve">Ítem</w:t>
             </w:r>
           </w:p>
         </w:tc>
@@ -17055,7 +16976,7 @@
                 <w:sz w:val="20"/>
                 <w:szCs w:val="20"/>
               </w:rPr>
-              <w:t>Owner</w:t>
+              <w:t xml:space="preserve">Responsable</w:t>
             </w:r>
           </w:p>
         </w:tc>
@@ -17085,7 +17006,7 @@
                 <w:sz w:val="20"/>
                 <w:szCs w:val="20"/>
               </w:rPr>
-              <w:t>Date</w:t>
+              <w:t xml:space="preserve">Fecha</w:t>
             </w:r>
           </w:p>
         </w:tc>
@@ -17113,7 +17034,7 @@
                 <w:sz w:val="20"/>
                 <w:szCs w:val="20"/>
               </w:rPr>
-              <w:t xml:space="preserve">Fine-tune the detector on photos outside SKU-110K (train/test split)</w:t>
+              <w:t xml:space="preserve">Fine-tuning del detector con fotos fuera de SKU-110K (separando entrenamiento y prueba)</w:t>
             </w:r>
           </w:p>
         </w:tc>
@@ -17191,7 +17112,7 @@
                 <w:sz w:val="20"/>
                 <w:szCs w:val="20"/>
               </w:rPr>
-              <w:t xml:space="preserve">Done (2026-10-21)</w:t>
+              <w:t xml:space="preserve">Cumplido (2026-10-21)</w:t>
             </w:r>
           </w:p>
         </w:tc>
@@ -17219,7 +17140,7 @@
                 <w:sz w:val="20"/>
                 <w:szCs w:val="20"/>
               </w:rPr>
-              <w:t>Declare loose fruit and vegetables out of scope with Walmart</w:t>
+              <w:t xml:space="preserve">Declarar fuera del alcance las frutas y verduras sueltas con Walmart</w:t>
             </w:r>
           </w:p>
         </w:tc>
@@ -17297,7 +17218,7 @@
                 <w:sz w:val="20"/>
                 <w:szCs w:val="20"/>
               </w:rPr>
-              <w:t>Next Walmart meeting</w:t>
+              <w:t xml:space="preserve">Próxima reunión con Walmart</w:t>
             </w:r>
           </w:p>
         </w:tc>
@@ -17325,7 +17246,7 @@
                 <w:sz w:val="20"/>
                 <w:szCs w:val="20"/>
               </w:rPr>
-              <w:t>Refrigerators: ignore out-of-focus regions and door frames</w:t>
+              <w:t xml:space="preserve">Refrigeradores: ignorar zonas desenfocadas y marcos de puerta</w:t>
             </w:r>
           </w:p>
         </w:tc>
@@ -17377,7 +17298,7 @@
                 <w:sz w:val="20"/>
                 <w:szCs w:val="20"/>
               </w:rPr>
-              <w:t>To assign</w:t>
+              <w:t xml:space="preserve">Por asignar</w:t>
             </w:r>
           </w:p>
         </w:tc>
@@ -17403,7 +17324,7 @@
                 <w:sz w:val="20"/>
                 <w:szCs w:val="20"/>
               </w:rPr>
-              <w:t>To be defined</w:t>
+              <w:t xml:space="preserve">Por definir</w:t>
             </w:r>
           </w:p>
         </w:tc>
@@ -17431,7 +17352,7 @@
                 <w:sz w:val="20"/>
                 <w:szCs w:val="20"/>
               </w:rPr>
-              <w:t>Exclude the reserve storage above the gondola</w:t>
+              <w:t xml:space="preserve">Excluir la bodega de reserva sobre la góndola</w:t>
             </w:r>
           </w:p>
         </w:tc>
@@ -17483,7 +17404,7 @@
                 <w:sz w:val="20"/>
                 <w:szCs w:val="20"/>
               </w:rPr>
-              <w:t>To assign</w:t>
+              <w:t xml:space="preserve">Por asignar</w:t>
             </w:r>
           </w:p>
         </w:tc>
@@ -17509,7 +17430,7 @@
                 <w:sz w:val="20"/>
                 <w:szCs w:val="20"/>
               </w:rPr>
-              <w:t>To be defined</w:t>
+              <w:t xml:space="preserve">Por definir</w:t>
             </w:r>
           </w:p>
         </w:tc>
@@ -17537,7 +17458,7 @@
                 <w:sz w:val="20"/>
                 <w:szCs w:val="20"/>
               </w:rPr>
-              <w:t xml:space="preserve">Exportable reports (Excel, CSV, PDF)</w:t>
+              <w:t xml:space="preserve">Reportes exportables (Excel, CSV, PDF)</w:t>
             </w:r>
           </w:p>
         </w:tc>
@@ -17615,7 +17536,7 @@
                 <w:sz w:val="20"/>
                 <w:szCs w:val="20"/>
               </w:rPr>
-              <w:t xml:space="preserve">Done (2026-10-21)</w:t>
+              <w:t xml:space="preserve">Cumplido (2026-10-21)</w:t>
             </w:r>
           </w:p>
         </w:tc>
@@ -17643,7 +17564,7 @@
                 <w:sz w:val="20"/>
                 <w:szCs w:val="20"/>
               </w:rPr>
-              <w:t xml:space="preserve">Atomic alerts and safe default settings of the web app</w:t>
+              <w:t xml:space="preserve">Alertas atómicas y configuración segura de la app web</w:t>
             </w:r>
           </w:p>
         </w:tc>
@@ -17749,7 +17670,7 @@
                 <w:sz w:val="20"/>
                 <w:szCs w:val="20"/>
               </w:rPr>
-              <w:t xml:space="preserve">Time-based account lockout (CU00)</w:t>
+              <w:t xml:space="preserve">Bloqueo de cuentas por tiempo (CU00)</w:t>
             </w:r>
           </w:p>
         </w:tc>
@@ -17855,7 +17776,7 @@
                 <w:sz w:val="20"/>
                 <w:szCs w:val="20"/>
               </w:rPr>
-              <w:t xml:space="preserve">Photo without products and web app robustness</w:t>
+              <w:t xml:space="preserve">Foto sin productos y robustez de la app web</w:t>
             </w:r>
           </w:p>
         </w:tc>
@@ -17961,7 +17882,7 @@
                 <w:sz w:val="20"/>
                 <w:szCs w:val="20"/>
               </w:rPr>
-              <w:t xml:space="preserve">Code cleanup and pinned CI actions</w:t>
+              <w:t xml:space="preserve">Limpieza de código y fijar acciones de CI</w:t>
             </w:r>
           </w:p>
         </w:tc>
@@ -18067,7 +17988,7 @@
                 <w:sz w:val="20"/>
                 <w:szCs w:val="20"/>
               </w:rPr>
-              <w:t xml:space="preserve">Train and measure the detector with room-camera noise</w:t>
+              <w:t xml:space="preserve">Entrenar y medir el detector con ruido de cámara de sala</w:t>
             </w:r>
           </w:p>
         </w:tc>
@@ -18173,7 +18094,7 @@
                 <w:sz w:val="20"/>
                 <w:szCs w:val="20"/>
               </w:rPr>
-              <w:t>First operational demo for Walmart</w:t>
+              <w:t xml:space="preserve">Primer demo operativo ante Walmart</w:t>
             </w:r>
           </w:p>
         </w:tc>
@@ -18279,7 +18200,7 @@
                 <w:sz w:val="20"/>
                 <w:szCs w:val="20"/>
               </w:rPr>
-              <w:t>Dashboard and threshold/camera configuration</w:t>
+              <w:t xml:space="preserve">Dashboard y configuración de umbral y cámaras</w:t>
             </w:r>
           </w:p>
         </w:tc>
@@ -18331,7 +18252,7 @@
                 <w:sz w:val="20"/>
                 <w:szCs w:val="20"/>
               </w:rPr>
-              <w:t>To assign</w:t>
+              <w:t xml:space="preserve">Por asignar</w:t>
             </w:r>
           </w:p>
         </w:tc>
@@ -18357,7 +18278,7 @@
                 <w:sz w:val="20"/>
                 <w:szCs w:val="20"/>
               </w:rPr>
-              <w:t>Before the end of Phase 2</w:t>
+              <w:t xml:space="preserve">Antes del fin de la Fase 2</w:t>
             </w:r>
           </w:p>
         </w:tc>
@@ -18385,7 +18306,7 @@
                 <w:sz w:val="20"/>
                 <w:szCs w:val="20"/>
               </w:rPr>
-              <w:t>Phase 1 improvement plan</w:t>
+              <w:t xml:space="preserve">Plan de mejoras de la Fase 1</w:t>
             </w:r>
           </w:p>
         </w:tc>
@@ -18463,7 +18384,7 @@
                 <w:sz w:val="20"/>
                 <w:szCs w:val="20"/>
               </w:rPr>
-              <w:t>Done (2026-10-20)</w:t>
+              <w:t xml:space="preserve">Cumplido (2026-10-20)</w:t>
             </w:r>
           </w:p>
         </w:tc>
@@ -18481,7 +18402,7 @@
           <w:sz w:val="18"/>
           <w:szCs w:val="18"/>
         </w:rPr>
-        <w:t xml:space="preserve">Table 11. Improvement plan. Owners and dates for #49 to #55 are proposals, to be confirmed by each member.</w:t>
+        <w:t xml:space="preserve">Tabla 11. Plan de mejora. Responsables y fechas de #49 a #55: propuesta a confirmar por cada integrante.</w:t>
       </w:r>
     </w:p>
     <w:p>
@@ -18520,7 +18441,7 @@
       </w:pPr>
       <w:bookmarkStart w:id="20" w:name="_Toc243351119"/>
       <w:r>
-        <w:t>7. Individual reflections</w:t>
+        <w:t>7. Reflexiones individuales</w:t>
       </w:r>
       <w:bookmarkEnd w:id="20"/>
     </w:p>
@@ -18532,7 +18453,7 @@
         <w:rPr>
           <w:highlight w:val="yellow"/>
         </w:rPr>
-        <w:t>Each member writes their own reflection in English.</w:t>
+        <w:t xml:space="preserve">Cada integrante redacta su propia reflexión.</w:t>
       </w:r>
     </w:p>
     <w:p>
@@ -18553,7 +18474,7 @@
         <w:rPr>
           <w:highlight w:val="yellow"/>
         </w:rPr>
-        <w:t>Pending.</w:t>
+        <w:t xml:space="preserve">Pendiente.</w:t>
       </w:r>
     </w:p>
     <w:p>
@@ -18571,7 +18492,7 @@
         <w:jc w:val="both"/>
       </w:pPr>
       <w:r>
-        <w:t>My work focused on the quality and organization of the project: I set up continuous integration with GitHub Actions and the protection of the main branch, corrected outdated data in our documents, evaluated the shelf segmentation against the SHARD dataset, prepared the Phase 1 improvement plan and the progress evidence, and reviewed and merged pull requests. The hardest part for me was the SHARD evaluation. At first the segmentation found shelf lines that did not exist, like diagonal lines and lines in the middle of stacked boxes, and I did not know how to prove if it was really working. I solved it by comparing our lines with the annotated ones using precision, recall and F1, and then adding a filter that only keeps lines supported by a real edge along most of the shelf. I learned a lot of things: that a result is not good until you measure it, that automated tests and pull requests avoid many problems when three people work at the same time, and that writing down every decision helps when the client changes the scope. If I could do something differently, I would have also tried YOLOv8, or combining it with YOLO26, because we only compared two variants of YOLO26 and maybe another model could give better results on our own photos. Now I want to finish developing the missing items, like the exportable reports and the dashboard, and help improve the precision of the model with photos outside SKU-110K.</w:t>
+        <w:t xml:space="preserve">Mi trabajo se centró en la calidad y la organización del proyecto: armé la integración continua con GitHub Actions y la protección de la rama main, corregí datos desactualizados en nuestros documentos, evalué la segmentación de repisas con el dataset SHARD, preparé el plan de mejoras de la Fase 1 y las evidencias de avance, y revisé y mergeé pull requests. Lo más difícil para mí fue la evaluación con SHARD. Al principio la segmentación encontraba líneas de repisa que no existían, como diagonales y líneas en medio de cajas apiladas, y yo no sabía cómo probar si realmente funcionaba. Lo resolví comparando nuestras líneas con las anotadas mediante precisión, recall y F1, y luego agregando un filtro que solo conserva las líneas respaldadas por un borde real a lo largo de la mayor parte de la repisa. Aprendí muchas cosas: que un resultado no es bueno hasta que se mide, que las pruebas automáticas y los pull requests evitan muchos problemas cuando tres personas trabajan al mismo tiempo, y que dejar por escrito cada decisión ayuda cuando el cliente cambia el alcance. Si pudiera hacer algo distinto, también habría probado YOLOv8, o combinarlo con YOLO26, porque solo comparamos dos variantes de YOLO26 y quizás otro modelo daría mejores resultados con nuestras propias fotos. Ahora quiero terminar los ítems que faltan, como el dashboard, y ayudar a mejorar la precisión del modelo con fotos fuera de SKU-110K.</w:t>
       </w:r>
     </w:p>
     <w:p>
@@ -18592,7 +18513,7 @@
         <w:rPr>
           <w:highlight w:val="yellow"/>
         </w:rPr>
-        <w:t>Draft, to be reviewed by Francisco. I worked on the computer-vision core and its integration: image correction, automatic shelf segmentation, the YOLO26 training on SKU-110K, the availability calculation, the end-to-end pipeline and the first version of the Django web app. The most valuable lesson was that a good detector metric does not guarantee a good system: the detector reaches 0.95 mAP50 on SKU-110K, yet on our own Kaggle photos its recall drops to 0.64 and every missed product turns into a false alert. Measuring this honestly, with the 10 best and 10 worst cases, changed our priorities: we now plan fine-tuning with photos outside SKU-110K and we declared loose fruit and vegetables out of scope. I also learned to write down every decision with its evidence, because the client changed the scope twice (whole-gondola alert, fixed depth) and the written reasoning made those changes cheap. Next, I want to measure real stock-outs with the Roboflow dataset and our own photos, and to help the team install the application on the CITT server.</w:t>
+        <w:t xml:space="preserve">Borrador, para revisión de Francisco. Trabajé en el núcleo de visión artificial y su integración: corrección de imagen, segmentación automática de repisas, el entrenamiento de YOLO26 con SKU-110K, el cálculo de disponibilidad, el pipeline de punta a punta y la primera versión de la app web Django. La lección más valiosa fue que una buena métrica del detector no garantiza un buen sistema: el detector llega a 0,95 de mAP50 en SKU-110K, pero con nuestras propias fotos de Kaggle su recall baja a 0,64 y cada producto no detectado se convierte en una falsa alerta. Medir esto con honestidad, con los 10 mejores y los 10 peores casos, cambió nuestras prioridades: ahora planificamos fine-tuning con fotos fuera de SKU-110K y declaramos fuera del alcance las frutas y verduras sueltas. También aprendí a dejar por escrito cada decisión con su evidencia, porque el cliente cambió el alcance dos veces (alerta por góndola completa, profundidad fija) y el razonamiento escrito hizo baratos esos cambios. Después quiero medir quiebres reales con el dataset de Roboflow y nuestras propias fotos, y ayudar al equipo a instalar la aplicación en el servidor del CITT.</w:t>
       </w:r>
     </w:p>
     <w:p>

</xml_diff>

<commit_message>
docs: agrega la reflexión final de Francisco al informe intermedio (#27)
</commit_message>
<xml_diff>
--- a/Fase 2/Informe intermedio de avance - ShelfVision AI.docx
+++ b/Fase 2/Informe intermedio de avance - ShelfVision AI.docx
@@ -129,7 +129,7 @@
         <w:rPr>
           <w:color w:val="595959"/>
         </w:rPr>
-        <w:t xml:space="preserve">2026-10-21 (datos con corte al 2026-10-21)</w:t>
+        <w:t>2026-10-21 (datos con corte al 2026-10-21)</w:t>
       </w:r>
     </w:p>
     <w:p>
@@ -155,7 +155,6 @@
         <w:alias w:val="Índice"/>
         <w:id w:val="158122281"/>
       </w:sdtPr>
-      <w:sdtEndPr/>
       <w:sdtContent>
         <w:p>
           <w:pPr>
@@ -1719,7 +1718,7 @@
         <w:jc w:val="both"/>
       </w:pPr>
       <w:r>
-        <w:t xml:space="preserve">ShelfVision AI detecta quiebres de stock en góndolas de alimentos no perecibles a partir de una foto. El sistema corrige la imagen con visión clásica (OpenCV: corrección de lente y CLAHE), segmenta automáticamente la góndola y sus repisas, detecta los productos con YOLO26 y mide el espacio libre a lo largo de cada repisa. Informa una alerta cuando el espacio libre de la góndola completa es igual o mayor al 30% de su frente. A la fecha de corte están operativos el pipeline completo por foto (con evaluación por lotes contra anotaciones, por IoU) y una aplicación web Django con inicio de sesión por perfil, administración de usuarios y roles, análisis de fotos, ciclo de alertas y reportes exportables en Excel, CSV y PDF. El detector entrenado alcanza mAP50 de 0,950 en el conjunto de prueba de SKU-110K y 0,713 en 45 fotos de otro dominio (Kaggle). Su fine-tuning con fotos de Kaggle sube el mAP50 en 12 fotos de prueba de 0,809 a 0,854 de frente y de 0,701 a 0,818 a 35°, a cambio de bajar el mAP50-95 en SKU-110K de 0,610 a 0,533. Con productos envasados, el sistema completo acierta la alerta en el 92% de las 36 fotos de esa categoría, con un error medio de 6 puntos de espacio libre; sus errores vienen de productos que el detector no encuentra (recall 0,71), de frutas y verduras sueltas (fuera del alcance) y de refrigeradores con vidrio. Faltan el dashboard, la configuración de umbral y cámaras, la instalación en el servidor del CITT y corregir los hallazgos de la auditoría de la aplicación web del 2026-10-21. Este informe resume el avance real, sus evidencias, las dificultades y el plan para llegar al primer demo ante Walmart (a más tardar el 2026-10-31).</w:t>
+        <w:t>ShelfVision AI detecta quiebres de stock en góndolas de alimentos no perecibles a partir de una foto. El sistema corrige la imagen con visión clásica (OpenCV: corrección de lente y CLAHE), segmenta automáticamente la góndola y sus repisas, detecta los productos con YOLO26 y mide el espacio libre a lo largo de cada repisa. Informa una alerta cuando el espacio libre de la góndola completa es igual o mayor al 30% de su frente. A la fecha de corte están operativos el pipeline completo por foto (con evaluación por lotes contra anotaciones, por IoU) y una aplicación web Django con inicio de sesión por perfil, administración de usuarios y roles, análisis de fotos, ciclo de alertas y reportes exportables en Excel, CSV y PDF. El detector entrenado alcanza mAP50 de 0,950 en el conjunto de prueba de SKU-110K y 0,713 en 45 fotos de otro dominio (Kaggle). Su fine-tuning con fotos de Kaggle sube el mAP50 en 12 fotos de prueba de 0,809 a 0,854 de frente y de 0,701 a 0,818 a 35°, a cambio de bajar el mAP50-95 en SKU-110K de 0,610 a 0,533. Con productos envasados, el sistema completo acierta la alerta en el 92% de las 36 fotos de esa categoría, con un error medio de 6 puntos de espacio libre; sus errores vienen de productos que el detector no encuentra (recall 0,71), de frutas y verduras sueltas (fuera del alcance) y de refrigeradores con vidrio. Faltan el dashboard, la configuración de umbral y cámaras, la instalación en el servidor del CITT y corregir los hallazgos de la auditoría de la aplicación web del 2026-10-21. Este informe resume el avance real, sus evidencias, las dificultades y el plan para llegar al primer demo ante Walmart (a más tardar el 2026-10-31).</w:t>
       </w:r>
     </w:p>
     <w:p>
@@ -1731,29 +1730,29 @@
       <w:pPr>
         <w:pStyle w:val="Ttulo1"/>
       </w:pPr>
-      <w:bookmarkStart w:id="2" w:name="_Toc243351101"/>
+      <w:bookmarkStart w:id="1" w:name="_Toc243351101"/>
       <w:r>
         <w:lastRenderedPageBreak/>
         <w:t>1. Estado de avance</w:t>
       </w:r>
-      <w:bookmarkEnd w:id="2"/>
+      <w:bookmarkEnd w:id="1"/>
     </w:p>
     <w:p>
       <w:pPr>
         <w:pStyle w:val="Ttulo2"/>
       </w:pPr>
-      <w:bookmarkStart w:id="3" w:name="_Toc243351102"/>
+      <w:bookmarkStart w:id="2" w:name="_Toc243351102"/>
       <w:r>
         <w:t>1.1 Actividades realizadas</w:t>
       </w:r>
-      <w:bookmarkEnd w:id="3"/>
+      <w:bookmarkEnd w:id="2"/>
     </w:p>
     <w:p>
       <w:pPr>
         <w:jc w:val="both"/>
       </w:pPr>
       <w:r>
-        <w:t xml:space="preserve">El trabajo se organiza en un backlog con ítems numerados (PROGRESS.md), una rama y un Pull Request por ítem, y CI en verde antes de integrar a main (la revisión de otro integrante es opcional desde el 2026-10-21). Entre el 2026-09-27 y el 2026-10-21 se integraron 54 Pull Requests (anexo A). Lo realizado, por área:</w:t>
+        <w:t>El trabajo se organiza en un backlog con ítems numerados (PROGRESS.md), una rama y un Pull Request por ítem, y CI en verde antes de integrar a main (la revisión de otro integrante es opcional desde el 2026-10-21). Entre el 2026-09-27 y el 2026-10-21 se integraron 54 Pull Requests (anexo A). Lo realizado, por área:</w:t>
       </w:r>
     </w:p>
     <w:p>
@@ -1810,7 +1809,7 @@
           <w:b/>
           <w:bCs/>
         </w:rPr>
-        <w:t xml:space="preserve">Visión artificial: corrección de imagen (dewarping y CLAHE), segmentación automática de góndola y repisas, recorte de la región de interés, detector YOLO26 entrenado en GPU (50 épocas, dos variantes comparadas) y afinado con fotos fuera de SKU-110K (#33: dos corridas, se aceptó la primera), cálculo de disponibilidad con niveles de repisa híbridos que siguen repisas inclinadas, y alerta por góndola completa.</w:t>
+        <w:t>Visión artificial: corrección de imagen (dewarping y CLAHE), segmentación automática de góndola y repisas, recorte de la región de interés, detector YOLO26 entrenado en GPU (50 épocas, dos variantes comparadas) y afinado con fotos fuera de SKU-110K (#33: dos corridas, se aceptó la primera), cálculo de disponibilidad con niveles de repisa híbridos que siguen repisas inclinadas, y alerta por góndola completa.</w:t>
       </w:r>
     </w:p>
     <w:p>
@@ -1856,7 +1855,7 @@
           <w:b/>
           <w:bCs/>
         </w:rPr>
-        <w:t xml:space="preserve">Aplicación web: Django 6.1 con login por perfil (CU00), administración de usuarios y roles (CU06), análisis de fotos (CU01), ciclo de la alerta (Activa, En proceso, Completada) y reportes en Excel, CSV y PDF (CU04, ítem #7, PR #54). El 2026-10-21 se auditó la app y se abrieron los ítems #49 a #54 con los hallazgos (sección 1.5).</w:t>
+        <w:t>Aplicación web: Django 6.1 con login por perfil (CU00), administración de usuarios y roles (CU06), análisis de fotos (CU01), ciclo de la alerta (Activa, En proceso, Completada) y reportes en Excel, CSV y PDF (CU04, ítem #7, PR #54). El 2026-10-21 se auditó la app y se abrieron los ítems #49 a #54 con los hallazgos (sección 1.5).</w:t>
       </w:r>
     </w:p>
     <w:p>
@@ -1872,18 +1871,18 @@
           <w:b/>
           <w:bCs/>
         </w:rPr>
-        <w:t xml:space="preserve">Documentación: casos de uso y diagramas alineados con los acuerdos con Walmart y rehechos para la app Django, sin API REST ni React (#42, PR #53), registro de requisitos y plazos del curso, auditoría de la aplicación web contra requisitos y mockups, y Carta Gantt de la Fase 2.</w:t>
+        <w:t>Documentación: casos de uso y diagramas alineados con los acuerdos con Walmart y rehechos para la app Django, sin API REST ni React (#42, PR #53), registro de requisitos y plazos del curso, auditoría de la aplicación web contra requisitos y mockups, y Carta Gantt de la Fase 2.</w:t>
       </w:r>
     </w:p>
     <w:p>
       <w:pPr>
         <w:pStyle w:val="Ttulo2"/>
       </w:pPr>
-      <w:bookmarkStart w:id="4" w:name="_Toc243351103"/>
+      <w:bookmarkStart w:id="3" w:name="_Toc243351103"/>
       <w:r>
         <w:t>1.2 Estado por módulo</w:t>
       </w:r>
-      <w:bookmarkEnd w:id="4"/>
+      <w:bookmarkEnd w:id="3"/>
     </w:p>
     <w:p>
       <w:pPr>
@@ -2153,7 +2152,7 @@
                 <w:sz w:val="20"/>
                 <w:szCs w:val="20"/>
               </w:rPr>
-              <w:t xml:space="preserve">Ítems #1-#4 y #15. F1 de repisas 0,823 en SHARD (1.000 fotos de control). Falta validarlo con imágenes tipo cámara de sala (#14, #55).</w:t>
+              <w:t>Ítems #1-#4 y #15. F1 de repisas 0,823 en SHARD (1.000 fotos de control). Falta validarlo con imágenes tipo cámara de sala (#14, #55).</w:t>
             </w:r>
           </w:p>
         </w:tc>
@@ -2222,7 +2221,7 @@
                 <w:sz w:val="20"/>
                 <w:szCs w:val="20"/>
               </w:rPr>
-              <w:t xml:space="preserve">Terminado</w:t>
+              <w:t>Terminado</w:t>
             </w:r>
           </w:p>
         </w:tc>
@@ -2248,7 +2247,7 @@
                 <w:sz w:val="20"/>
                 <w:szCs w:val="20"/>
               </w:rPr>
-              <w:t xml:space="preserve">90%</w:t>
+              <w:t>90%</w:t>
             </w:r>
           </w:p>
         </w:tc>
@@ -2274,7 +2273,7 @@
                 <w:sz w:val="20"/>
                 <w:szCs w:val="20"/>
               </w:rPr>
-              <w:t xml:space="preserve">Ítems #5 y #33. yolo26s: mAP50 0,950 en test de SKU-110K. Afinado (yolo26s-finetune): mAP50 0,854 / 0,837 / 0,818 en 12 fotos de Kaggle (de frente, a 20° y a 35°) y 0,940 en SKU-110K. Faltan el ruido de cámara de sala (#55) y fotos propias (#32).</w:t>
+              <w:t>Ítems #5 y #33. yolo26s: mAP50 0,950 en test de SKU-110K. Afinado (yolo26s-finetune): mAP50 0,854 / 0,837 / 0,818 en 12 fotos de Kaggle (de frente, a 20° y a 35°) y 0,940 en SKU-110K. Faltan el ruido de cámara de sala (#55) y fotos propias (#32).</w:t>
             </w:r>
           </w:p>
         </w:tc>
@@ -2529,6 +2528,7 @@
                 <w:sz w:val="20"/>
                 <w:szCs w:val="20"/>
               </w:rPr>
+              <w:lastRenderedPageBreak/>
               <w:t>Reportes (</w:t>
             </w:r>
             <w:r>
@@ -2570,7 +2570,7 @@
                 <w:sz w:val="20"/>
                 <w:szCs w:val="20"/>
               </w:rPr>
-              <w:t xml:space="preserve">Terminado</w:t>
+              <w:t>Terminado</w:t>
             </w:r>
           </w:p>
         </w:tc>
@@ -2596,7 +2596,7 @@
                 <w:sz w:val="20"/>
                 <w:szCs w:val="20"/>
               </w:rPr>
-              <w:t xml:space="preserve">90%</w:t>
+              <w:t>90%</w:t>
             </w:r>
           </w:p>
         </w:tc>
@@ -2622,7 +2622,7 @@
                 <w:sz w:val="20"/>
                 <w:szCs w:val="20"/>
               </w:rPr>
-              <w:t xml:space="preserve">Vista anotada (#8) y reportes en Excel, CSV y PDF (#7, PR #54), una fila por análisis. Sin probar con datos de cámaras reales.</w:t>
+              <w:t>Vista anotada (#8) y reportes en Excel, CSV y PDF (#7, PR #54), una fila por análisis. Sin probar con datos de cámaras reales.</w:t>
             </w:r>
           </w:p>
         </w:tc>
@@ -2691,7 +2691,7 @@
                 <w:sz w:val="20"/>
                 <w:szCs w:val="20"/>
               </w:rPr>
-              <w:t xml:space="preserve">En desarrollo</w:t>
+              <w:t>En desarrollo</w:t>
             </w:r>
           </w:p>
         </w:tc>
@@ -2717,7 +2717,7 @@
                 <w:sz w:val="20"/>
                 <w:szCs w:val="20"/>
               </w:rPr>
-              <w:t xml:space="preserve">70%</w:t>
+              <w:t>70%</w:t>
             </w:r>
           </w:p>
         </w:tc>
@@ -2743,7 +2743,7 @@
                 <w:sz w:val="20"/>
                 <w:szCs w:val="20"/>
               </w:rPr>
-              <w:t xml:space="preserve">Ítems #28 y #7: CU00, CU01, CU04, CU06 y alertas. Faltan dashboard (#43), configuración (#44) y los hallazgos de la auditoría del 2026-10-21 (#49 a #53).</w:t>
+              <w:t>Ítems #28 y #7: CU00, CU01, CU04, CU06 y alertas. Faltan dashboard (#43), configuración (#44) y los hallazgos de la auditoría del 2026-10-21 (#49 a #53).</w:t>
             </w:r>
           </w:p>
         </w:tc>
@@ -2771,7 +2771,6 @@
                 <w:sz w:val="20"/>
                 <w:szCs w:val="20"/>
               </w:rPr>
-              <w:lastRenderedPageBreak/>
               <w:t>CI y Docker</w:t>
             </w:r>
           </w:p>
@@ -2798,7 +2797,7 @@
                 <w:sz w:val="20"/>
                 <w:szCs w:val="20"/>
               </w:rPr>
-              <w:t xml:space="preserve">Terminado</w:t>
+              <w:t>Terminado</w:t>
             </w:r>
           </w:p>
         </w:tc>
@@ -2824,7 +2823,7 @@
                 <w:sz w:val="20"/>
                 <w:szCs w:val="20"/>
               </w:rPr>
-              <w:t xml:space="preserve">90%</w:t>
+              <w:t>90%</w:t>
             </w:r>
           </w:p>
         </w:tc>
@@ -2850,7 +2849,7 @@
                 <w:sz w:val="20"/>
                 <w:szCs w:val="20"/>
               </w:rPr>
-              <w:t xml:space="preserve">Ítem #13. Cada PR corre los tests y construye la imagen. Faltan fijar las acciones por commit (#54) y que el contenedor no corra como root (#50).</w:t>
+              <w:t>Ítem #13. Cada PR corre los tests y construye la imagen. Faltan fijar las acciones por commit (#54) y que el contenedor no corra como root (#50).</w:t>
             </w:r>
           </w:p>
         </w:tc>
@@ -3010,7 +3009,7 @@
                 <w:sz w:val="20"/>
                 <w:szCs w:val="20"/>
               </w:rPr>
-              <w:t xml:space="preserve">En desarrollo</w:t>
+              <w:t>En desarrollo</w:t>
             </w:r>
           </w:p>
         </w:tc>
@@ -3036,7 +3035,7 @@
                 <w:sz w:val="20"/>
                 <w:szCs w:val="20"/>
               </w:rPr>
-              <w:t xml:space="preserve">85%</w:t>
+              <w:t>85%</w:t>
             </w:r>
           </w:p>
         </w:tc>
@@ -3062,7 +3061,7 @@
                 <w:sz w:val="20"/>
                 <w:szCs w:val="20"/>
               </w:rPr>
-              <w:t xml:space="preserve">README completo (#35), plan de pruebas (con DET-07), guía de entrenamiento y datasets; plantillas de C.U y diagramas rehechos para Django (#42). Faltan el diagrama de base de datos (#48) y las evidencias de avance (#37).</w:t>
+              <w:t>README completo (#35), plan de pruebas (con DET-07), guía de entrenamiento y datasets; plantillas de C.U y diagramas rehechos para Django (#42). Faltan el diagrama de base de datos (#48) y las evidencias de avance (#37).</w:t>
             </w:r>
           </w:p>
         </w:tc>
@@ -3080,18 +3079,18 @@
           <w:sz w:val="18"/>
           <w:szCs w:val="18"/>
         </w:rPr>
-        <w:t xml:space="preserve">Tabla 1. Estado de cada módulo al 2026-10-21.</w:t>
+        <w:t>Tabla 1. Estado de cada módulo al 2026-10-21.</w:t>
       </w:r>
     </w:p>
     <w:p>
       <w:pPr>
         <w:pStyle w:val="Ttulo2"/>
       </w:pPr>
-      <w:bookmarkStart w:id="5" w:name="_Toc243351104"/>
+      <w:bookmarkStart w:id="4" w:name="_Toc243351104"/>
       <w:r>
         <w:t>1.3 Casos de uso</w:t>
       </w:r>
-      <w:bookmarkEnd w:id="5"/>
+      <w:bookmarkEnd w:id="4"/>
     </w:p>
     <w:tbl>
       <w:tblPr>
@@ -3751,7 +3750,7 @@
                 <w:sz w:val="20"/>
                 <w:szCs w:val="20"/>
               </w:rPr>
-              <w:t xml:space="preserve">Implementado</w:t>
+              <w:t>Implementado</w:t>
             </w:r>
           </w:p>
         </w:tc>
@@ -3777,7 +3776,7 @@
                 <w:sz w:val="20"/>
                 <w:szCs w:val="20"/>
               </w:rPr>
-              <w:t xml:space="preserve">Web: página Reportes (período, pasillo o góndola, y formato Excel, CSV o PDF)</w:t>
+              <w:t>Web: página Reportes (período, pasillo o góndola, y formato Excel, CSV o PDF)</w:t>
             </w:r>
           </w:p>
         </w:tc>
@@ -4128,25 +4127,26 @@
           <w:sz w:val="18"/>
           <w:szCs w:val="18"/>
         </w:rPr>
-        <w:t xml:space="preserve">Tabla 2. Estado de los 8 casos de uso: 5 implementados y 1 parcial (la Evaluación 2 pide el 50%).</w:t>
+        <w:t>Tabla 2. Estado de los 8 casos de uso: 5 implementados y 1 parcial (la Evaluación 2 pide el 50%).</w:t>
       </w:r>
     </w:p>
     <w:p>
       <w:pPr>
         <w:pStyle w:val="Ttulo2"/>
       </w:pPr>
-      <w:bookmarkStart w:id="6" w:name="_Toc243351105"/>
+      <w:bookmarkStart w:id="5" w:name="_Toc243351105"/>
       <w:r>
         <w:t>1.4 Carta Gantt</w:t>
       </w:r>
-      <w:bookmarkEnd w:id="6"/>
+      <w:bookmarkEnd w:id="5"/>
     </w:p>
     <w:p>
       <w:pPr>
         <w:jc w:val="both"/>
       </w:pPr>
       <w:r>
-        <w:t xml:space="preserve">La Carta Gantt de la Fase 2 (Anexos/Gestion/Carta Gantt Fase 2.xlsx, actualizada al 2026-10-21) tiene 49 actividades: 36 cumplidas, 3 en curso, 9 pendientes y 1 bloqueada.</w:t>
+        <w:lastRenderedPageBreak/>
+        <w:t>La Carta Gantt de la Fase 2 (Anexos/Gestion/Carta Gantt Fase 2.xlsx, actualizada al 2026-10-21) tiene 49 actividades: 36 cumplidas, 3 en curso, 9 pendientes y 1 bloqueada.</w:t>
       </w:r>
     </w:p>
     <w:p>
@@ -4162,7 +4162,7 @@
           <w:b/>
           <w:bCs/>
         </w:rPr>
-        <w:t xml:space="preserve">Hitos cumplidos: pipeline de visión completo (2026-10-18), detector entrenado (2026-10-07), cambio de alcance a quiebre por góndola completa (2026-10-19), login, CRUD de usuarios y base de datos (2026-10-19), y, el 2026-10-21, reportes Excel, CSV y PDF (#7), fine-tuning del detector (#33) y plantillas de C.U y diagramas rehechos para Django (#42).</w:t>
+        <w:t>Hitos cumplidos: pipeline de visión completo (2026-10-18), detector entrenado (2026-10-07), cambio de alcance a quiebre por góndola completa (2026-10-19), login, CRUD de usuarios y base de datos (2026-10-19), y, el 2026-10-21, reportes Excel, CSV y PDF (#7), fine-tuning del detector (#33) y plantillas de C.U y diagramas rehechos para Django (#42).</w:t>
       </w:r>
     </w:p>
     <w:p>
@@ -4178,7 +4178,7 @@
           <w:b/>
           <w:bCs/>
         </w:rPr>
-        <w:t xml:space="preserve">Retrasos: el plan de mejoras de la Fase 1 (#26) debía empezar a más tardar el 2026-10-09 y se completó con atraso el 2026-10-20 (PR #45). La aplicación web (#28) se esperaba antes y se completó el 2026-10-19. El informe de avance (#27) se reasignó el 2026-10-19 para no depender de otros ítems y, a la hora de cerrar este documento, siguen pendientes el video (#36) y la reflexión de Nicko. Los reportes (#7, propuestos para el 2026-10-27) se adelantaron al 2026-10-21.</w:t>
+        <w:t>Retrasos: el plan de mejoras de la Fase 1 (#26) debía empezar a más tardar el 2026-10-09 y se completó con atraso el 2026-10-20 (PR #45). La aplicación web (#28) se esperaba antes y se completó el 2026-10-19. El informe de avance (#27) se reasignó el 2026-10-19 para no depender de otros ítems y, a la hora de cerrar este documento, siguen pendientes el video (#36) y la reflexión de Nicko. Los reportes (#7, propuestos para el 2026-10-27) se adelantaron al 2026-10-21.</w:t>
       </w:r>
     </w:p>
     <w:p>
@@ -4194,26 +4194,25 @@
           <w:b/>
           <w:bCs/>
         </w:rPr>
-        <w:t xml:space="preserve">Pendientes con fecha: video (2026-10-21), evidencias de avance (2026-10-26), correcciones de la auditoría de la app web (2026-10-28 al 2026-10-30), primer demo ante Walmart (2026-10-31) y detector con ruido de cámara de sala (2026-11-06).</w:t>
+        <w:t>Pendientes con fecha: video (2026-10-21), evidencias de avance (2026-10-26), correcciones de la auditoría de la app web (2026-10-28 al 2026-10-30), primer demo ante Walmart (2026-10-31) y detector con ruido de cámara de sala (2026-11-06).</w:t>
       </w:r>
     </w:p>
     <w:p>
       <w:pPr>
         <w:pStyle w:val="Ttulo2"/>
       </w:pPr>
-      <w:bookmarkStart w:id="7" w:name="_Toc243351106"/>
-      <w:r>
-        <w:lastRenderedPageBreak/>
+      <w:bookmarkStart w:id="6" w:name="_Toc243351106"/>
+      <w:r>
         <w:t>1.5 Dificultades y riesgos técnicos</w:t>
       </w:r>
-      <w:bookmarkEnd w:id="7"/>
+      <w:bookmarkEnd w:id="6"/>
     </w:p>
     <w:p>
       <w:pPr>
         <w:jc w:val="both"/>
       </w:pPr>
       <w:r>
-        <w:t xml:space="preserve">La auditoría de la aplicación web del 2026-10-21 dejó hallazgos que son riesgos reales y deben cerrarse antes de instalarla en el servidor del CITT (#39): alertas que pueden quedar inconsistentes, una configuración insegura por defecto, cuentas bloqueables por un tercero y fotos sin productos que disparan una alerta crítica. Los responsables y las fechas de los ítems #49 a #55 son una propuesta del autor del informe, a confirmar por cada integrante.</w:t>
+        <w:t>La auditoría de la aplicación web del 2026-10-21 dejó hallazgos que son riesgos reales y deben cerrarse antes de instalarla en el servidor del CITT (#39): alertas que pueden quedar inconsistentes, una configuración insegura por defecto, cuentas bloqueables por un tercero y fotos sin productos que disparan una alerta crítica. Los responsables y las fechas de los ítems #49 a #55 son una propuesta del autor del informe, a confirmar por cada integrante.</w:t>
       </w:r>
     </w:p>
     <w:tbl>
@@ -4515,7 +4514,7 @@
                 <w:sz w:val="20"/>
                 <w:szCs w:val="20"/>
               </w:rPr>
-              <w:t xml:space="preserve">Se entrenó solo con SKU-110K: otras fotos, ángulos y productos</w:t>
+              <w:t>Se entrenó solo con SKU-110K: otras fotos, ángulos y productos</w:t>
             </w:r>
           </w:p>
         </w:tc>
@@ -4541,7 +4540,7 @@
                 <w:sz w:val="20"/>
                 <w:szCs w:val="20"/>
               </w:rPr>
-              <w:t xml:space="preserve">Fine-tuning con Kaggle CC0 y vistas giradas (#33): el mAP50 sube de 4 a 12 puntos en 12 fotos de prueba, pero el mAP50-95 en SKU-110K baja de 0,610 a 0,533 (se aceptó). Falta medirlo con fotos propias (#32)</w:t>
+              <w:t>Fine-tuning con Kaggle CC0 y vistas giradas (#33): el mAP50 sube de 4 a 12 puntos en 12 fotos de prueba, pero el mAP50-95 en SKU-110K baja de 0,610 a 0,533 (se aceptó). Falta medirlo con fotos propias (#32)</w:t>
             </w:r>
           </w:p>
         </w:tc>
@@ -4567,7 +4566,7 @@
                 <w:sz w:val="20"/>
                 <w:szCs w:val="20"/>
               </w:rPr>
-              <w:t xml:space="preserve">Mitigado en parte</w:t>
+              <w:t>Mitigado en parte</w:t>
             </w:r>
           </w:p>
         </w:tc>
@@ -4595,7 +4594,7 @@
                 <w:sz w:val="20"/>
                 <w:szCs w:val="20"/>
               </w:rPr>
-              <w:t xml:space="preserve">Alertas no atómicas en la app web (#49)</w:t>
+              <w:t>Alertas no atómicas en la app web (#49)</w:t>
             </w:r>
           </w:p>
         </w:tc>
@@ -4621,7 +4620,7 @@
                 <w:sz w:val="20"/>
                 <w:szCs w:val="20"/>
               </w:rPr>
-              <w:t xml:space="preserve">Cerrar la alerta anterior, guardar la foto y crear el análisis no van en una transacción: si falla el guardado queda la alerta vieja cerrada sin otra; con dos fotos a la vez quedan dos abiertas; «a1» y «A1» son góndolas distintas</w:t>
+              <w:t>Cerrar la alerta anterior, guardar la foto y crear el análisis no van en una transacción: si falla el guardado queda la alerta vieja cerrada sin otra; con dos fotos a la vez quedan dos abiertas; «a1» y «A1» son góndolas distintas</w:t>
             </w:r>
           </w:p>
         </w:tc>
@@ -4647,7 +4646,7 @@
                 <w:sz w:val="20"/>
                 <w:szCs w:val="20"/>
               </w:rPr>
-              <w:t xml:space="preserve">transaction.atomic(), guardar el archivo antes de cerrar la alerta vieja, actualizar solo si el estado no cambió y normalizar pasillo y góndola</w:t>
+              <w:t>transaction.atomic(), guardar el archivo antes de cerrar la alerta vieja, actualizar solo si el estado no cambió y normalizar pasillo y góndola</w:t>
             </w:r>
           </w:p>
         </w:tc>
@@ -4673,7 +4672,7 @@
                 <w:sz w:val="20"/>
                 <w:szCs w:val="20"/>
               </w:rPr>
-              <w:t xml:space="preserve">Abierto. Francisco, 2026-10-27</w:t>
+              <w:t>Abierto. Francisco, 2026-10-27</w:t>
             </w:r>
           </w:p>
         </w:tc>
@@ -4701,7 +4700,7 @@
                 <w:sz w:val="20"/>
                 <w:szCs w:val="20"/>
               </w:rPr>
-              <w:t xml:space="preserve">Configuración insegura por defecto (#50)</w:t>
+              <w:t>Configuración insegura por defecto (#50)</w:t>
             </w:r>
           </w:p>
         </w:tc>
@@ -4727,7 +4726,15 @@
                 <w:sz w:val="20"/>
                 <w:szCs w:val="20"/>
               </w:rPr>
-              <w:t xml:space="preserve">DJANGO_DEBUG vale 1 si no se define (con la clave pública de desarrollo), faltan cookies seguras y redirección a HTTPS, y el contenedor corre como root</w:t>
+              <w:t xml:space="preserve">DJANGO_DEBUG vale 1 si no se define (con la clave pública de desarrollo), faltan cookies seguras y </w:t>
+            </w:r>
+            <w:r>
+              <w:rPr>
+                <w:sz w:val="20"/>
+                <w:szCs w:val="20"/>
+              </w:rPr>
+              <w:lastRenderedPageBreak/>
+              <w:t>redirección a HTTPS, y el contenedor corre como root</w:t>
             </w:r>
           </w:p>
         </w:tc>
@@ -4753,7 +4760,8 @@
                 <w:sz w:val="20"/>
                 <w:szCs w:val="20"/>
               </w:rPr>
-              <w:t xml:space="preserve">Debug apagado por defecto, cookies seguras y HTTPS cuando DEBUG es falso, y usuario sin privilegios en el Dockerfile</w:t>
+              <w:lastRenderedPageBreak/>
+              <w:t>Debug apagado por defecto, cookies seguras y HTTPS cuando DEBUG es falso, y usuario sin privilegios en el Dockerfile</w:t>
             </w:r>
           </w:p>
         </w:tc>
@@ -4779,7 +4787,7 @@
                 <w:sz w:val="20"/>
                 <w:szCs w:val="20"/>
               </w:rPr>
-              <w:t xml:space="preserve">Abierto. Francisco, 2026-10-27</w:t>
+              <w:t>Abierto. Francisco, 2026-10-27</w:t>
             </w:r>
           </w:p>
         </w:tc>
@@ -4807,7 +4815,7 @@
                 <w:sz w:val="20"/>
                 <w:szCs w:val="20"/>
               </w:rPr>
-              <w:t xml:space="preserve">Bloqueo de cuentas por un tercero (#51)</w:t>
+              <w:t>Bloqueo de cuentas por un tercero (#51)</w:t>
             </w:r>
           </w:p>
         </w:tc>
@@ -4833,7 +4841,7 @@
                 <w:sz w:val="20"/>
                 <w:szCs w:val="20"/>
               </w:rPr>
-              <w:t xml:space="preserve">Con solo saber el RUT se bloquea la cuenta de cualquiera, también la del único Administrador, y el contador de intentos no es atómico: intentos en paralelo pasan de 5</w:t>
+              <w:t>Con solo saber el RUT se bloquea la cuenta de cualquiera, también la del único Administrador, y el contador de intentos no es atómico: intentos en paralelo pasan de 5</w:t>
             </w:r>
           </w:p>
         </w:tc>
@@ -4859,7 +4867,7 @@
                 <w:sz w:val="20"/>
                 <w:szCs w:val="20"/>
               </w:rPr>
-              <w:t xml:space="preserve">Contar con F() y bloquear por tiempo (ej. 15 min) en vez de desactivar la cuenta; confirmar el cambio de CU00 con el equipo</w:t>
+              <w:t>Contar con F() y bloquear por tiempo (ej. 15 min) en vez de desactivar la cuenta; confirmar el cambio de CU00 con el equipo</w:t>
             </w:r>
           </w:p>
         </w:tc>
@@ -4885,7 +4893,7 @@
                 <w:sz w:val="20"/>
                 <w:szCs w:val="20"/>
               </w:rPr>
-              <w:t xml:space="preserve">Abierto. Francisco, 2026-10-28</w:t>
+              <w:t>Abierto. Francisco, 2026-10-28</w:t>
             </w:r>
           </w:p>
         </w:tc>
@@ -4913,7 +4921,7 @@
                 <w:sz w:val="20"/>
                 <w:szCs w:val="20"/>
               </w:rPr>
-              <w:t xml:space="preserve">Foto sin productos detectados (#52)</w:t>
+              <w:t>Foto sin productos detectados (#52)</w:t>
             </w:r>
           </w:p>
         </w:tc>
@@ -4939,7 +4947,7 @@
                 <w:sz w:val="20"/>
                 <w:szCs w:val="20"/>
               </w:rPr>
-              <w:t xml:space="preserve">Con 0 detecciones el cálculo da 100% libre y alerta crítica (foto tapada, oscura o sin góndola)</w:t>
+              <w:t>Con 0 detecciones el cálculo da 100% libre y alerta crítica (foto tapada, oscura o sin góndola)</w:t>
             </w:r>
           </w:p>
         </w:tc>
@@ -4965,7 +4973,7 @@
                 <w:sz w:val="20"/>
                 <w:szCs w:val="20"/>
               </w:rPr>
-              <w:t xml:space="preserve">Rechazar el análisis en la app («no se detectaron productos») y definir qué informa run_pipeline.py en ese caso</w:t>
+              <w:t>Rechazar el análisis en la app («no se detectaron productos») y definir qué informa run_pipeline.py en ese caso</w:t>
             </w:r>
           </w:p>
         </w:tc>
@@ -4991,7 +4999,7 @@
                 <w:sz w:val="20"/>
                 <w:szCs w:val="20"/>
               </w:rPr>
-              <w:t xml:space="preserve">Abierto. Mariana, 2026-10-28</w:t>
+              <w:t>Abierto. Mariana, 2026-10-28</w:t>
             </w:r>
           </w:p>
         </w:tc>
@@ -5019,7 +5027,7 @@
                 <w:sz w:val="20"/>
                 <w:szCs w:val="20"/>
               </w:rPr>
-              <w:t xml:space="preserve">Rendimiento y robustez de la app web (#53)</w:t>
+              <w:t>Rendimiento y robustez de la app web (#53)</w:t>
             </w:r>
           </w:p>
         </w:tc>
@@ -5045,7 +5053,7 @@
                 <w:sz w:val="20"/>
                 <w:szCs w:val="20"/>
               </w:rPr>
-              <w:t xml:space="preserve">Las listas cargan el JSON del resultado sin usarlo; si falla el correo del enlace de contraseña, el usuario queda creado sin contraseña y con un error 500</w:t>
+              <w:t>Las listas cargan el JSON del resultado sin usarlo; si falla el correo del enlace de contraseña, el usuario queda creado sin contraseña y con un error 500</w:t>
             </w:r>
           </w:p>
         </w:tc>
@@ -5071,7 +5079,7 @@
                 <w:sz w:val="20"/>
                 <w:szCs w:val="20"/>
               </w:rPr>
-              <w:t xml:space="preserve">Diferir la carga del resultado en las listas; capturar el error del correo y ofrecer reenviar el enlace</w:t>
+              <w:t>Diferir la carga del resultado en las listas; capturar el error del correo y ofrecer reenviar el enlace</w:t>
             </w:r>
           </w:p>
         </w:tc>
@@ -5097,7 +5105,7 @@
                 <w:sz w:val="20"/>
                 <w:szCs w:val="20"/>
               </w:rPr>
-              <w:t xml:space="preserve">Abierto. Mariana, 2026-10-28</w:t>
+              <w:t>Abierto. Mariana, 2026-10-28</w:t>
             </w:r>
           </w:p>
         </w:tc>
@@ -5125,7 +5133,7 @@
                 <w:sz w:val="20"/>
                 <w:szCs w:val="20"/>
               </w:rPr>
-              <w:t xml:space="preserve">Código sin uso y CI sin fijar (#54)</w:t>
+              <w:t>Código sin uso y CI sin fijar (#54)</w:t>
             </w:r>
           </w:p>
         </w:tc>
@@ -5151,7 +5159,7 @@
                 <w:sz w:val="20"/>
                 <w:szCs w:val="20"/>
               </w:rPr>
-              <w:t xml:space="preserve">free_volume_cm3() solo la usan los tests (el Nivel 1 no se informa) y las acciones de CI no están fijadas por commit</w:t>
+              <w:t>free_volume_cm3() solo la usan los tests (el Nivel 1 no se informa) y las acciones de CI no están fijadas por commit</w:t>
             </w:r>
           </w:p>
         </w:tc>
@@ -5177,7 +5185,7 @@
                 <w:sz w:val="20"/>
                 <w:szCs w:val="20"/>
               </w:rPr>
-              <w:t xml:space="preserve">Quitar o aislar el código sin uso y fijar las acciones por commit</w:t>
+              <w:t>Quitar o aislar el código sin uso y fijar las acciones por commit</w:t>
             </w:r>
           </w:p>
         </w:tc>
@@ -5203,7 +5211,7 @@
                 <w:sz w:val="20"/>
                 <w:szCs w:val="20"/>
               </w:rPr>
-              <w:t xml:space="preserve">Abierto. Nicko, 2026-10-30</w:t>
+              <w:t>Abierto. Nicko, 2026-10-30</w:t>
             </w:r>
           </w:p>
         </w:tc>
@@ -5231,7 +5239,7 @@
                 <w:sz w:val="20"/>
                 <w:szCs w:val="20"/>
               </w:rPr>
-              <w:t xml:space="preserve">Sin ruido de cámara de sala en el entrenamiento ni en las pruebas (#55)</w:t>
+              <w:t>Sin ruido de cámara de sala en el entrenamiento ni en las pruebas (#55)</w:t>
             </w:r>
           </w:p>
         </w:tc>
@@ -5257,7 +5265,7 @@
                 <w:sz w:val="20"/>
                 <w:szCs w:val="20"/>
               </w:rPr>
-              <w:t xml:space="preserve">SKU-110K y Kaggle son fotos limpias; una cámara fija agrega ruido de sensor, compresión, baja resolución, desenfoque, contraluz, reflejos y personas que tapan la góndola</w:t>
+              <w:t>SKU-110K y Kaggle son fotos limpias; una cámara fija agrega ruido de sensor, compresión, baja resolución, desenfoque, contraluz, reflejos y personas que tapan la góndola</w:t>
             </w:r>
           </w:p>
         </w:tc>
@@ -5283,7 +5291,7 @@
                 <w:sz w:val="20"/>
                 <w:szCs w:val="20"/>
               </w:rPr>
-              <w:t xml:space="preserve">Función de degradación (solo con fotos que se pueden modificar: Kaggle, SHARD y Roboflow), medir el modelo afinado degradado y, si cae bajo mAP50 0,70, un nuevo fine-tuning</w:t>
+              <w:t>Función de degradación (solo con fotos que se pueden modificar: Kaggle, SHARD y Roboflow), medir el modelo afinado degradado y, si cae bajo mAP50 0,70, un nuevo fine-tuning</w:t>
             </w:r>
           </w:p>
         </w:tc>
@@ -5309,7 +5317,7 @@
                 <w:sz w:val="20"/>
                 <w:szCs w:val="20"/>
               </w:rPr>
-              <w:t xml:space="preserve">Abierto. Francisco, 2026-11-06</w:t>
+              <w:t>Abierto. Francisco, 2026-11-06</w:t>
             </w:r>
           </w:p>
         </w:tc>
@@ -5655,6 +5663,7 @@
                 <w:sz w:val="20"/>
                 <w:szCs w:val="20"/>
               </w:rPr>
+              <w:lastRenderedPageBreak/>
               <w:t>Memoria de video de 8 GB al entrenar</w:t>
             </w:r>
           </w:p>
@@ -6105,7 +6114,7 @@
                 <w:sz w:val="20"/>
                 <w:szCs w:val="20"/>
               </w:rPr>
-              <w:t xml:space="preserve">Faltan las instrucciones por sección</w:t>
+              <w:t>Faltan las instrucciones por sección</w:t>
             </w:r>
           </w:p>
         </w:tc>
@@ -6131,7 +6140,7 @@
                 <w:sz w:val="20"/>
                 <w:szCs w:val="20"/>
               </w:rPr>
-              <w:t xml:space="preserve">Imagen Docker lista desde la CI (#13). Antes de instalar, cerrar #50 y el resto de los hallazgos de la auditoría (#39)</w:t>
+              <w:t>Imagen Docker lista desde la CI (#13). Antes de instalar, cerrar #50 y el resto de los hallazgos de la auditoría (#39)</w:t>
             </w:r>
           </w:p>
         </w:tc>
@@ -6281,18 +6290,18 @@
           <w:sz w:val="18"/>
           <w:szCs w:val="18"/>
         </w:rPr>
-        <w:t xml:space="preserve">Tabla 3. Dificultades y riesgos técnicos con su causa, acción, estado y, en los abiertos, responsable y fecha propuestos.</w:t>
+        <w:t>Tabla 3. Dificultades y riesgos técnicos con su causa, acción, estado y, en los abiertos, responsable y fecha propuestos.</w:t>
       </w:r>
     </w:p>
     <w:p>
       <w:pPr>
         <w:pStyle w:val="Ttulo2"/>
       </w:pPr>
-      <w:bookmarkStart w:id="8" w:name="_Toc243351107"/>
+      <w:bookmarkStart w:id="7" w:name="_Toc243351107"/>
       <w:r>
         <w:t>1.6 Próximos pasos</w:t>
       </w:r>
-      <w:bookmarkEnd w:id="8"/>
+      <w:bookmarkEnd w:id="7"/>
     </w:p>
     <w:tbl>
       <w:tblPr>
@@ -6343,7 +6352,6 @@
                 <w:sz w:val="20"/>
                 <w:szCs w:val="20"/>
               </w:rPr>
-              <w:lastRenderedPageBreak/>
               <w:t>Actividad</w:t>
             </w:r>
           </w:p>
@@ -6462,7 +6470,7 @@
                 <w:sz w:val="20"/>
                 <w:szCs w:val="20"/>
               </w:rPr>
-              <w:t xml:space="preserve">Fine-tuning del detector fuera de SKU-110K (cumplido)</w:t>
+              <w:t>Fine-tuning del detector fuera de SKU-110K (cumplido)</w:t>
             </w:r>
           </w:p>
         </w:tc>
@@ -6488,7 +6496,7 @@
                 <w:sz w:val="20"/>
                 <w:szCs w:val="20"/>
               </w:rPr>
-              <w:t xml:space="preserve">#33</w:t>
+              <w:t>#33</w:t>
             </w:r>
           </w:p>
         </w:tc>
@@ -6514,7 +6522,7 @@
                 <w:sz w:val="20"/>
                 <w:szCs w:val="20"/>
               </w:rPr>
-              <w:t xml:space="preserve">Francisco</w:t>
+              <w:t>Francisco</w:t>
             </w:r>
           </w:p>
         </w:tc>
@@ -6540,7 +6548,7 @@
                 <w:sz w:val="20"/>
                 <w:szCs w:val="20"/>
               </w:rPr>
-              <w:t xml:space="preserve">2026-10-21</w:t>
+              <w:t>2026-10-21</w:t>
             </w:r>
           </w:p>
         </w:tc>
@@ -6992,7 +7000,7 @@
                 <w:sz w:val="20"/>
                 <w:szCs w:val="20"/>
               </w:rPr>
-              <w:t xml:space="preserve">Reportes Excel, CSV y PDF (cumplido)</w:t>
+              <w:t>Reportes Excel, CSV y PDF (cumplido)</w:t>
             </w:r>
           </w:p>
         </w:tc>
@@ -7018,7 +7026,7 @@
                 <w:sz w:val="20"/>
                 <w:szCs w:val="20"/>
               </w:rPr>
-              <w:t xml:space="preserve">#7</w:t>
+              <w:t>#7</w:t>
             </w:r>
           </w:p>
         </w:tc>
@@ -7044,7 +7052,7 @@
                 <w:sz w:val="20"/>
                 <w:szCs w:val="20"/>
               </w:rPr>
-              <w:t xml:space="preserve">Mariana</w:t>
+              <w:t>Mariana</w:t>
             </w:r>
           </w:p>
         </w:tc>
@@ -7070,7 +7078,7 @@
                 <w:sz w:val="20"/>
                 <w:szCs w:val="20"/>
               </w:rPr>
-              <w:t xml:space="preserve">2026-10-21</w:t>
+              <w:t>2026-10-21</w:t>
             </w:r>
           </w:p>
         </w:tc>
@@ -7098,7 +7106,7 @@
                 <w:sz w:val="20"/>
                 <w:szCs w:val="20"/>
               </w:rPr>
-              <w:t xml:space="preserve">Rehacer C.U y diagrama de arquitectura según la app Django (cumplido)</w:t>
+              <w:t>Rehacer C.U y diagrama de arquitectura según la app Django (cumplido)</w:t>
             </w:r>
           </w:p>
         </w:tc>
@@ -7124,7 +7132,7 @@
                 <w:sz w:val="20"/>
                 <w:szCs w:val="20"/>
               </w:rPr>
-              <w:t xml:space="preserve">#42</w:t>
+              <w:t>#42</w:t>
             </w:r>
           </w:p>
         </w:tc>
@@ -7150,7 +7158,7 @@
                 <w:sz w:val="20"/>
                 <w:szCs w:val="20"/>
               </w:rPr>
-              <w:t xml:space="preserve">Mariana</w:t>
+              <w:t>Mariana</w:t>
             </w:r>
           </w:p>
         </w:tc>
@@ -7176,7 +7184,7 @@
                 <w:sz w:val="20"/>
                 <w:szCs w:val="20"/>
               </w:rPr>
-              <w:t xml:space="preserve">2026-10-21</w:t>
+              <w:t>2026-10-21</w:t>
             </w:r>
           </w:p>
         </w:tc>
@@ -7310,7 +7318,7 @@
                 <w:sz w:val="20"/>
                 <w:szCs w:val="20"/>
               </w:rPr>
-              <w:t xml:space="preserve">Alertas atómicas y configuración segura de la app web</w:t>
+              <w:t>Alertas atómicas y configuración segura de la app web</w:t>
             </w:r>
           </w:p>
         </w:tc>
@@ -7336,7 +7344,7 @@
                 <w:sz w:val="20"/>
                 <w:szCs w:val="20"/>
               </w:rPr>
-              <w:t xml:space="preserve">#49, #50</w:t>
+              <w:t>#49, #50</w:t>
             </w:r>
           </w:p>
         </w:tc>
@@ -7362,7 +7370,7 @@
                 <w:sz w:val="20"/>
                 <w:szCs w:val="20"/>
               </w:rPr>
-              <w:t xml:space="preserve">Francisco</w:t>
+              <w:t>Francisco</w:t>
             </w:r>
           </w:p>
         </w:tc>
@@ -7388,7 +7396,7 @@
                 <w:sz w:val="20"/>
                 <w:szCs w:val="20"/>
               </w:rPr>
-              <w:t xml:space="preserve">2026-10-27</w:t>
+              <w:t>2026-10-27</w:t>
             </w:r>
           </w:p>
         </w:tc>
@@ -7416,7 +7424,7 @@
                 <w:sz w:val="20"/>
                 <w:szCs w:val="20"/>
               </w:rPr>
-              <w:t xml:space="preserve">Bloqueo de cuentas por tiempo (CU00)</w:t>
+              <w:t>Bloqueo de cuentas por tiempo (CU00)</w:t>
             </w:r>
           </w:p>
         </w:tc>
@@ -7442,7 +7450,7 @@
                 <w:sz w:val="20"/>
                 <w:szCs w:val="20"/>
               </w:rPr>
-              <w:t xml:space="preserve">#51</w:t>
+              <w:t>#51</w:t>
             </w:r>
           </w:p>
         </w:tc>
@@ -7468,7 +7476,7 @@
                 <w:sz w:val="20"/>
                 <w:szCs w:val="20"/>
               </w:rPr>
-              <w:t xml:space="preserve">Francisco</w:t>
+              <w:t>Francisco</w:t>
             </w:r>
           </w:p>
         </w:tc>
@@ -7494,7 +7502,7 @@
                 <w:sz w:val="20"/>
                 <w:szCs w:val="20"/>
               </w:rPr>
-              <w:t xml:space="preserve">2026-10-28</w:t>
+              <w:t>2026-10-28</w:t>
             </w:r>
           </w:p>
         </w:tc>
@@ -7522,7 +7530,7 @@
                 <w:sz w:val="20"/>
                 <w:szCs w:val="20"/>
               </w:rPr>
-              <w:t xml:space="preserve">Foto sin productos y robustez de la app web</w:t>
+              <w:t>Foto sin productos y robustez de la app web</w:t>
             </w:r>
           </w:p>
         </w:tc>
@@ -7548,7 +7556,7 @@
                 <w:sz w:val="20"/>
                 <w:szCs w:val="20"/>
               </w:rPr>
-              <w:t xml:space="preserve">#52, #53</w:t>
+              <w:t>#52, #53</w:t>
             </w:r>
           </w:p>
         </w:tc>
@@ -7574,7 +7582,7 @@
                 <w:sz w:val="20"/>
                 <w:szCs w:val="20"/>
               </w:rPr>
-              <w:t xml:space="preserve">Mariana</w:t>
+              <w:t>Mariana</w:t>
             </w:r>
           </w:p>
         </w:tc>
@@ -7600,7 +7608,7 @@
                 <w:sz w:val="20"/>
                 <w:szCs w:val="20"/>
               </w:rPr>
-              <w:t xml:space="preserve">2026-10-28</w:t>
+              <w:t>2026-10-28</w:t>
             </w:r>
           </w:p>
         </w:tc>
@@ -7628,7 +7636,8 @@
                 <w:sz w:val="20"/>
                 <w:szCs w:val="20"/>
               </w:rPr>
-              <w:t xml:space="preserve">Limpieza de código y fijar acciones de CI</w:t>
+              <w:lastRenderedPageBreak/>
+              <w:t>Limpieza de código y fijar acciones de CI</w:t>
             </w:r>
           </w:p>
         </w:tc>
@@ -7654,7 +7663,7 @@
                 <w:sz w:val="20"/>
                 <w:szCs w:val="20"/>
               </w:rPr>
-              <w:t xml:space="preserve">#54</w:t>
+              <w:t>#54</w:t>
             </w:r>
           </w:p>
         </w:tc>
@@ -7680,7 +7689,7 @@
                 <w:sz w:val="20"/>
                 <w:szCs w:val="20"/>
               </w:rPr>
-              <w:t xml:space="preserve">Nicko</w:t>
+              <w:t>Nicko</w:t>
             </w:r>
           </w:p>
         </w:tc>
@@ -7706,7 +7715,7 @@
                 <w:sz w:val="20"/>
                 <w:szCs w:val="20"/>
               </w:rPr>
-              <w:t xml:space="preserve">2026-10-30</w:t>
+              <w:t>2026-10-30</w:t>
             </w:r>
           </w:p>
         </w:tc>
@@ -7734,7 +7743,7 @@
                 <w:sz w:val="20"/>
                 <w:szCs w:val="20"/>
               </w:rPr>
-              <w:t xml:space="preserve">Detector con ruido de cámara de sala</w:t>
+              <w:t>Detector con ruido de cámara de sala</w:t>
             </w:r>
           </w:p>
         </w:tc>
@@ -7760,7 +7769,7 @@
                 <w:sz w:val="20"/>
                 <w:szCs w:val="20"/>
               </w:rPr>
-              <w:t xml:space="preserve">#55</w:t>
+              <w:t>#55</w:t>
             </w:r>
           </w:p>
         </w:tc>
@@ -7786,7 +7795,7 @@
                 <w:sz w:val="20"/>
                 <w:szCs w:val="20"/>
               </w:rPr>
-              <w:t xml:space="preserve">Francisco</w:t>
+              <w:t>Francisco</w:t>
             </w:r>
           </w:p>
         </w:tc>
@@ -7812,7 +7821,7 @@
                 <w:sz w:val="20"/>
                 <w:szCs w:val="20"/>
               </w:rPr>
-              <w:t xml:space="preserve">2026-11-06</w:t>
+              <w:t>2026-11-06</w:t>
             </w:r>
           </w:p>
         </w:tc>
@@ -8042,7 +8051,7 @@
           <w:sz w:val="18"/>
           <w:szCs w:val="18"/>
         </w:rPr>
-        <w:t xml:space="preserve">Tabla 4. Próximos pasos con responsable y fecha (backlog y Carta Gantt). Responsables y fechas de #49 a #55: propuesta a confirmar.</w:t>
+        <w:t>Tabla 4. Próximos pasos con responsable y fecha (backlog y Carta Gantt). Responsables y fechas de #49 a #55: propuesta a confirmar.</w:t>
       </w:r>
     </w:p>
     <w:p>
@@ -8054,12 +8063,12 @@
       <w:pPr>
         <w:pStyle w:val="Ttulo1"/>
       </w:pPr>
-      <w:bookmarkStart w:id="9" w:name="_Toc243351108"/>
+      <w:bookmarkStart w:id="8" w:name="_Toc243351108"/>
       <w:r>
         <w:lastRenderedPageBreak/>
         <w:t>2. Documentación técnica (README)</w:t>
       </w:r>
-      <w:bookmarkEnd w:id="9"/>
+      <w:bookmarkEnd w:id="8"/>
     </w:p>
     <w:p>
       <w:pPr>
@@ -8717,11 +8726,11 @@
       <w:pPr>
         <w:pStyle w:val="Ttulo2"/>
       </w:pPr>
-      <w:bookmarkStart w:id="10" w:name="_Toc243351109"/>
+      <w:bookmarkStart w:id="9" w:name="_Toc243351109"/>
       <w:r>
         <w:t>2.1 Datasets</w:t>
       </w:r>
-      <w:bookmarkEnd w:id="10"/>
+      <w:bookmarkEnd w:id="9"/>
     </w:p>
     <w:tbl>
       <w:tblPr>
@@ -9565,10 +9574,7 @@
         <w:t>annotation.csv</w:t>
       </w:r>
       <w:r>
-        <w:t xml:space="preserve"> truncado que trae el archivo comprimido y se usa el de figshare. No se etiquetó a mano todavía: el set propio de fotos de tienda está en el ítem #32</w:t>
-      </w:r>
-      <w:r>
-        <w:t>.</w:t>
+        <w:t xml:space="preserve"> truncado que trae el archivo comprimido y se usa el de figshare. No se etiquetó a mano todavía: el set propio de fotos de tienda está en el ítem #32.</w:t>
       </w:r>
     </w:p>
     <w:p>
@@ -9580,12 +9586,12 @@
       <w:pPr>
         <w:pStyle w:val="Ttulo1"/>
       </w:pPr>
-      <w:bookmarkStart w:id="11" w:name="_Toc243351110"/>
+      <w:bookmarkStart w:id="10" w:name="_Toc243351110"/>
       <w:r>
         <w:lastRenderedPageBreak/>
         <w:t>3. Análisis de resultados preliminares</w:t>
       </w:r>
-      <w:bookmarkEnd w:id="11"/>
+      <w:bookmarkEnd w:id="10"/>
     </w:p>
     <w:p>
       <w:pPr>
@@ -9610,11 +9616,11 @@
       <w:pPr>
         <w:pStyle w:val="Ttulo2"/>
       </w:pPr>
-      <w:bookmarkStart w:id="12" w:name="_Toc243351111"/>
+      <w:bookmarkStart w:id="11" w:name="_Toc243351111"/>
       <w:r>
         <w:t>3.1 Método</w:t>
       </w:r>
-      <w:bookmarkEnd w:id="12"/>
+      <w:bookmarkEnd w:id="11"/>
     </w:p>
     <w:p>
       <w:pPr>
@@ -9711,7 +9717,7 @@
         <w:t xml:space="preserve">Modelo medido: </w:t>
       </w:r>
       <w:r>
-        <w:t xml:space="preserve">los 20 casos de 3.3 y 3.4 y las métricas de las 44 fotos se midieron con el yolo26s original, porque son anteriores al fine-tuning (#33). El modelo afinado se mide aparte, con 12 fotos de prueba (3.2).</w:t>
+        <w:t>los 20 casos de 3.3 y 3.4 y las métricas de las 44 fotos se midieron con el yolo26s original, porque son anteriores al fine-tuning (#33). El modelo afinado se mide aparte, con 12 fotos de prueba (3.2).</w:t>
       </w:r>
     </w:p>
     <w:p>
@@ -9767,11 +9773,11 @@
       <w:pPr>
         <w:pStyle w:val="Ttulo2"/>
       </w:pPr>
-      <w:bookmarkStart w:id="13" w:name="_Toc243351112"/>
+      <w:bookmarkStart w:id="12" w:name="_Toc243351112"/>
       <w:r>
         <w:t>3.2 Métricas</w:t>
       </w:r>
-      <w:bookmarkEnd w:id="13"/>
+      <w:bookmarkEnd w:id="12"/>
     </w:p>
     <w:tbl>
       <w:tblPr>
@@ -10567,7 +10573,7 @@
                 <w:sz w:val="20"/>
                 <w:szCs w:val="20"/>
               </w:rPr>
-              <w:t xml:space="preserve">Detector afinado, 12 fotos de prueba de Kaggle, de frente (antes 0,809)</w:t>
+              <w:t>Detector afinado, 12 fotos de prueba de Kaggle, de frente (antes 0,809)</w:t>
             </w:r>
           </w:p>
         </w:tc>
@@ -10593,7 +10599,7 @@
                 <w:sz w:val="20"/>
                 <w:szCs w:val="20"/>
               </w:rPr>
-              <w:t xml:space="preserve">12</w:t>
+              <w:t>12</w:t>
             </w:r>
           </w:p>
         </w:tc>
@@ -10619,7 +10625,7 @@
                 <w:sz w:val="20"/>
                 <w:szCs w:val="20"/>
               </w:rPr>
-              <w:t xml:space="preserve">-</w:t>
+              <w:t>-</w:t>
             </w:r>
           </w:p>
         </w:tc>
@@ -10645,7 +10651,7 @@
                 <w:sz w:val="20"/>
                 <w:szCs w:val="20"/>
               </w:rPr>
-              <w:t xml:space="preserve">-</w:t>
+              <w:t>-</w:t>
             </w:r>
           </w:p>
         </w:tc>
@@ -10671,7 +10677,7 @@
                 <w:sz w:val="20"/>
                 <w:szCs w:val="20"/>
               </w:rPr>
-              <w:t xml:space="preserve">-</w:t>
+              <w:t>-</w:t>
             </w:r>
           </w:p>
         </w:tc>
@@ -10697,7 +10703,7 @@
                 <w:sz w:val="20"/>
                 <w:szCs w:val="20"/>
               </w:rPr>
-              <w:t xml:space="preserve">0,854</w:t>
+              <w:t>0,854</w:t>
             </w:r>
           </w:p>
         </w:tc>
@@ -10723,7 +10729,7 @@
                 <w:sz w:val="20"/>
                 <w:szCs w:val="20"/>
               </w:rPr>
-              <w:t xml:space="preserve">-</w:t>
+              <w:t>-</w:t>
             </w:r>
           </w:p>
         </w:tc>
@@ -10749,7 +10755,7 @@
                 <w:sz w:val="20"/>
                 <w:szCs w:val="20"/>
               </w:rPr>
-              <w:t xml:space="preserve">-</w:t>
+              <w:t>-</w:t>
             </w:r>
           </w:p>
         </w:tc>
@@ -10775,7 +10781,7 @@
                 <w:sz w:val="20"/>
                 <w:szCs w:val="20"/>
               </w:rPr>
-              <w:t xml:space="preserve">-</w:t>
+              <w:t>-</w:t>
             </w:r>
           </w:p>
         </w:tc>
@@ -10803,7 +10809,7 @@
                 <w:sz w:val="20"/>
                 <w:szCs w:val="20"/>
               </w:rPr>
-              <w:t xml:space="preserve">Detector afinado, las mismas fotos a 20° (antes 0,778)</w:t>
+              <w:t>Detector afinado, las mismas fotos a 20° (antes 0,778)</w:t>
             </w:r>
           </w:p>
         </w:tc>
@@ -10829,7 +10835,7 @@
                 <w:sz w:val="20"/>
                 <w:szCs w:val="20"/>
               </w:rPr>
-              <w:t xml:space="preserve">12</w:t>
+              <w:t>12</w:t>
             </w:r>
           </w:p>
         </w:tc>
@@ -10855,7 +10861,7 @@
                 <w:sz w:val="20"/>
                 <w:szCs w:val="20"/>
               </w:rPr>
-              <w:t xml:space="preserve">-</w:t>
+              <w:t>-</w:t>
             </w:r>
           </w:p>
         </w:tc>
@@ -10881,7 +10887,7 @@
                 <w:sz w:val="20"/>
                 <w:szCs w:val="20"/>
               </w:rPr>
-              <w:t xml:space="preserve">-</w:t>
+              <w:t>-</w:t>
             </w:r>
           </w:p>
         </w:tc>
@@ -10907,7 +10913,7 @@
                 <w:sz w:val="20"/>
                 <w:szCs w:val="20"/>
               </w:rPr>
-              <w:t xml:space="preserve">-</w:t>
+              <w:t>-</w:t>
             </w:r>
           </w:p>
         </w:tc>
@@ -10933,7 +10939,7 @@
                 <w:sz w:val="20"/>
                 <w:szCs w:val="20"/>
               </w:rPr>
-              <w:t xml:space="preserve">0,837</w:t>
+              <w:t>0,837</w:t>
             </w:r>
           </w:p>
         </w:tc>
@@ -10959,7 +10965,7 @@
                 <w:sz w:val="20"/>
                 <w:szCs w:val="20"/>
               </w:rPr>
-              <w:t xml:space="preserve">-</w:t>
+              <w:t>-</w:t>
             </w:r>
           </w:p>
         </w:tc>
@@ -10985,7 +10991,7 @@
                 <w:sz w:val="20"/>
                 <w:szCs w:val="20"/>
               </w:rPr>
-              <w:t xml:space="preserve">-</w:t>
+              <w:t>-</w:t>
             </w:r>
           </w:p>
         </w:tc>
@@ -11011,7 +11017,7 @@
                 <w:sz w:val="20"/>
                 <w:szCs w:val="20"/>
               </w:rPr>
-              <w:t xml:space="preserve">-</w:t>
+              <w:t>-</w:t>
             </w:r>
           </w:p>
         </w:tc>
@@ -11039,7 +11045,7 @@
                 <w:sz w:val="20"/>
                 <w:szCs w:val="20"/>
               </w:rPr>
-              <w:t xml:space="preserve">Detector afinado, las mismas fotos a 35° (antes 0,701)</w:t>
+              <w:t>Detector afinado, las mismas fotos a 35° (antes 0,701)</w:t>
             </w:r>
           </w:p>
         </w:tc>
@@ -11065,7 +11071,7 @@
                 <w:sz w:val="20"/>
                 <w:szCs w:val="20"/>
               </w:rPr>
-              <w:t xml:space="preserve">12</w:t>
+              <w:t>12</w:t>
             </w:r>
           </w:p>
         </w:tc>
@@ -11091,7 +11097,7 @@
                 <w:sz w:val="20"/>
                 <w:szCs w:val="20"/>
               </w:rPr>
-              <w:t xml:space="preserve">-</w:t>
+              <w:t>-</w:t>
             </w:r>
           </w:p>
         </w:tc>
@@ -11117,7 +11123,7 @@
                 <w:sz w:val="20"/>
                 <w:szCs w:val="20"/>
               </w:rPr>
-              <w:t xml:space="preserve">-</w:t>
+              <w:t>-</w:t>
             </w:r>
           </w:p>
         </w:tc>
@@ -11143,7 +11149,7 @@
                 <w:sz w:val="20"/>
                 <w:szCs w:val="20"/>
               </w:rPr>
-              <w:t xml:space="preserve">-</w:t>
+              <w:t>-</w:t>
             </w:r>
           </w:p>
         </w:tc>
@@ -11169,7 +11175,7 @@
                 <w:sz w:val="20"/>
                 <w:szCs w:val="20"/>
               </w:rPr>
-              <w:t xml:space="preserve">0,818</w:t>
+              <w:t>0,818</w:t>
             </w:r>
           </w:p>
         </w:tc>
@@ -11195,7 +11201,7 @@
                 <w:sz w:val="20"/>
                 <w:szCs w:val="20"/>
               </w:rPr>
-              <w:t xml:space="preserve">-</w:t>
+              <w:t>-</w:t>
             </w:r>
           </w:p>
         </w:tc>
@@ -11221,7 +11227,7 @@
                 <w:sz w:val="20"/>
                 <w:szCs w:val="20"/>
               </w:rPr>
-              <w:t xml:space="preserve">-</w:t>
+              <w:t>-</w:t>
             </w:r>
           </w:p>
         </w:tc>
@@ -11247,7 +11253,7 @@
                 <w:sz w:val="20"/>
                 <w:szCs w:val="20"/>
               </w:rPr>
-              <w:t xml:space="preserve">-</w:t>
+              <w:t>-</w:t>
             </w:r>
           </w:p>
         </w:tc>
@@ -11275,7 +11281,7 @@
                 <w:sz w:val="20"/>
                 <w:szCs w:val="20"/>
               </w:rPr>
-              <w:t xml:space="preserve">Detector afinado, test de SKU-110K (antes mAP50 0,950 y mAP50-95 0,610)</w:t>
+              <w:t>Detector afinado, test de SKU-110K (antes mAP50 0,950 y mAP50-95 0,610)</w:t>
             </w:r>
           </w:p>
         </w:tc>
@@ -11301,7 +11307,7 @@
                 <w:sz w:val="20"/>
                 <w:szCs w:val="20"/>
               </w:rPr>
-              <w:t xml:space="preserve">2.935</w:t>
+              <w:t>2.935</w:t>
             </w:r>
           </w:p>
         </w:tc>
@@ -11327,7 +11333,7 @@
                 <w:sz w:val="20"/>
                 <w:szCs w:val="20"/>
               </w:rPr>
-              <w:t xml:space="preserve">-</w:t>
+              <w:t>-</w:t>
             </w:r>
           </w:p>
         </w:tc>
@@ -11353,7 +11359,7 @@
                 <w:sz w:val="20"/>
                 <w:szCs w:val="20"/>
               </w:rPr>
-              <w:t xml:space="preserve">0,877</w:t>
+              <w:t>0,877</w:t>
             </w:r>
           </w:p>
         </w:tc>
@@ -11379,7 +11385,7 @@
                 <w:sz w:val="20"/>
                 <w:szCs w:val="20"/>
               </w:rPr>
-              <w:t xml:space="preserve">-</w:t>
+              <w:t>-</w:t>
             </w:r>
           </w:p>
         </w:tc>
@@ -11405,7 +11411,7 @@
                 <w:sz w:val="20"/>
                 <w:szCs w:val="20"/>
               </w:rPr>
-              <w:t xml:space="preserve">0,940</w:t>
+              <w:t>0,940</w:t>
             </w:r>
           </w:p>
         </w:tc>
@@ -11431,7 +11437,7 @@
                 <w:sz w:val="20"/>
                 <w:szCs w:val="20"/>
               </w:rPr>
-              <w:t xml:space="preserve">0,533</w:t>
+              <w:t>0,533</w:t>
             </w:r>
           </w:p>
         </w:tc>
@@ -11457,7 +11463,7 @@
                 <w:sz w:val="20"/>
                 <w:szCs w:val="20"/>
               </w:rPr>
-              <w:t xml:space="preserve">-</w:t>
+              <w:t>-</w:t>
             </w:r>
           </w:p>
         </w:tc>
@@ -11483,7 +11489,7 @@
                 <w:sz w:val="20"/>
                 <w:szCs w:val="20"/>
               </w:rPr>
-              <w:t xml:space="preserve">-</w:t>
+              <w:t>-</w:t>
             </w:r>
           </w:p>
         </w:tc>
@@ -11747,6 +11753,7 @@
                 <w:sz w:val="20"/>
                 <w:szCs w:val="20"/>
               </w:rPr>
+              <w:lastRenderedPageBreak/>
               <w:t>Sistema, envasados</w:t>
             </w:r>
           </w:p>
@@ -12209,7 +12216,7 @@
           <w:sz w:val="18"/>
           <w:szCs w:val="18"/>
         </w:rPr>
-        <w:t xml:space="preserve">Tabla 7. Detector y sistema completo fuera de SKU-110K, y detector afinado (DET-07). IoU medio de los aciertos: 0,82. Las filas «Sistema» usan el yolo26s original.</w:t>
+        <w:t>Tabla 7. Detector y sistema completo fuera de SKU-110K, y detector afinado (DET-07). IoU medio de los aciertos: 0,82. Las filas «Sistema» usan el yolo26s original.</w:t>
       </w:r>
     </w:p>
     <w:p>
@@ -12224,7 +12231,7 @@
         <w:t xml:space="preserve">Fine-tuning (#33, DET-07 de docs/test-plan.md): </w:t>
       </w:r>
       <w:r>
-        <w:t xml:space="preserve">el yolo26s se afinó 30 épocas con 24 fotos de Kaggle (CC0) y sus vistas giradas a 20° y 35°, más 300 fotos de SKU-110K para no olvidar (lr0 0,002). Se midió con 12 fotos de Kaggle que no se usaron para entrenar: el mAP50 sube de 0,809 a 0,854 de frente, de 0,778 a 0,837 a 20° y de 0,701 a 0,818 a 35° (este último estaba bajo el criterio de 0,70). En el test de SKU-110K el mAP50 baja de 0,950 a 0,940 y el mAP50-95 de 0,610 a 0,533. Decisión del 2026-10-21: se acepta y se relaja el criterio de no bajar el mAP50-95 de 0,610, porque SKU-110K no es el dominio de Walmart y lo que se pierde es sobre todo localización. La segunda corrida (1500 fotos de SKU-110K, lr0 0,0005) subió el mAP50-95 a 0,548 pero rindió menos fuera de dominio (mAP50 0,834 / 0,823 / 0,805), y se descartó. Cautelas: son solo 12 fotos de prueba, ellas eligieron además el mejor punto del entrenamiento, y las vistas giradas usan la misma transformación que las de entrenamiento, así que la mejora a 20° y 35° es optimista. Se revisa con el set propio (#32) y con el ruido de cámara de sala (#55).</w:t>
+        <w:t>el yolo26s se afinó 30 épocas con 24 fotos de Kaggle (CC0) y sus vistas giradas a 20° y 35°, más 300 fotos de SKU-110K para no olvidar (lr0 0,002). Se midió con 12 fotos de Kaggle que no se usaron para entrenar: el mAP50 sube de 0,809 a 0,854 de frente, de 0,778 a 0,837 a 20° y de 0,701 a 0,818 a 35° (este último estaba bajo el criterio de 0,70). En el test de SKU-110K el mAP50 baja de 0,950 a 0,940 y el mAP50-95 de 0,610 a 0,533. Decisión del 2026-10-21: se acepta y se relaja el criterio de no bajar el mAP50-95 de 0,610, porque SKU-110K no es el dominio de Walmart y lo que se pierde es sobre todo localización. La segunda corrida (1500 fotos de SKU-110K, lr0 0,0005) subió el mAP50-95 a 0,548 pero rindió menos fuera de dominio (mAP50 0,834 / 0,823 / 0,805), y se descartó. Cautelas: son solo 12 fotos de prueba, ellas eligieron además el mejor punto del entrenamiento, y las vistas giradas usan la misma transformación que las de entrenamiento, así que la mejora a 20° y 35° es optimista. Se revisa con el set propio (#32) y con el ruido de cámara de sala (#55).</w:t>
       </w:r>
     </w:p>
     <w:p>
@@ -12264,11 +12271,11 @@
       <w:pPr>
         <w:pStyle w:val="Ttulo2"/>
       </w:pPr>
-      <w:bookmarkStart w:id="14" w:name="_Toc243351113"/>
+      <w:bookmarkStart w:id="13" w:name="_Toc243351113"/>
       <w:r>
         <w:t>3.3 Diez mejores casos</w:t>
       </w:r>
-      <w:bookmarkEnd w:id="14"/>
+      <w:bookmarkEnd w:id="13"/>
     </w:p>
     <w:p>
       <w:pPr>
@@ -12283,7 +12290,7 @@
         <w:jc w:val="both"/>
       </w:pPr>
       <w:r>
-        <w:t xml:space="preserve">Los 10 casos se midieron con el yolo26s original, antes del fine-tuning (#33): el modelo afinado se evalúa aparte en la sección 3.2.</w:t>
+        <w:t>Los 10 casos se midieron con el yolo26s original, antes del fine-tuning (#33): el modelo afinado se evalúa aparte en la sección 3.2.</w:t>
       </w:r>
     </w:p>
     <w:p>
@@ -12312,7 +12319,7 @@
           <w:noProof/>
         </w:rPr>
         <w:drawing>
-          <wp:inline distT="0" distB="0" distL="0" distR="0" wp14:anchorId="3135D6E4" wp14:editId="7981BE51">
+          <wp:inline distT="0" distB="0" distL="0" distR="0" wp14:anchorId="7B7083A2" wp14:editId="2676E267">
             <wp:extent cx="5715000" cy="2724150"/>
             <wp:effectExtent l="0" t="0" r="0" b="0"/>
             <wp:docPr id="1" name="Imagen 1"/>
@@ -12424,7 +12431,7 @@
           <w:noProof/>
         </w:rPr>
         <w:drawing>
-          <wp:inline distT="0" distB="0" distL="0" distR="0" wp14:anchorId="016F334C" wp14:editId="220FA67B">
+          <wp:inline distT="0" distB="0" distL="0" distR="0" wp14:anchorId="39D84955" wp14:editId="39821965">
             <wp:extent cx="5715000" cy="1371600"/>
             <wp:effectExtent l="0" t="0" r="0" b="0"/>
             <wp:docPr id="2" name="Imagen 2"/>
@@ -12536,7 +12543,7 @@
           <w:noProof/>
         </w:rPr>
         <w:drawing>
-          <wp:inline distT="0" distB="0" distL="0" distR="0" wp14:anchorId="4D72752E" wp14:editId="3B064967">
+          <wp:inline distT="0" distB="0" distL="0" distR="0" wp14:anchorId="4F151786" wp14:editId="773455BB">
             <wp:extent cx="5715000" cy="1371600"/>
             <wp:effectExtent l="0" t="0" r="0" b="0"/>
             <wp:docPr id="3" name="Imagen 3"/>
@@ -12649,7 +12656,7 @@
           <w:noProof/>
         </w:rPr>
         <w:drawing>
-          <wp:inline distT="0" distB="0" distL="0" distR="0" wp14:anchorId="7B3AD4EC" wp14:editId="1B076024">
+          <wp:inline distT="0" distB="0" distL="0" distR="0" wp14:anchorId="2DC9CFE9" wp14:editId="3239E38E">
             <wp:extent cx="5715000" cy="942975"/>
             <wp:effectExtent l="0" t="0" r="0" b="0"/>
             <wp:docPr id="4" name="Imagen 4"/>
@@ -12761,7 +12768,7 @@
           <w:noProof/>
         </w:rPr>
         <w:drawing>
-          <wp:inline distT="0" distB="0" distL="0" distR="0" wp14:anchorId="0500090B" wp14:editId="6D6794CE">
+          <wp:inline distT="0" distB="0" distL="0" distR="0" wp14:anchorId="71DB841E" wp14:editId="0D686252">
             <wp:extent cx="5715000" cy="2724150"/>
             <wp:effectExtent l="0" t="0" r="0" b="0"/>
             <wp:docPr id="5" name="Imagen 5"/>
@@ -12873,7 +12880,7 @@
           <w:noProof/>
         </w:rPr>
         <w:drawing>
-          <wp:inline distT="0" distB="0" distL="0" distR="0" wp14:anchorId="39C48A50" wp14:editId="43FAF30F">
+          <wp:inline distT="0" distB="0" distL="0" distR="0" wp14:anchorId="78909B28" wp14:editId="5E9D56A6">
             <wp:extent cx="5715000" cy="1371600"/>
             <wp:effectExtent l="0" t="0" r="0" b="0"/>
             <wp:docPr id="6" name="Imagen 6"/>
@@ -12986,7 +12993,7 @@
           <w:noProof/>
         </w:rPr>
         <w:drawing>
-          <wp:inline distT="0" distB="0" distL="0" distR="0" wp14:anchorId="0D4B51AE" wp14:editId="1D8941C7">
+          <wp:inline distT="0" distB="0" distL="0" distR="0" wp14:anchorId="551207BA" wp14:editId="2FBF5A37">
             <wp:extent cx="5715000" cy="2828925"/>
             <wp:effectExtent l="0" t="0" r="0" b="0"/>
             <wp:docPr id="7" name="Imagen 7"/>
@@ -13098,7 +13105,7 @@
           <w:noProof/>
         </w:rPr>
         <w:drawing>
-          <wp:inline distT="0" distB="0" distL="0" distR="0" wp14:anchorId="35AD204C" wp14:editId="4DBCD581">
+          <wp:inline distT="0" distB="0" distL="0" distR="0" wp14:anchorId="5AF4BC2E" wp14:editId="79E4267F">
             <wp:extent cx="5715000" cy="1371600"/>
             <wp:effectExtent l="0" t="0" r="0" b="0"/>
             <wp:docPr id="8" name="Imagen 8"/>
@@ -13210,7 +13217,7 @@
           <w:noProof/>
         </w:rPr>
         <w:drawing>
-          <wp:inline distT="0" distB="0" distL="0" distR="0" wp14:anchorId="6057A428" wp14:editId="1D417AC2">
+          <wp:inline distT="0" distB="0" distL="0" distR="0" wp14:anchorId="40A5C4A8" wp14:editId="327637E0">
             <wp:extent cx="5715000" cy="1543050"/>
             <wp:effectExtent l="0" t="0" r="0" b="0"/>
             <wp:docPr id="9" name="Imagen 9"/>
@@ -13323,7 +13330,7 @@
           <w:noProof/>
         </w:rPr>
         <w:drawing>
-          <wp:inline distT="0" distB="0" distL="0" distR="0" wp14:anchorId="740F315A" wp14:editId="05E5317A">
+          <wp:inline distT="0" distB="0" distL="0" distR="0" wp14:anchorId="7C4A53DA" wp14:editId="4A7FDD56">
             <wp:extent cx="5715000" cy="1543050"/>
             <wp:effectExtent l="0" t="0" r="0" b="0"/>
             <wp:docPr id="10" name="Imagen 10"/>
@@ -13414,18 +13421,18 @@
       <w:pPr>
         <w:pStyle w:val="Ttulo2"/>
       </w:pPr>
-      <w:bookmarkStart w:id="15" w:name="_Toc243351114"/>
+      <w:bookmarkStart w:id="14" w:name="_Toc243351114"/>
       <w:r>
         <w:t>3.4 Diez peores casos</w:t>
       </w:r>
-      <w:bookmarkEnd w:id="15"/>
+      <w:bookmarkEnd w:id="14"/>
     </w:p>
     <w:p>
       <w:pPr>
         <w:jc w:val="both"/>
       </w:pPr>
       <w:r>
-        <w:t xml:space="preserve">Igual que en 3.3, los 10 casos se midieron con el yolo26s original, antes del fine-tuning (#33). Con el modelo afinado no se repitió el recorrido de las 44 fotos: solo se midieron las 12 fotos de prueba.</w:t>
+        <w:t>Igual que en 3.3, los 10 casos se midieron con el yolo26s original, antes del fine-tuning (#33). Con el modelo afinado no se repitió el recorrido de las 44 fotos: solo se midieron las 12 fotos de prueba.</w:t>
       </w:r>
     </w:p>
     <w:p>
@@ -13453,7 +13460,7 @@
           <w:noProof/>
         </w:rPr>
         <w:drawing>
-          <wp:inline distT="0" distB="0" distL="0" distR="0" wp14:anchorId="44A7B876" wp14:editId="715C67F9">
+          <wp:inline distT="0" distB="0" distL="0" distR="0" wp14:anchorId="265B11EC" wp14:editId="0ECB50DF">
             <wp:extent cx="5715000" cy="1543050"/>
             <wp:effectExtent l="0" t="0" r="0" b="0"/>
             <wp:docPr id="11" name="Imagen 11"/>
@@ -13581,7 +13588,7 @@
           <w:noProof/>
         </w:rPr>
         <w:drawing>
-          <wp:inline distT="0" distB="0" distL="0" distR="0" wp14:anchorId="010DA4E3" wp14:editId="037B3B76">
+          <wp:inline distT="0" distB="0" distL="0" distR="0" wp14:anchorId="28EA2F17" wp14:editId="3B1D420C">
             <wp:extent cx="5715000" cy="1543050"/>
             <wp:effectExtent l="0" t="0" r="0" b="0"/>
             <wp:docPr id="12" name="Imagen 12"/>
@@ -13710,7 +13717,7 @@
           <w:noProof/>
         </w:rPr>
         <w:drawing>
-          <wp:inline distT="0" distB="0" distL="0" distR="0" wp14:anchorId="29A4CAAD" wp14:editId="320025A6">
+          <wp:inline distT="0" distB="0" distL="0" distR="0" wp14:anchorId="6C7BA524" wp14:editId="5E7B4DAA">
             <wp:extent cx="5715000" cy="1381125"/>
             <wp:effectExtent l="0" t="0" r="0" b="0"/>
             <wp:docPr id="13" name="Imagen 13"/>
@@ -13838,7 +13845,7 @@
           <w:noProof/>
         </w:rPr>
         <w:drawing>
-          <wp:inline distT="0" distB="0" distL="0" distR="0" wp14:anchorId="4AB120D7" wp14:editId="0845BDE6">
+          <wp:inline distT="0" distB="0" distL="0" distR="0" wp14:anchorId="3B5F48B4" wp14:editId="5174E1FA">
             <wp:extent cx="5715000" cy="2438400"/>
             <wp:effectExtent l="0" t="0" r="0" b="0"/>
             <wp:docPr id="14" name="Imagen 14"/>
@@ -13966,7 +13973,7 @@
           <w:noProof/>
         </w:rPr>
         <w:drawing>
-          <wp:inline distT="0" distB="0" distL="0" distR="0" wp14:anchorId="7692DDFE" wp14:editId="7B5B5760">
+          <wp:inline distT="0" distB="0" distL="0" distR="0" wp14:anchorId="0C0E23B1" wp14:editId="157BF80C">
             <wp:extent cx="5715000" cy="1724025"/>
             <wp:effectExtent l="0" t="0" r="0" b="0"/>
             <wp:docPr id="15" name="Imagen 15"/>
@@ -14095,7 +14102,7 @@
           <w:noProof/>
         </w:rPr>
         <w:drawing>
-          <wp:inline distT="0" distB="0" distL="0" distR="0" wp14:anchorId="7A33F2AF" wp14:editId="35F22AAC">
+          <wp:inline distT="0" distB="0" distL="0" distR="0" wp14:anchorId="4FE7A76B" wp14:editId="050EA385">
             <wp:extent cx="5715000" cy="2562225"/>
             <wp:effectExtent l="0" t="0" r="0" b="0"/>
             <wp:docPr id="16" name="Imagen 16"/>
@@ -14223,7 +14230,7 @@
           <w:noProof/>
         </w:rPr>
         <w:drawing>
-          <wp:inline distT="0" distB="0" distL="0" distR="0" wp14:anchorId="265BCF25" wp14:editId="2B267CEF">
+          <wp:inline distT="0" distB="0" distL="0" distR="0" wp14:anchorId="1DA3CB28" wp14:editId="2FB58CF5">
             <wp:extent cx="5715000" cy="2533650"/>
             <wp:effectExtent l="0" t="0" r="0" b="0"/>
             <wp:docPr id="17" name="Imagen 17"/>
@@ -14352,7 +14359,7 @@
           <w:noProof/>
         </w:rPr>
         <w:drawing>
-          <wp:inline distT="0" distB="0" distL="0" distR="0" wp14:anchorId="7E93A307" wp14:editId="00E24B51">
+          <wp:inline distT="0" distB="0" distL="0" distR="0" wp14:anchorId="62ED5B28" wp14:editId="46CF0AA9">
             <wp:extent cx="5715000" cy="1162050"/>
             <wp:effectExtent l="0" t="0" r="0" b="0"/>
             <wp:docPr id="18" name="Imagen 18"/>
@@ -14480,7 +14487,7 @@
           <w:noProof/>
         </w:rPr>
         <w:drawing>
-          <wp:inline distT="0" distB="0" distL="0" distR="0" wp14:anchorId="04701B00" wp14:editId="5BC887CC">
+          <wp:inline distT="0" distB="0" distL="0" distR="0" wp14:anchorId="0FD8DC46" wp14:editId="0D872BF8">
             <wp:extent cx="5715000" cy="1543050"/>
             <wp:effectExtent l="0" t="0" r="0" b="0"/>
             <wp:docPr id="19" name="Imagen 19"/>
@@ -14608,7 +14615,7 @@
           <w:noProof/>
         </w:rPr>
         <w:drawing>
-          <wp:inline distT="0" distB="0" distL="0" distR="0" wp14:anchorId="370E764F" wp14:editId="40DD7D15">
+          <wp:inline distT="0" distB="0" distL="0" distR="0" wp14:anchorId="15AE87F6" wp14:editId="63A2AB0D">
             <wp:extent cx="5715000" cy="2600325"/>
             <wp:effectExtent l="0" t="0" r="0" b="0"/>
             <wp:docPr id="20" name="Imagen 20"/>
@@ -14716,11 +14723,11 @@
       <w:pPr>
         <w:pStyle w:val="Ttulo2"/>
       </w:pPr>
-      <w:bookmarkStart w:id="16" w:name="_Toc243351115"/>
+      <w:bookmarkStart w:id="15" w:name="_Toc243351115"/>
       <w:r>
         <w:t>3.5 Análisis comparativo</w:t>
       </w:r>
-      <w:bookmarkEnd w:id="16"/>
+      <w:bookmarkEnd w:id="15"/>
     </w:p>
     <w:p>
       <w:pPr>
@@ -15401,7 +15408,11 @@
         <w:t xml:space="preserve">Efecto del fine-tuning (posterior a los 20 casos): </w:t>
       </w:r>
       <w:r>
-        <w:t xml:space="preserve">sube el mAP50 fuera de dominio entre 4 y 12 puntos en las 12 fotos de prueba, más en ángulo (35°: de 0,701 a 0,818), pero no se midió su efecto sobre las falsas alertas de las 44 fotos. En SKU-110K casi no cambia el mAP50 (0,950 a 0,940) y baja la localización (mAP50-95 de 0,610 a 0,533).</w:t>
+        <w:t xml:space="preserve">sube el mAP50 fuera de dominio entre 4 y 12 puntos en las 12 fotos de prueba, más en ángulo (35°: de 0,701 a 0,818), pero no se midió su efecto sobre las </w:t>
+      </w:r>
+      <w:r>
+        <w:lastRenderedPageBreak/>
+        <w:t>falsas alertas de las 44 fotos. En SKU-110K casi no cambia el mAP50 (0,950 a 0,940) y baja la localización (mAP50-95 de 0,610 a 0,533).</w:t>
       </w:r>
     </w:p>
     <w:p>
@@ -15429,7 +15440,7 @@
           <w:b/>
           <w:bCs/>
         </w:rPr>
-        <w:t xml:space="preserve">Fine-tuning del detector con fotos fuera de SKU-110K: hecho el 2026-10-21 con Kaggle CC0 (#33, ver arriba). Falta medirlo con fotos propias (#32), con ruido de cámara de sala (#55) y con el recall en envasados (0,71 antes del fine-tuning) contra el 0,90 buscado.</w:t>
+        <w:t>Fine-tuning del detector con fotos fuera de SKU-110K: hecho el 2026-10-21 con Kaggle CC0 (#33, ver arriba). Falta medirlo con fotos propias (#32), con ruido de cámara de sala (#55) y con el recall en envasados (0,71 antes del fine-tuning) contra el 0,90 buscado.</w:t>
       </w:r>
     </w:p>
     <w:p>
@@ -15517,12 +15528,12 @@
       <w:pPr>
         <w:pStyle w:val="Ttulo1"/>
       </w:pPr>
-      <w:bookmarkStart w:id="17" w:name="_Toc243351116"/>
+      <w:bookmarkStart w:id="16" w:name="_Toc243351116"/>
       <w:r>
         <w:lastRenderedPageBreak/>
         <w:t>4. Repositorio y reproducibilidad</w:t>
       </w:r>
-      <w:bookmarkEnd w:id="17"/>
+      <w:bookmarkEnd w:id="16"/>
     </w:p>
     <w:tbl>
       <w:tblPr>
@@ -15836,7 +15847,7 @@
                 <w:sz w:val="20"/>
                 <w:szCs w:val="20"/>
               </w:rPr>
-              <w:t xml:space="preserve">Vista anotada y reportes en Excel, CSV y PDF</w:t>
+              <w:t>Vista anotada y reportes en Excel, CSV y PDF</w:t>
             </w:r>
           </w:p>
         </w:tc>
@@ -16126,7 +16137,7 @@
                 <w:sz w:val="20"/>
                 <w:szCs w:val="20"/>
               </w:rPr>
-              <w:t xml:space="preserve">233 pruebas unitarias e integración (pytest)</w:t>
+              <w:t>233 pruebas unitarias e integración (pytest)</w:t>
             </w:r>
           </w:p>
         </w:tc>
@@ -16181,7 +16192,7 @@
                 <w:sz w:val="20"/>
                 <w:szCs w:val="20"/>
               </w:rPr>
-              <w:t xml:space="preserve">Plan de pruebas, datasets, entrenamiento, curso y auditoría de la app</w:t>
+              <w:t>Plan de pruebas, datasets, entrenamiento, curso y auditoría de la app</w:t>
             </w:r>
           </w:p>
         </w:tc>
@@ -16281,7 +16292,7 @@
         </w:numPr>
       </w:pPr>
       <w:r>
-        <w:t xml:space="preserve">Clonar el repositorio, crear un entorno virtual con Python 3.12 o superior e instalar requirements.txt.</w:t>
+        <w:t>Clonar el repositorio, crear un entorno virtual con Python 3.12 o superior e instalar requirements.txt.</w:t>
       </w:r>
     </w:p>
     <w:p>
@@ -16403,7 +16414,7 @@
         <w:jc w:val="both"/>
       </w:pPr>
       <w:r>
-        <w:t xml:space="preserve">Los pesos del detector entrenado no se versionan (vienen de SKU-110K, uso académico): se comparten con el equipo por Drive. Con la foto 026 de Kaggle el ejemplo del README debe dar 2% libre, sin alerta. Los pesos afinados se usan con --weights (o SHELFVISION_WEIGHTS en la app web). Participación en el repositorio (commits sin contar merges, al 2026-10-21):</w:t>
+        <w:t>Los pesos del detector entrenado no se versionan (vienen de SKU-110K, uso académico): se comparten con el equipo por Drive. Con la foto 026 de Kaggle el ejemplo del README debe dar 2% libre, sin alerta. Los pesos afinados se usan con --weights (o SHELFVISION_WEIGHTS en la app web). Participación en el repositorio (commits sin contar merges, al 2026-10-21):</w:t>
       </w:r>
     </w:p>
     <w:tbl>
@@ -16568,7 +16579,7 @@
                 <w:sz w:val="20"/>
                 <w:szCs w:val="20"/>
               </w:rPr>
-              <w:t xml:space="preserve">81</w:t>
+              <w:t>81</w:t>
             </w:r>
           </w:p>
         </w:tc>
@@ -16594,7 +16605,7 @@
                 <w:sz w:val="20"/>
                 <w:szCs w:val="20"/>
               </w:rPr>
-              <w:t xml:space="preserve">Pipeline de visión, detector y fine-tuning, aplicación web, documentación técnica</w:t>
+              <w:t>Pipeline de visión, detector y fine-tuning, aplicación web, documentación técnica</w:t>
             </w:r>
           </w:p>
         </w:tc>
@@ -16622,6 +16633,7 @@
                 <w:sz w:val="20"/>
                 <w:szCs w:val="20"/>
               </w:rPr>
+              <w:lastRenderedPageBreak/>
               <w:t>Nicko Cortés</w:t>
             </w:r>
           </w:p>
@@ -16648,7 +16660,7 @@
                 <w:sz w:val="20"/>
                 <w:szCs w:val="20"/>
               </w:rPr>
-              <w:t xml:space="preserve">45</w:t>
+              <w:t>45</w:t>
             </w:r>
           </w:p>
         </w:tc>
@@ -16674,7 +16686,7 @@
                 <w:sz w:val="20"/>
                 <w:szCs w:val="20"/>
               </w:rPr>
-              <w:t xml:space="preserve">Documentos y anexos de la Fase 1, Carta Gantt, revisión y merge de PR</w:t>
+              <w:t>Documentos y anexos de la Fase 1, Carta Gantt, revisión y merge de PR</w:t>
             </w:r>
           </w:p>
         </w:tc>
@@ -16702,7 +16714,6 @@
                 <w:sz w:val="20"/>
                 <w:szCs w:val="20"/>
               </w:rPr>
-              <w:lastRenderedPageBreak/>
               <w:t>Mariana Ramírez</w:t>
             </w:r>
           </w:p>
@@ -16729,7 +16740,7 @@
                 <w:sz w:val="20"/>
                 <w:szCs w:val="20"/>
               </w:rPr>
-              <w:t xml:space="preserve">41</w:t>
+              <w:t>41</w:t>
             </w:r>
           </w:p>
         </w:tc>
@@ -16755,7 +16766,7 @@
                 <w:sz w:val="20"/>
                 <w:szCs w:val="20"/>
               </w:rPr>
-              <w:t xml:space="preserve">CI y protección de main, datasets, segmentación (SHARD), reportes Excel, CSV y PDF, plantillas de C.U y diagramas, revisión y merge de PR</w:t>
+              <w:t>CI y protección de main, datasets, segmentación (SHARD), reportes Excel, CSV y PDF, plantillas de C.U y diagramas, revisión y merge de PR</w:t>
             </w:r>
           </w:p>
         </w:tc>
@@ -16773,7 +16784,7 @@
           <w:sz w:val="18"/>
           <w:szCs w:val="18"/>
         </w:rPr>
-        <w:t xml:space="preserve">Tabla 10. Commits por integrante (git shortlog -sne, sin merges, con .mailmap; los de Nicko figuran con el nombre «Mateo»). Total: 167.</w:t>
+        <w:t>Tabla 10. Commits por integrante (git shortlog -sne, sin merges, con .mailmap; los de Nicko figuran con el nombre «Mateo»). Total: 167.</w:t>
       </w:r>
     </w:p>
     <w:p>
@@ -16785,12 +16796,12 @@
       <w:pPr>
         <w:pStyle w:val="Ttulo1"/>
       </w:pPr>
-      <w:bookmarkStart w:id="18" w:name="_Toc243351117"/>
+      <w:bookmarkStart w:id="17" w:name="_Toc243351117"/>
       <w:r>
         <w:lastRenderedPageBreak/>
         <w:t>5. Conclusiones y plan de mejora</w:t>
       </w:r>
-      <w:bookmarkEnd w:id="18"/>
+      <w:bookmarkEnd w:id="17"/>
     </w:p>
     <w:p>
       <w:pPr>
@@ -16801,7 +16812,7 @@
           <w:b/>
           <w:bCs/>
         </w:rPr>
-        <w:t xml:space="preserve">Objetivos alcanzados.</w:t>
+        <w:t>Objetivos alcanzados.</w:t>
       </w:r>
       <w:r>
         <w:t xml:space="preserve"> El pipeline híbrido que exige el proyecto (pre-procesamiento clásico, detección con YOLO26 y post-procesamiento de disponibilidad) está completo y corre de punta a punta sobre una foto en cerca de 0,7 s en CPU. El detector se entrenó, se comparó con una segunda variante y se afinó con fotos fuera de SKU-110K; la segmentación de repisas se midió contra un dataset externo anotado, y la alerta de quiebre sigue el último alcance (góndola completa). Una aplicación web con login por perfil, administración de usuarios, análisis de fotos, alertas y reportes exportables está operativa, y todo cambio pasa por pull requests con pruebas automáticas y construcción de la imagen Docker.</w:t>
@@ -16816,7 +16827,7 @@
           <w:b/>
           <w:bCs/>
         </w:rPr>
-        <w:t xml:space="preserve">Qué funciona hoy.</w:t>
+        <w:t>Qué funciona hoy.</w:t>
       </w:r>
       <w:r>
         <w:t xml:space="preserve"> CU00, CU01, CU04, CU06 y CU07 están implementados y CU02 es parcial: cinco de ocho casos de uso, sobre el 50% que pide la Evaluación 2. El fine-tuning mejoró el detector fuera de SKU-110K (mAP50 de 0,809 a 0,854 de frente y de 0,701 a 0,818 a 35° en 12 fotos de prueba), a costa del mAP50-95 en SKU-110K (de 0,610 a 0,533), que aceptamos porque SKU-110K no es el dominio de Walmart.</w:t>
@@ -16831,7 +16842,7 @@
           <w:b/>
           <w:bCs/>
         </w:rPr>
-        <w:t xml:space="preserve">Dificultades pendientes.</w:t>
+        <w:t>Dificultades pendientes.</w:t>
       </w:r>
       <w:r>
         <w:t xml:space="preserve"> El detector afinado solo se midió con 12 fotos, limpias y sin imágenes reales de cámaras de tienda; el ruido de una cámara fija de sala todavía no está en el entrenamiento ni en las pruebas (#55). Los refrigeradores con puerta de vidrio y la bodega de reserva sobre la góndola causan falsas alertas. La auditoría de la aplicación web del 2026-10-21 encontró riesgos reales que hay que cerrar antes de instalarla en el servidor del CITT: alertas no atómicas (#49), configuración insegura por defecto (#50), bloqueo de cuentas por un tercero (#51), una foto sin productos que dispara una alerta crítica (#52) y problemas de robustez (#53, #54). Faltan el dashboard, la configuración de umbral y cámaras, y la instalación en el servidor del CITT.</w:t>
@@ -16846,7 +16857,7 @@
           <w:b/>
           <w:bCs/>
         </w:rPr>
-        <w:t xml:space="preserve">Mejoras a priorizar.</w:t>
+        <w:t>Mejoras a priorizar.</w:t>
       </w:r>
       <w:r>
         <w:t xml:space="preserve"> Primero las correcciones de la aplicación web (#49 a #53), porque bloquean la instalación en el servidor del CITT; luego el dashboard y la configuración del umbral, y después medir y mejorar el detector con fotos propias y con ruido de cámara de sala (#32, #55).</w:t>
@@ -16861,7 +16872,7 @@
           <w:b/>
           <w:bCs/>
         </w:rPr>
-        <w:t xml:space="preserve">Lo que falta para el MVP.</w:t>
+        <w:t>Lo que falta para el MVP.</w:t>
       </w:r>
       <w:r>
         <w:t xml:space="preserve"> El dashboard de disponibilidad (CU03), la configuración del umbral (CU05), las correcciones de la auditoría, la instalación en el servidor del CITT y el primer demo operativo ante Walmart. Viabilidad del alcance: el núcleo está hecho, así que lo que falta del MVP son sobre todo funciones web sobre un pipeline que ya funciona; es factible antes del fin de la Fase 2 (semana 15) si se reparte entre los tres integrantes. La calibración de cámaras y la validación con CCTV real dependen de Walmart y quedan fuera del MVP.</w:t>
@@ -16916,7 +16927,7 @@
                 <w:sz w:val="20"/>
                 <w:szCs w:val="20"/>
               </w:rPr>
-              <w:t xml:space="preserve">Actividad</w:t>
+              <w:t>Actividad</w:t>
             </w:r>
           </w:p>
         </w:tc>
@@ -16946,7 +16957,7 @@
                 <w:sz w:val="20"/>
                 <w:szCs w:val="20"/>
               </w:rPr>
-              <w:t xml:space="preserve">Ítem</w:t>
+              <w:t>Ítem</w:t>
             </w:r>
           </w:p>
         </w:tc>
@@ -16976,7 +16987,7 @@
                 <w:sz w:val="20"/>
                 <w:szCs w:val="20"/>
               </w:rPr>
-              <w:t xml:space="preserve">Responsable</w:t>
+              <w:t>Responsable</w:t>
             </w:r>
           </w:p>
         </w:tc>
@@ -17006,7 +17017,7 @@
                 <w:sz w:val="20"/>
                 <w:szCs w:val="20"/>
               </w:rPr>
-              <w:t xml:space="preserve">Fecha</w:t>
+              <w:t>Fecha</w:t>
             </w:r>
           </w:p>
         </w:tc>
@@ -17034,7 +17045,7 @@
                 <w:sz w:val="20"/>
                 <w:szCs w:val="20"/>
               </w:rPr>
-              <w:t xml:space="preserve">Fine-tuning del detector con fotos fuera de SKU-110K (separando entrenamiento y prueba)</w:t>
+              <w:t>Fine-tuning del detector con fotos fuera de SKU-110K (separando entrenamiento y prueba)</w:t>
             </w:r>
           </w:p>
         </w:tc>
@@ -17060,7 +17071,7 @@
                 <w:sz w:val="20"/>
                 <w:szCs w:val="20"/>
               </w:rPr>
-              <w:t xml:space="preserve">#33</w:t>
+              <w:t>#33</w:t>
             </w:r>
           </w:p>
         </w:tc>
@@ -17086,7 +17097,7 @@
                 <w:sz w:val="20"/>
                 <w:szCs w:val="20"/>
               </w:rPr>
-              <w:t xml:space="preserve">Francisco</w:t>
+              <w:t>Francisco</w:t>
             </w:r>
           </w:p>
         </w:tc>
@@ -17112,7 +17123,7 @@
                 <w:sz w:val="20"/>
                 <w:szCs w:val="20"/>
               </w:rPr>
-              <w:t xml:space="preserve">Cumplido (2026-10-21)</w:t>
+              <w:t>Cumplido (2026-10-21)</w:t>
             </w:r>
           </w:p>
         </w:tc>
@@ -17140,7 +17151,7 @@
                 <w:sz w:val="20"/>
                 <w:szCs w:val="20"/>
               </w:rPr>
-              <w:t xml:space="preserve">Declarar fuera del alcance las frutas y verduras sueltas con Walmart</w:t>
+              <w:t>Declarar fuera del alcance las frutas y verduras sueltas con Walmart</w:t>
             </w:r>
           </w:p>
         </w:tc>
@@ -17218,7 +17229,7 @@
                 <w:sz w:val="20"/>
                 <w:szCs w:val="20"/>
               </w:rPr>
-              <w:t xml:space="preserve">Próxima reunión con Walmart</w:t>
+              <w:t>Próxima reunión con Walmart</w:t>
             </w:r>
           </w:p>
         </w:tc>
@@ -17246,7 +17257,7 @@
                 <w:sz w:val="20"/>
                 <w:szCs w:val="20"/>
               </w:rPr>
-              <w:t xml:space="preserve">Refrigeradores: ignorar zonas desenfocadas y marcos de puerta</w:t>
+              <w:t>Refrigeradores: ignorar zonas desenfocadas y marcos de puerta</w:t>
             </w:r>
           </w:p>
         </w:tc>
@@ -17298,7 +17309,7 @@
                 <w:sz w:val="20"/>
                 <w:szCs w:val="20"/>
               </w:rPr>
-              <w:t xml:space="preserve">Por asignar</w:t>
+              <w:t>Por asignar</w:t>
             </w:r>
           </w:p>
         </w:tc>
@@ -17324,7 +17335,7 @@
                 <w:sz w:val="20"/>
                 <w:szCs w:val="20"/>
               </w:rPr>
-              <w:t xml:space="preserve">Por definir</w:t>
+              <w:t>Por definir</w:t>
             </w:r>
           </w:p>
         </w:tc>
@@ -17352,7 +17363,7 @@
                 <w:sz w:val="20"/>
                 <w:szCs w:val="20"/>
               </w:rPr>
-              <w:t xml:space="preserve">Excluir la bodega de reserva sobre la góndola</w:t>
+              <w:t>Excluir la bodega de reserva sobre la góndola</w:t>
             </w:r>
           </w:p>
         </w:tc>
@@ -17404,7 +17415,7 @@
                 <w:sz w:val="20"/>
                 <w:szCs w:val="20"/>
               </w:rPr>
-              <w:t xml:space="preserve">Por asignar</w:t>
+              <w:t>Por asignar</w:t>
             </w:r>
           </w:p>
         </w:tc>
@@ -17430,7 +17441,7 @@
                 <w:sz w:val="20"/>
                 <w:szCs w:val="20"/>
               </w:rPr>
-              <w:t xml:space="preserve">Por definir</w:t>
+              <w:t>Por definir</w:t>
             </w:r>
           </w:p>
         </w:tc>
@@ -17458,7 +17469,7 @@
                 <w:sz w:val="20"/>
                 <w:szCs w:val="20"/>
               </w:rPr>
-              <w:t xml:space="preserve">Reportes exportables (Excel, CSV, PDF)</w:t>
+              <w:t>Reportes exportables (Excel, CSV, PDF)</w:t>
             </w:r>
           </w:p>
         </w:tc>
@@ -17484,7 +17495,7 @@
                 <w:sz w:val="20"/>
                 <w:szCs w:val="20"/>
               </w:rPr>
-              <w:t xml:space="preserve">#7</w:t>
+              <w:t>#7</w:t>
             </w:r>
           </w:p>
         </w:tc>
@@ -17510,7 +17521,7 @@
                 <w:sz w:val="20"/>
                 <w:szCs w:val="20"/>
               </w:rPr>
-              <w:t xml:space="preserve">Mariana</w:t>
+              <w:t>Mariana</w:t>
             </w:r>
           </w:p>
         </w:tc>
@@ -17536,7 +17547,7 @@
                 <w:sz w:val="20"/>
                 <w:szCs w:val="20"/>
               </w:rPr>
-              <w:t xml:space="preserve">Cumplido (2026-10-21)</w:t>
+              <w:t>Cumplido (2026-10-21)</w:t>
             </w:r>
           </w:p>
         </w:tc>
@@ -17564,7 +17575,7 @@
                 <w:sz w:val="20"/>
                 <w:szCs w:val="20"/>
               </w:rPr>
-              <w:t xml:space="preserve">Alertas atómicas y configuración segura de la app web</w:t>
+              <w:t>Alertas atómicas y configuración segura de la app web</w:t>
             </w:r>
           </w:p>
         </w:tc>
@@ -17590,7 +17601,7 @@
                 <w:sz w:val="20"/>
                 <w:szCs w:val="20"/>
               </w:rPr>
-              <w:t xml:space="preserve">#49, #50</w:t>
+              <w:t>#49, #50</w:t>
             </w:r>
           </w:p>
         </w:tc>
@@ -17616,7 +17627,7 @@
                 <w:sz w:val="20"/>
                 <w:szCs w:val="20"/>
               </w:rPr>
-              <w:t xml:space="preserve">Francisco</w:t>
+              <w:t>Francisco</w:t>
             </w:r>
           </w:p>
         </w:tc>
@@ -17642,7 +17653,7 @@
                 <w:sz w:val="20"/>
                 <w:szCs w:val="20"/>
               </w:rPr>
-              <w:t xml:space="preserve">2026-10-27</w:t>
+              <w:t>2026-10-27</w:t>
             </w:r>
           </w:p>
         </w:tc>
@@ -17670,7 +17681,8 @@
                 <w:sz w:val="20"/>
                 <w:szCs w:val="20"/>
               </w:rPr>
-              <w:t xml:space="preserve">Bloqueo de cuentas por tiempo (CU00)</w:t>
+              <w:lastRenderedPageBreak/>
+              <w:t>Bloqueo de cuentas por tiempo (CU00)</w:t>
             </w:r>
           </w:p>
         </w:tc>
@@ -17696,7 +17708,7 @@
                 <w:sz w:val="20"/>
                 <w:szCs w:val="20"/>
               </w:rPr>
-              <w:t xml:space="preserve">#51</w:t>
+              <w:t>#51</w:t>
             </w:r>
           </w:p>
         </w:tc>
@@ -17722,7 +17734,7 @@
                 <w:sz w:val="20"/>
                 <w:szCs w:val="20"/>
               </w:rPr>
-              <w:t xml:space="preserve">Francisco</w:t>
+              <w:t>Francisco</w:t>
             </w:r>
           </w:p>
         </w:tc>
@@ -17748,7 +17760,7 @@
                 <w:sz w:val="20"/>
                 <w:szCs w:val="20"/>
               </w:rPr>
-              <w:t xml:space="preserve">2026-10-28</w:t>
+              <w:t>2026-10-28</w:t>
             </w:r>
           </w:p>
         </w:tc>
@@ -17776,7 +17788,7 @@
                 <w:sz w:val="20"/>
                 <w:szCs w:val="20"/>
               </w:rPr>
-              <w:t xml:space="preserve">Foto sin productos y robustez de la app web</w:t>
+              <w:t>Foto sin productos y robustez de la app web</w:t>
             </w:r>
           </w:p>
         </w:tc>
@@ -17802,7 +17814,7 @@
                 <w:sz w:val="20"/>
                 <w:szCs w:val="20"/>
               </w:rPr>
-              <w:t xml:space="preserve">#52, #53</w:t>
+              <w:t>#52, #53</w:t>
             </w:r>
           </w:p>
         </w:tc>
@@ -17828,7 +17840,7 @@
                 <w:sz w:val="20"/>
                 <w:szCs w:val="20"/>
               </w:rPr>
-              <w:t xml:space="preserve">Mariana</w:t>
+              <w:t>Mariana</w:t>
             </w:r>
           </w:p>
         </w:tc>
@@ -17854,7 +17866,7 @@
                 <w:sz w:val="20"/>
                 <w:szCs w:val="20"/>
               </w:rPr>
-              <w:t xml:space="preserve">2026-10-28</w:t>
+              <w:t>2026-10-28</w:t>
             </w:r>
           </w:p>
         </w:tc>
@@ -17882,7 +17894,7 @@
                 <w:sz w:val="20"/>
                 <w:szCs w:val="20"/>
               </w:rPr>
-              <w:t xml:space="preserve">Limpieza de código y fijar acciones de CI</w:t>
+              <w:t>Limpieza de código y fijar acciones de CI</w:t>
             </w:r>
           </w:p>
         </w:tc>
@@ -17908,7 +17920,7 @@
                 <w:sz w:val="20"/>
                 <w:szCs w:val="20"/>
               </w:rPr>
-              <w:t xml:space="preserve">#54</w:t>
+              <w:t>#54</w:t>
             </w:r>
           </w:p>
         </w:tc>
@@ -17934,7 +17946,7 @@
                 <w:sz w:val="20"/>
                 <w:szCs w:val="20"/>
               </w:rPr>
-              <w:t xml:space="preserve">Nicko</w:t>
+              <w:t>Nicko</w:t>
             </w:r>
           </w:p>
         </w:tc>
@@ -17960,7 +17972,7 @@
                 <w:sz w:val="20"/>
                 <w:szCs w:val="20"/>
               </w:rPr>
-              <w:t xml:space="preserve">2026-10-30</w:t>
+              <w:t>2026-10-30</w:t>
             </w:r>
           </w:p>
         </w:tc>
@@ -17988,7 +18000,7 @@
                 <w:sz w:val="20"/>
                 <w:szCs w:val="20"/>
               </w:rPr>
-              <w:t xml:space="preserve">Entrenar y medir el detector con ruido de cámara de sala</w:t>
+              <w:t>Entrenar y medir el detector con ruido de cámara de sala</w:t>
             </w:r>
           </w:p>
         </w:tc>
@@ -18014,7 +18026,7 @@
                 <w:sz w:val="20"/>
                 <w:szCs w:val="20"/>
               </w:rPr>
-              <w:t xml:space="preserve">#55</w:t>
+              <w:t>#55</w:t>
             </w:r>
           </w:p>
         </w:tc>
@@ -18040,7 +18052,7 @@
                 <w:sz w:val="20"/>
                 <w:szCs w:val="20"/>
               </w:rPr>
-              <w:t xml:space="preserve">Francisco</w:t>
+              <w:t>Francisco</w:t>
             </w:r>
           </w:p>
         </w:tc>
@@ -18066,7 +18078,7 @@
                 <w:sz w:val="20"/>
                 <w:szCs w:val="20"/>
               </w:rPr>
-              <w:t xml:space="preserve">2026-11-06</w:t>
+              <w:t>2026-11-06</w:t>
             </w:r>
           </w:p>
         </w:tc>
@@ -18094,7 +18106,7 @@
                 <w:sz w:val="20"/>
                 <w:szCs w:val="20"/>
               </w:rPr>
-              <w:t xml:space="preserve">Primer demo operativo ante Walmart</w:t>
+              <w:t>Primer demo operativo ante Walmart</w:t>
             </w:r>
           </w:p>
         </w:tc>
@@ -18200,7 +18212,7 @@
                 <w:sz w:val="20"/>
                 <w:szCs w:val="20"/>
               </w:rPr>
-              <w:t xml:space="preserve">Dashboard y configuración de umbral y cámaras</w:t>
+              <w:t>Dashboard y configuración de umbral y cámaras</w:t>
             </w:r>
           </w:p>
         </w:tc>
@@ -18252,7 +18264,7 @@
                 <w:sz w:val="20"/>
                 <w:szCs w:val="20"/>
               </w:rPr>
-              <w:t xml:space="preserve">Por asignar</w:t>
+              <w:t>Por asignar</w:t>
             </w:r>
           </w:p>
         </w:tc>
@@ -18278,7 +18290,7 @@
                 <w:sz w:val="20"/>
                 <w:szCs w:val="20"/>
               </w:rPr>
-              <w:t xml:space="preserve">Antes del fin de la Fase 2</w:t>
+              <w:t>Antes del fin de la Fase 2</w:t>
             </w:r>
           </w:p>
         </w:tc>
@@ -18306,7 +18318,7 @@
                 <w:sz w:val="20"/>
                 <w:szCs w:val="20"/>
               </w:rPr>
-              <w:t xml:space="preserve">Plan de mejoras de la Fase 1</w:t>
+              <w:t>Plan de mejoras de la Fase 1</w:t>
             </w:r>
           </w:p>
         </w:tc>
@@ -18384,7 +18396,7 @@
                 <w:sz w:val="20"/>
                 <w:szCs w:val="20"/>
               </w:rPr>
-              <w:t xml:space="preserve">Cumplido (2026-10-20)</w:t>
+              <w:t>Cumplido (2026-10-20)</w:t>
             </w:r>
           </w:p>
         </w:tc>
@@ -18402,7 +18414,7 @@
           <w:sz w:val="18"/>
           <w:szCs w:val="18"/>
         </w:rPr>
-        <w:t xml:space="preserve">Tabla 11. Plan de mejora. Responsables y fechas de #49 a #55: propuesta a confirmar por cada integrante.</w:t>
+        <w:t>Tabla 11. Plan de mejora. Responsables y fechas de #49 a #55: propuesta a confirmar por cada integrante.</w:t>
       </w:r>
     </w:p>
     <w:p>
@@ -18414,10 +18426,34 @@
       <w:pPr>
         <w:pStyle w:val="Ttulo1"/>
       </w:pPr>
-      <w:bookmarkStart w:id="19" w:name="_Toc243351118"/>
+      <w:bookmarkStart w:id="18" w:name="_Toc243351118"/>
       <w:r>
         <w:lastRenderedPageBreak/>
         <w:t>6. Demostración funcional</w:t>
+      </w:r>
+      <w:bookmarkEnd w:id="18"/>
+    </w:p>
+    <w:p>
+      <w:pPr>
+        <w:jc w:val="both"/>
+      </w:pPr>
+      <w:r>
+        <w:rPr>
+          <w:highlight w:val="yellow"/>
+        </w:rPr>
+        <w:t>Video en preparación (ítem #36, a cargo de Nicko, 2026-10-21); enlace por agregar.</w:t>
+      </w:r>
+      <w:r>
+        <w:t xml:space="preserve"> El video (5 a 10 minutos) muestra solo lo que la aplicación hace hoy, con fotos que se pueden mostrar (no SKU-110K): inicio de sesión por perfil, creación de un usuario, análisis de una foto con su vista anotada, % libre y alerta, ciclo de la alerta desde la vista del reponedor, y la evaluación por lotes desde la línea de comandos.</w:t>
+      </w:r>
+    </w:p>
+    <w:p>
+      <w:pPr>
+        <w:pStyle w:val="Ttulo1"/>
+      </w:pPr>
+      <w:bookmarkStart w:id="19" w:name="_Toc243351119"/>
+      <w:r>
+        <w:t>7. Reflexiones individuales</w:t>
       </w:r>
       <w:bookmarkEnd w:id="19"/>
     </w:p>
@@ -18429,19 +18465,16 @@
         <w:rPr>
           <w:highlight w:val="yellow"/>
         </w:rPr>
-        <w:t>Video en preparación (ítem #36, a cargo de Nicko, 2026-10-21); enlace por agregar.</w:t>
-      </w:r>
-      <w:r>
-        <w:t xml:space="preserve"> El video (5 a 10 minutos) muestra solo lo que la aplicación hace hoy, con fotos que se pueden mostrar (no SKU-110K): inicio de sesión por perfil, creación de un usuario, análisis de una foto con su vista anotada, % libre y alerta, ciclo de la alerta desde la vista del reponedor, y la evaluación por lotes desde la línea de comandos.</w:t>
+        <w:t>Cada integrante redacta su propia reflexión.</w:t>
       </w:r>
     </w:p>
     <w:p>
       <w:pPr>
-        <w:pStyle w:val="Ttulo1"/>
+        <w:pStyle w:val="Ttulo2"/>
       </w:pPr>
-      <w:bookmarkStart w:id="20" w:name="_Toc243351119"/>
-      <w:r>
-        <w:t>7. Reflexiones individuales</w:t>
+      <w:bookmarkStart w:id="20" w:name="_Toc243351120"/>
+      <w:r>
+        <w:t>Nicko Cortés</w:t>
       </w:r>
       <w:bookmarkEnd w:id="20"/>
     </w:p>
@@ -18453,16 +18486,16 @@
         <w:rPr>
           <w:highlight w:val="yellow"/>
         </w:rPr>
-        <w:t xml:space="preserve">Cada integrante redacta su propia reflexión.</w:t>
+        <w:t>Pendiente.</w:t>
       </w:r>
     </w:p>
     <w:p>
       <w:pPr>
         <w:pStyle w:val="Ttulo2"/>
       </w:pPr>
-      <w:bookmarkStart w:id="21" w:name="_Toc243351120"/>
-      <w:r>
-        <w:t>Nicko Cortés</w:t>
+      <w:bookmarkStart w:id="21" w:name="_Toc243351121"/>
+      <w:r>
+        <w:t>Mariana Ramírez</w:t>
       </w:r>
       <w:bookmarkEnd w:id="21"/>
     </w:p>
@@ -18471,19 +18504,16 @@
         <w:jc w:val="both"/>
       </w:pPr>
       <w:r>
-        <w:rPr>
-          <w:highlight w:val="yellow"/>
-        </w:rPr>
-        <w:t xml:space="preserve">Pendiente.</w:t>
+        <w:t>Mi trabajo se centró en la calidad y la organización del proyecto: armé la integración continua con GitHub Actions y la protección de la rama main, corregí datos desactualizados en nuestros documentos, evalué la segmentación de repisas con el dataset SHARD, preparé el plan de mejoras de la Fase 1 y las evidencias de avance, y revisé y mergeé pull requests. Lo más difícil para mí fue la evaluación con SHARD. Al principio la segmentación encontraba líneas de repisa que no existían, como diagonales y líneas en medio de cajas apiladas, y yo no sabía cómo probar si realmente funcionaba. Lo resolví comparando nuestras líneas con las anotadas mediante precisión, recall y F1, y luego agregando un filtro que solo conserva las líneas respaldadas por un borde real a lo largo de la mayor parte de la repisa. Aprendí muchas cosas: que un resultado no es bueno hasta que se mide, que las pruebas automáticas y los pull requests evitan muchos problemas cuando tres personas trabajan al mismo tiempo, y que dejar por escrito cada decisión ayuda cuando el cliente cambia el alcance. Si pudiera hacer algo distinto, también habría probado YOLOv8, o combinarlo con YOLO26, porque solo comparamos dos variantes de YOLO26 y quizás otro modelo daría mejores resultados con nuestras propias fotos. Ahora quiero terminar los ítems que faltan, como el dashboard, y ayudar a mejorar la precisión del modelo con fotos fuera de SKU-110K.</w:t>
       </w:r>
     </w:p>
     <w:p>
       <w:pPr>
         <w:pStyle w:val="Ttulo2"/>
       </w:pPr>
-      <w:bookmarkStart w:id="22" w:name="_Toc243351121"/>
-      <w:r>
-        <w:t>Mariana Ramírez</w:t>
+      <w:bookmarkStart w:id="22" w:name="_Toc243351122"/>
+      <w:r>
+        <w:t>Francisco Sandoval</w:t>
       </w:r>
       <w:bookmarkEnd w:id="22"/>
     </w:p>
@@ -18492,16 +18522,37 @@
         <w:jc w:val="both"/>
       </w:pPr>
       <w:r>
-        <w:t xml:space="preserve">Mi trabajo se centró en la calidad y la organización del proyecto: armé la integración continua con GitHub Actions y la protección de la rama main, corregí datos desactualizados en nuestros documentos, evalué la segmentación de repisas con el dataset SHARD, preparé el plan de mejoras de la Fase 1 y las evidencias de avance, y revisé y mergeé pull requests. Lo más difícil para mí fue la evaluación con SHARD. Al principio la segmentación encontraba líneas de repisa que no existían, como diagonales y líneas en medio de cajas apiladas, y yo no sabía cómo probar si realmente funcionaba. Lo resolví comparando nuestras líneas con las anotadas mediante precisión, recall y F1, y luego agregando un filtro que solo conserva las líneas respaldadas por un borde real a lo largo de la mayor parte de la repisa. Aprendí muchas cosas: que un resultado no es bueno hasta que se mide, que las pruebas automáticas y los pull requests evitan muchos problemas cuando tres personas trabajan al mismo tiempo, y que dejar por escrito cada decisión ayuda cuando el cliente cambia el alcance. Si pudiera hacer algo distinto, también habría probado YOLOv8, o combinarlo con YOLO26, porque solo comparamos dos variantes de YOLO26 y quizás otro modelo daría mejores resultados con nuestras propias fotos. Ahora quiero terminar los ítems que faltan, como el dashboard, y ayudar a mejorar la precisión del modelo con fotos fuera de SKU-110K.</w:t>
+        <w:t xml:space="preserve">Trabajé en el </w:t>
+      </w:r>
+      <w:r>
+        <w:t>core</w:t>
+      </w:r>
+      <w:r>
+        <w:t xml:space="preserve"> de </w:t>
+      </w:r>
+      <w:r>
+        <w:t xml:space="preserve">la </w:t>
+      </w:r>
+      <w:r>
+        <w:t xml:space="preserve">visión artificial y su integración: corrección de imagen, segmentación automática de repisas, el entrenamiento de YOLO26 con SKU-110K, el cálculo de disponibilidad, el pipeline de punta a punta y la primera versión de la app web Django. </w:t>
+      </w:r>
+      <w:r>
+        <w:t>Lo que más aprendí fue la importancia que tiene la cantidad de datos con los que se entrena un modelo y la calidad de estos mismos datos también. Al haber limitaciones para encontrar datasets de góndolas o datasets que pudiéramos aplicar para nuestro caso, se nos hace urgente buscar otras formas de entregarle datos mas realistas al modelo para que no trabaje solo en un entorno “aislado” y pueda operar bien en producción. Me entusiasma este proyecto y lo que podemos llegar a lograr con él.</w:t>
+      </w:r>
+    </w:p>
+    <w:p>
+      <w:r>
+        <w:br w:type="page"/>
       </w:r>
     </w:p>
     <w:p>
       <w:pPr>
-        <w:pStyle w:val="Ttulo2"/>
+        <w:pStyle w:val="Ttulo1"/>
       </w:pPr>
-      <w:bookmarkStart w:id="23" w:name="_Toc243351122"/>
-      <w:r>
-        <w:t>Francisco Sandoval</w:t>
+      <w:bookmarkStart w:id="23" w:name="_Toc243351123"/>
+      <w:r>
+        <w:lastRenderedPageBreak/>
+        <w:t>Bibliografía</w:t>
       </w:r>
       <w:bookmarkEnd w:id="23"/>
     </w:p>
@@ -18510,10 +18561,55 @@
         <w:jc w:val="both"/>
       </w:pPr>
       <w:r>
-        <w:rPr>
-          <w:highlight w:val="yellow"/>
-        </w:rPr>
-        <w:t xml:space="preserve">Borrador, para revisión de Francisco. Trabajé en el núcleo de visión artificial y su integración: corrección de imagen, segmentación automática de repisas, el entrenamiento de YOLO26 con SKU-110K, el cálculo de disponibilidad, el pipeline de punta a punta y la primera versión de la app web Django. La lección más valiosa fue que una buena métrica del detector no garantiza un buen sistema: el detector llega a 0,95 de mAP50 en SKU-110K, pero con nuestras propias fotos de Kaggle su recall baja a 0,64 y cada producto no detectado se convierte en una falsa alerta. Medir esto con honestidad, con los 10 mejores y los 10 peores casos, cambió nuestras prioridades: ahora planificamos fine-tuning con fotos fuera de SKU-110K y declaramos fuera del alcance las frutas y verduras sueltas. También aprendí a dejar por escrito cada decisión con su evidencia, porque el cliente cambió el alcance dos veces (alerta por góndola completa, profundidad fija) y el razonamiento escrito hizo baratos esos cambios. Después quiero medir quiebres reales con el dataset de Roboflow y nuestras propias fotos, y ayudar al equipo a instalar la aplicación en el servidor del CITT.</w:t>
+        <w:t>Bradski, G. (2000). The OpenCV Library. Dr. Dobb's Journal of Software Tools.</w:t>
+      </w:r>
+    </w:p>
+    <w:p>
+      <w:pPr>
+        <w:jc w:val="both"/>
+      </w:pPr>
+      <w:r>
+        <w:t>Django Software Foundation. (2026). Django (versión 6.1) [Software]. https://www.djangoproject.com/</w:t>
+      </w:r>
+    </w:p>
+    <w:p>
+      <w:pPr>
+        <w:jc w:val="both"/>
+      </w:pPr>
+      <w:r>
+        <w:t>Goldman, E., Herzig, R., Eisenschtat, A., Goldberger, J. y Hassner, T. (2019). Precise Detection in Densely Packed Scenes. En Proceedings of the IEEE/CVF Conference on Computer Vision and Pattern Recognition (CVPR) (pp. 5227-5236).</w:t>
+      </w:r>
+    </w:p>
+    <w:p>
+      <w:pPr>
+        <w:jc w:val="both"/>
+      </w:pPr>
+      <w:r>
+        <w:t>Humans in the Loop. (s. f.). Supermarket shelves dataset [Dataset, CC0 1.0]. Kaggle. https://www.kaggle.com/datasets/humansintheloop/supermarket-shelves-dataset</w:t>
+      </w:r>
+    </w:p>
+    <w:p>
+      <w:pPr>
+        <w:jc w:val="both"/>
+      </w:pPr>
+      <w:r>
+        <w:t>SHARD: SHelf mAnagement Row Dataset. (2024). Expert Systems with Applications. https://doi.org/10.1016/j.eswa.2024.124635 [Dataset, CC BY 4.0]. https://figshare.com/articles/dataset/SHARD_-_SHelf_mAnagement_Row_Dataset/24100695</w:t>
+      </w:r>
+    </w:p>
+    <w:p>
+      <w:pPr>
+        <w:jc w:val="both"/>
+      </w:pPr>
+      <w:r>
+        <w:t>Ultralytics. (2025). Ultralytics YOLO26 [Software]. https://docs.ultralytics.com/models/yolo26/</w:t>
+      </w:r>
+    </w:p>
+    <w:p>
+      <w:pPr>
+        <w:jc w:val="both"/>
+      </w:pPr>
+      <w:r>
+        <w:t>Zuiderveld, K. (1994). Contrast Limited Adaptive Histogram Equalization. En P. Heckbert (Ed.), Graphics Gems IV (pp. 474-485). Academic Press.</w:t>
       </w:r>
     </w:p>
     <w:p>
@@ -18525,10 +18621,10 @@
       <w:pPr>
         <w:pStyle w:val="Ttulo1"/>
       </w:pPr>
-      <w:bookmarkStart w:id="24" w:name="_Toc243351123"/>
+      <w:bookmarkStart w:id="24" w:name="_Toc243351124"/>
       <w:r>
         <w:lastRenderedPageBreak/>
-        <w:t>Bibliografía</w:t>
+        <w:t>Anexo A. Evidencias: Pull Requests integrados</w:t>
       </w:r>
       <w:bookmarkEnd w:id="24"/>
     </w:p>
@@ -18537,79 +18633,7 @@
         <w:jc w:val="both"/>
       </w:pPr>
       <w:r>
-        <w:t>Bradski, G. (2000). The OpenCV Library. Dr. Dobb's Journal of Software Tools.</w:t>
-      </w:r>
-    </w:p>
-    <w:p>
-      <w:pPr>
-        <w:jc w:val="both"/>
-      </w:pPr>
-      <w:r>
-        <w:t>Django Software Foundation. (2026). Django (versión 6.1) [Software]. https://www.djangoproject.com/</w:t>
-      </w:r>
-    </w:p>
-    <w:p>
-      <w:pPr>
-        <w:jc w:val="both"/>
-      </w:pPr>
-      <w:r>
-        <w:t>Goldman, E., Herzig, R., Eisenschtat, A., Goldberger, J. y Hassner, T. (2019). Precise Detection in Densely Packed Scenes. En Proceedings of the IEEE/CVF Conference on Computer Vision and Pattern Recognition (CVPR) (pp. 5227-5236).</w:t>
-      </w:r>
-    </w:p>
-    <w:p>
-      <w:pPr>
-        <w:jc w:val="both"/>
-      </w:pPr>
-      <w:r>
-        <w:t>Humans in the Loop. (s. f.). Supermarket shelves dataset [Dataset, CC0 1.0]. Kaggle. https://www.kaggle.com/datasets/humansintheloop/supermarket-shelves-dataset</w:t>
-      </w:r>
-    </w:p>
-    <w:p>
-      <w:pPr>
-        <w:jc w:val="both"/>
-      </w:pPr>
-      <w:r>
-        <w:t>SHARD: SHelf mAnagement Row Dataset. (2024). Expert Systems with Applications. https://doi.org/10.1016/j.eswa.2024.124635 [Dataset, CC BY 4.0]. https://figshare.com/articles/dataset/SHARD_-_SHelf_mAnagement_Row_Dataset/24100695</w:t>
-      </w:r>
-    </w:p>
-    <w:p>
-      <w:pPr>
-        <w:jc w:val="both"/>
-      </w:pPr>
-      <w:r>
-        <w:t>Ultralytics. (2025). Ultralytics YOLO26 [Software]. https://docs.ultralytics.com/models/yolo26/</w:t>
-      </w:r>
-    </w:p>
-    <w:p>
-      <w:pPr>
-        <w:jc w:val="both"/>
-      </w:pPr>
-      <w:r>
-        <w:t>Zuiderveld, K. (1994). Contrast Limited Adaptive Histogram Equalization. En P. Heckbert (Ed.), Graphics Gems IV (pp. 474-485). Academic Press.</w:t>
-      </w:r>
-    </w:p>
-    <w:p>
-      <w:r>
-        <w:br w:type="page"/>
-      </w:r>
-    </w:p>
-    <w:p>
-      <w:pPr>
-        <w:pStyle w:val="Ttulo1"/>
-      </w:pPr>
-      <w:bookmarkStart w:id="25" w:name="_Toc243351124"/>
-      <w:r>
-        <w:lastRenderedPageBreak/>
-        <w:t>Anexo A. Evidencias: Pull Requests integrados</w:t>
-      </w:r>
-      <w:bookmarkEnd w:id="25"/>
-    </w:p>
-    <w:p>
-      <w:pPr>
-        <w:jc w:val="both"/>
-      </w:pPr>
-      <w:r>
-        <w:t xml:space="preserve">Repositorio: https://github.com/marianapeachy/capstone. Cada PR describe qué cambia y cómo se verificó. Se listan los PR integrados hasta el #57; el #56 (evidencias de avance, #37) sigue abierto.</w:t>
+        <w:t>Repositorio: https://github.com/marianapeachy/capstone. Cada PR describe qué cambia y cómo se verificó. Se listan los PR integrados hasta el #57; el #56 (evidencias de avance, #37) sigue abierto.</w:t>
       </w:r>
     </w:p>
     <w:tbl>
@@ -21629,7 +21653,7 @@
                 <w:sz w:val="20"/>
                 <w:szCs w:val="20"/>
               </w:rPr>
-              <w:t xml:space="preserve">#39</w:t>
+              <w:t>#39</w:t>
             </w:r>
           </w:p>
         </w:tc>
@@ -21655,7 +21679,7 @@
                 <w:sz w:val="20"/>
                 <w:szCs w:val="20"/>
               </w:rPr>
-              <w:t xml:space="preserve">2026-10-20</w:t>
+              <w:t>2026-10-20</w:t>
             </w:r>
           </w:p>
         </w:tc>
@@ -21681,7 +21705,7 @@
                 <w:sz w:val="20"/>
                 <w:szCs w:val="20"/>
               </w:rPr>
-              <w:t xml:space="preserve">docs: update interim report with README, owners and PR annex (#27)</w:t>
+              <w:t>docs: update interim report with README, owners and PR annex (#27)</w:t>
             </w:r>
           </w:p>
         </w:tc>
@@ -21709,7 +21733,7 @@
                 <w:sz w:val="20"/>
                 <w:szCs w:val="20"/>
               </w:rPr>
-              <w:t xml:space="preserve">#40</w:t>
+              <w:t>#40</w:t>
             </w:r>
           </w:p>
         </w:tc>
@@ -21735,7 +21759,7 @@
                 <w:sz w:val="20"/>
                 <w:szCs w:val="20"/>
               </w:rPr>
-              <w:t xml:space="preserve">2026-10-20</w:t>
+              <w:t>2026-10-20</w:t>
             </w:r>
           </w:p>
         </w:tc>
@@ -21761,7 +21785,7 @@
                 <w:sz w:val="20"/>
                 <w:szCs w:val="20"/>
               </w:rPr>
-              <w:t xml:space="preserve">docs: out-of-domain detector measurements (#33, steps 2 and 3)</w:t>
+              <w:t>docs: out-of-domain detector measurements (#33, steps 2 and 3)</w:t>
             </w:r>
           </w:p>
         </w:tc>
@@ -21789,7 +21813,7 @@
                 <w:sz w:val="20"/>
                 <w:szCs w:val="20"/>
               </w:rPr>
-              <w:t xml:space="preserve">#41</w:t>
+              <w:t>#41</w:t>
             </w:r>
           </w:p>
         </w:tc>
@@ -21815,7 +21839,7 @@
                 <w:sz w:val="20"/>
                 <w:szCs w:val="20"/>
               </w:rPr>
-              <w:t xml:space="preserve">2026-10-20</w:t>
+              <w:t>2026-10-20</w:t>
             </w:r>
           </w:p>
         </w:tc>
@@ -21841,7 +21865,7 @@
                 <w:sz w:val="20"/>
                 <w:szCs w:val="20"/>
               </w:rPr>
-              <w:t xml:space="preserve">docs: #33 step 4 and fine-tuning plan (backlog)</w:t>
+              <w:t>docs: #33 step 4 and fine-tuning plan (backlog)</w:t>
             </w:r>
           </w:p>
         </w:tc>
@@ -21869,7 +21893,7 @@
                 <w:sz w:val="20"/>
                 <w:szCs w:val="20"/>
               </w:rPr>
-              <w:t xml:space="preserve">#42</w:t>
+              <w:t>#42</w:t>
             </w:r>
           </w:p>
         </w:tc>
@@ -21895,7 +21919,7 @@
                 <w:sz w:val="20"/>
                 <w:szCs w:val="20"/>
               </w:rPr>
-              <w:t xml:space="preserve">2026-10-20</w:t>
+              <w:t>2026-10-20</w:t>
             </w:r>
           </w:p>
         </w:tc>
@@ -21921,7 +21945,7 @@
                 <w:sz w:val="20"/>
                 <w:szCs w:val="20"/>
               </w:rPr>
-              <w:t xml:space="preserve">Add files via upload</w:t>
+              <w:t>Add files via upload</w:t>
             </w:r>
           </w:p>
         </w:tc>
@@ -21949,7 +21973,7 @@
                 <w:sz w:val="20"/>
                 <w:szCs w:val="20"/>
               </w:rPr>
-              <w:t xml:space="preserve">#43</w:t>
+              <w:t>#43</w:t>
             </w:r>
           </w:p>
         </w:tc>
@@ -21975,7 +21999,7 @@
                 <w:sz w:val="20"/>
                 <w:szCs w:val="20"/>
               </w:rPr>
-              <w:t xml:space="preserve">2026-10-20</w:t>
+              <w:t>2026-10-20</w:t>
             </w:r>
           </w:p>
         </w:tc>
@@ -22001,7 +22025,7 @@
                 <w:sz w:val="20"/>
                 <w:szCs w:val="20"/>
               </w:rPr>
-              <w:t xml:space="preserve">chore: add .mailmap to unify author identities (#47)</w:t>
+              <w:t>chore: add .mailmap to unify author identities (#47)</w:t>
             </w:r>
           </w:p>
         </w:tc>
@@ -22029,7 +22053,7 @@
                 <w:sz w:val="20"/>
                 <w:szCs w:val="20"/>
               </w:rPr>
-              <w:t xml:space="preserve">#44</w:t>
+              <w:t>#44</w:t>
             </w:r>
           </w:p>
         </w:tc>
@@ -22055,7 +22079,7 @@
                 <w:sz w:val="20"/>
                 <w:szCs w:val="20"/>
               </w:rPr>
-              <w:t xml:space="preserve">2026-10-20</w:t>
+              <w:t>2026-10-20</w:t>
             </w:r>
           </w:p>
         </w:tc>
@@ -22081,7 +22105,7 @@
                 <w:sz w:val="20"/>
                 <w:szCs w:val="20"/>
               </w:rPr>
-              <w:t xml:space="preserve">docs: unassign open backlog items and add DB diagram task (#48)</w:t>
+              <w:t>docs: unassign open backlog items and add DB diagram task (#48)</w:t>
             </w:r>
           </w:p>
         </w:tc>
@@ -22109,7 +22133,7 @@
                 <w:sz w:val="20"/>
                 <w:szCs w:val="20"/>
               </w:rPr>
-              <w:t xml:space="preserve">#45</w:t>
+              <w:t>#45</w:t>
             </w:r>
           </w:p>
         </w:tc>
@@ -22135,7 +22159,7 @@
                 <w:sz w:val="20"/>
                 <w:szCs w:val="20"/>
               </w:rPr>
-              <w:t xml:space="preserve">2026-10-20</w:t>
+              <w:t>2026-10-20</w:t>
             </w:r>
           </w:p>
         </w:tc>
@@ -22161,7 +22185,7 @@
                 <w:sz w:val="20"/>
                 <w:szCs w:val="20"/>
               </w:rPr>
-              <w:t xml:space="preserve">docs: Fase 1 improvement plan (#26)</w:t>
+              <w:t>docs: Fase 1 improvement plan (#26)</w:t>
             </w:r>
           </w:p>
         </w:tc>
@@ -22189,7 +22213,7 @@
                 <w:sz w:val="20"/>
                 <w:szCs w:val="20"/>
               </w:rPr>
-              <w:t xml:space="preserve">#46</w:t>
+              <w:t>#46</w:t>
             </w:r>
           </w:p>
         </w:tc>
@@ -22215,7 +22239,7 @@
                 <w:sz w:val="20"/>
                 <w:szCs w:val="20"/>
               </w:rPr>
-              <w:t xml:space="preserve">2026-10-20</w:t>
+              <w:t>2026-10-20</w:t>
             </w:r>
           </w:p>
         </w:tc>
@@ -22241,7 +22265,7 @@
                 <w:sz w:val="20"/>
                 <w:szCs w:val="20"/>
               </w:rPr>
-              <w:t xml:space="preserve">docs: progress guide 2.4 and draft diary 2.1 (#37)</w:t>
+              <w:t>docs: progress guide 2.4 and draft diary 2.1 (#37)</w:t>
             </w:r>
           </w:p>
         </w:tc>
@@ -22269,7 +22293,7 @@
                 <w:sz w:val="20"/>
                 <w:szCs w:val="20"/>
               </w:rPr>
-              <w:t xml:space="preserve">#47</w:t>
+              <w:t>#47</w:t>
             </w:r>
           </w:p>
         </w:tc>
@@ -22295,7 +22319,7 @@
                 <w:sz w:val="20"/>
                 <w:szCs w:val="20"/>
               </w:rPr>
-              <w:t xml:space="preserve">2026-10-21</w:t>
+              <w:t>2026-10-21</w:t>
             </w:r>
           </w:p>
         </w:tc>
@@ -22321,7 +22345,7 @@
                 <w:sz w:val="20"/>
                 <w:szCs w:val="20"/>
               </w:rPr>
-              <w:t xml:space="preserve">crear carpeta base de datos</w:t>
+              <w:t>crear carpeta base de datos</w:t>
             </w:r>
           </w:p>
         </w:tc>
@@ -22349,7 +22373,7 @@
                 <w:sz w:val="20"/>
                 <w:szCs w:val="20"/>
               </w:rPr>
-              <w:t xml:space="preserve">#48</w:t>
+              <w:t>#48</w:t>
             </w:r>
           </w:p>
         </w:tc>
@@ -22375,7 +22399,7 @@
                 <w:sz w:val="20"/>
                 <w:szCs w:val="20"/>
               </w:rPr>
-              <w:t xml:space="preserve">2026-10-21</w:t>
+              <w:t>2026-10-21</w:t>
             </w:r>
           </w:p>
         </w:tc>
@@ -22401,7 +22425,7 @@
                 <w:sz w:val="20"/>
                 <w:szCs w:val="20"/>
               </w:rPr>
-              <w:t xml:space="preserve">Add files via upload</w:t>
+              <w:t>Add files via upload</w:t>
             </w:r>
           </w:p>
         </w:tc>
@@ -22429,7 +22453,7 @@
                 <w:sz w:val="20"/>
                 <w:szCs w:val="20"/>
               </w:rPr>
-              <w:t xml:space="preserve">#49</w:t>
+              <w:t>#49</w:t>
             </w:r>
           </w:p>
         </w:tc>
@@ -22455,7 +22479,7 @@
                 <w:sz w:val="20"/>
                 <w:szCs w:val="20"/>
               </w:rPr>
-              <w:t xml:space="preserve">2026-10-21</w:t>
+              <w:t>2026-10-21</w:t>
             </w:r>
           </w:p>
         </w:tc>
@@ -22481,7 +22505,7 @@
                 <w:sz w:val="20"/>
                 <w:szCs w:val="20"/>
               </w:rPr>
-              <w:t xml:space="preserve">Delete Anexos/Diseño/Base de datos/a.txt</w:t>
+              <w:t>Delete Anexos/Diseño/Base de datos/a.txt</w:t>
             </w:r>
           </w:p>
         </w:tc>
@@ -22509,7 +22533,7 @@
                 <w:sz w:val="20"/>
                 <w:szCs w:val="20"/>
               </w:rPr>
-              <w:t xml:space="preserve">#50</w:t>
+              <w:t>#50</w:t>
             </w:r>
           </w:p>
         </w:tc>
@@ -22535,7 +22559,7 @@
                 <w:sz w:val="20"/>
                 <w:szCs w:val="20"/>
               </w:rPr>
-              <w:t xml:space="preserve">2026-10-21</w:t>
+              <w:t>2026-10-21</w:t>
             </w:r>
           </w:p>
         </w:tc>
@@ -22561,7 +22585,7 @@
                 <w:sz w:val="20"/>
                 <w:szCs w:val="20"/>
               </w:rPr>
-              <w:t xml:space="preserve">Add files via upload</w:t>
+              <w:t>Add files via upload</w:t>
             </w:r>
           </w:p>
         </w:tc>
@@ -22589,7 +22613,7 @@
                 <w:sz w:val="20"/>
                 <w:szCs w:val="20"/>
               </w:rPr>
-              <w:t xml:space="preserve">#51</w:t>
+              <w:t>#51</w:t>
             </w:r>
           </w:p>
         </w:tc>
@@ -22615,7 +22639,7 @@
                 <w:sz w:val="20"/>
                 <w:szCs w:val="20"/>
               </w:rPr>
-              <w:t xml:space="preserve">2026-10-21</w:t>
+              <w:t>2026-10-21</w:t>
             </w:r>
           </w:p>
         </w:tc>
@@ -22641,7 +22665,7 @@
                 <w:sz w:val="20"/>
                 <w:szCs w:val="20"/>
               </w:rPr>
-              <w:t xml:space="preserve">Add files via upload</w:t>
+              <w:t>Add files via upload</w:t>
             </w:r>
           </w:p>
         </w:tc>
@@ -22669,7 +22693,7 @@
                 <w:sz w:val="20"/>
                 <w:szCs w:val="20"/>
               </w:rPr>
-              <w:t xml:space="preserve">#52</w:t>
+              <w:t>#52</w:t>
             </w:r>
           </w:p>
         </w:tc>
@@ -22695,7 +22719,7 @@
                 <w:sz w:val="20"/>
                 <w:szCs w:val="20"/>
               </w:rPr>
-              <w:t xml:space="preserve">2026-10-21</w:t>
+              <w:t>2026-10-21</w:t>
             </w:r>
           </w:p>
         </w:tc>
@@ -22721,7 +22745,7 @@
                 <w:sz w:val="20"/>
                 <w:szCs w:val="20"/>
               </w:rPr>
-              <w:t xml:space="preserve">docs: add Mariana's reflection and mark improvement plan done in interim report (#27)</w:t>
+              <w:t>docs: add Mariana's reflection and mark improvement plan done in interim report (#27)</w:t>
             </w:r>
           </w:p>
         </w:tc>
@@ -22749,7 +22773,8 @@
                 <w:sz w:val="20"/>
                 <w:szCs w:val="20"/>
               </w:rPr>
-              <w:t xml:space="preserve">#53</w:t>
+              <w:lastRenderedPageBreak/>
+              <w:t>#53</w:t>
             </w:r>
           </w:p>
         </w:tc>
@@ -22775,7 +22800,7 @@
                 <w:sz w:val="20"/>
                 <w:szCs w:val="20"/>
               </w:rPr>
-              <w:t xml:space="preserve">2026-10-21</w:t>
+              <w:t>2026-10-21</w:t>
             </w:r>
           </w:p>
         </w:tc>
@@ -22801,7 +22826,7 @@
                 <w:sz w:val="20"/>
                 <w:szCs w:val="20"/>
               </w:rPr>
-              <w:t xml:space="preserve">docs: redo use case templates and diagrams for the Django web app (#42)</w:t>
+              <w:t>docs: redo use case templates and diagrams for the Django web app (#42)</w:t>
             </w:r>
           </w:p>
         </w:tc>
@@ -22829,7 +22854,7 @@
                 <w:sz w:val="20"/>
                 <w:szCs w:val="20"/>
               </w:rPr>
-              <w:t xml:space="preserve">#54</w:t>
+              <w:t>#54</w:t>
             </w:r>
           </w:p>
         </w:tc>
@@ -22855,7 +22880,7 @@
                 <w:sz w:val="20"/>
                 <w:szCs w:val="20"/>
               </w:rPr>
-              <w:t xml:space="preserve">2026-10-21</w:t>
+              <w:t>2026-10-21</w:t>
             </w:r>
           </w:p>
         </w:tc>
@@ -22881,7 +22906,7 @@
                 <w:sz w:val="20"/>
                 <w:szCs w:val="20"/>
               </w:rPr>
-              <w:t xml:space="preserve">feat: export availability reports in Excel, CSV and PDF (CU04, #7)</w:t>
+              <w:t>feat: export availability reports in Excel, CSV and PDF (CU04, #7)</w:t>
             </w:r>
           </w:p>
         </w:tc>
@@ -22909,7 +22934,7 @@
                 <w:sz w:val="20"/>
                 <w:szCs w:val="20"/>
               </w:rPr>
-              <w:t xml:space="preserve">#55</w:t>
+              <w:t>#55</w:t>
             </w:r>
           </w:p>
         </w:tc>
@@ -22935,7 +22960,7 @@
                 <w:sz w:val="20"/>
                 <w:szCs w:val="20"/>
               </w:rPr>
-              <w:t xml:space="preserve">2026-10-21</w:t>
+              <w:t>2026-10-21</w:t>
             </w:r>
           </w:p>
         </w:tc>
@@ -22961,7 +22986,7 @@
                 <w:sz w:val="20"/>
                 <w:szCs w:val="20"/>
               </w:rPr>
-              <w:t xml:space="preserve">feat: fine-tuning del detector fuera de SKU-110K (#33)</w:t>
+              <w:t>feat: fine-tuning del detector fuera de SKU-110K (#33)</w:t>
             </w:r>
           </w:p>
         </w:tc>
@@ -22989,7 +23014,7 @@
                 <w:sz w:val="20"/>
                 <w:szCs w:val="20"/>
               </w:rPr>
-              <w:t xml:space="preserve">#57</w:t>
+              <w:t>#57</w:t>
             </w:r>
           </w:p>
         </w:tc>
@@ -23015,7 +23040,7 @@
                 <w:sz w:val="20"/>
                 <w:szCs w:val="20"/>
               </w:rPr>
-              <w:t xml:space="preserve">2026-10-21</w:t>
+              <w:t>2026-10-21</w:t>
             </w:r>
           </w:p>
         </w:tc>
@@ -23041,7 +23066,7 @@
                 <w:sz w:val="20"/>
                 <w:szCs w:val="20"/>
               </w:rPr>
-              <w:t xml:space="preserve">docs: la revisión de otro integrante deja de ser obligatoria</w:t>
+              <w:t>docs: la revisión de otro integrante deja de ser obligatoria</w:t>
             </w:r>
           </w:p>
         </w:tc>

</xml_diff>

<commit_message>
docs: add architecture diagram and current commit counts to interim report (#27)
</commit_message>
<xml_diff>
--- a/Fase 2/Informe intermedio de avance - ShelfVision AI.docx
+++ b/Fase 2/Informe intermedio de avance - ShelfVision AI.docx
@@ -8720,6 +8720,71 @@
       </w:r>
       <w:r>
         <w:t>).</w:t>
+      </w:r>
+    </w:p>
+    <w:p>
+      <w:pPr>
+        <w:keepNext/>
+        <w:spacing w:before="80" w:after="60"/>
+        <w:jc w:val="center"/>
+      </w:pPr>
+      <w:r>
+        <w:rPr>
+          <w:noProof/>
+        </w:rPr>
+        <w:drawing>
+          <wp:inline distT="0" distB="0" distL="0" distR="0">
+            <wp:extent cx="5715000" cy="5860791"/>
+            <wp:effectExtent l="0" t="0" r="0" b="0"/>
+            <wp:docPr id="21" name="Imagen 21" descr="Diagrama de arquitectura de ShelfVision AI"/>
+            <wp:cNvGraphicFramePr>
+              <a:graphicFrameLocks xmlns:a="http://schemas.openxmlformats.org/drawingml/2006/main" noChangeAspect="1"/>
+            </wp:cNvGraphicFramePr>
+            <a:graphic xmlns:a="http://schemas.openxmlformats.org/drawingml/2006/main">
+              <a:graphicData uri="http://schemas.openxmlformats.org/drawingml/2006/picture">
+                <pic:pic xmlns:pic="http://schemas.openxmlformats.org/drawingml/2006/picture">
+                  <pic:nvPicPr>
+                    <pic:cNvPr id="0" name=""/>
+                    <pic:cNvPicPr>
+                      <a:picLocks noChangeAspect="1" noChangeArrowheads="1"/>
+                    </pic:cNvPicPr>
+                  </pic:nvPicPr>
+                  <pic:blipFill>
+                    <a:blip r:embed="rId30"/>
+                    <a:srcRect/>
+                    <a:stretch>
+                      <a:fillRect/>
+                    </a:stretch>
+                  </pic:blipFill>
+                  <pic:spPr bwMode="auto">
+                    <a:xfrm>
+                      <a:off x="0" y="0"/>
+                      <a:ext cx="5715000" cy="5860791"/>
+                    </a:xfrm>
+                    <a:prstGeom prst="rect">
+                      <a:avLst/>
+                    </a:prstGeom>
+                  </pic:spPr>
+                </pic:pic>
+              </a:graphicData>
+            </a:graphic>
+          </wp:inline>
+        </w:drawing>
+      </w:r>
+    </w:p>
+    <w:p>
+      <w:pPr>
+        <w:spacing w:before="60" w:after="200"/>
+      </w:pPr>
+      <w:r>
+        <w:rPr>
+          <w:i/>
+          <w:iCs/>
+          <w:color w:val="595959"/>
+          <w:sz w:val="18"/>
+          <w:szCs w:val="18"/>
+        </w:rPr>
+        <w:t>Figura 1. Diagrama de arquitectura: ingesta, pipeline de visión (OpenCV y YOLO26), app web Django y evaluación externa. Fuente: Anexos/Diseño/Diagramas fuente (Mermaid)/Diagrama de Arquitectura.mmd.</w:t>
       </w:r>
     </w:p>
     <w:p>
@@ -16579,7 +16644,7 @@
                 <w:sz w:val="20"/>
                 <w:szCs w:val="20"/>
               </w:rPr>
-              <w:t>81</w:t>
+              <w:t>84</w:t>
             </w:r>
           </w:p>
         </w:tc>
@@ -16660,7 +16725,7 @@
                 <w:sz w:val="20"/>
                 <w:szCs w:val="20"/>
               </w:rPr>
-              <w:t>45</w:t>
+              <w:t>46</w:t>
             </w:r>
           </w:p>
         </w:tc>
@@ -16740,7 +16805,7 @@
                 <w:sz w:val="20"/>
                 <w:szCs w:val="20"/>
               </w:rPr>
-              <w:t>41</w:t>
+              <w:t>44</w:t>
             </w:r>
           </w:p>
         </w:tc>
@@ -16784,7 +16849,7 @@
           <w:sz w:val="18"/>
           <w:szCs w:val="18"/>
         </w:rPr>
-        <w:t>Tabla 10. Commits por integrante (git shortlog -sne, sin merges, con .mailmap; los de Nicko figuran con el nombre «Mateo»). Total: 167.</w:t>
+        <w:t>Tabla 10. Commits por integrante (git shortlog -sne, sin merges, con .mailmap; los de Nicko figuran con el nombre «Mateo»). Total: 174.</w:t>
       </w:r>
     </w:p>
     <w:p>

</xml_diff>

<commit_message>
docs: assign items #43, #44, #52 and #53 to Mariana
</commit_message>
<xml_diff>
--- a/Fase 2/Informe intermedio de avance - ShelfVision AI.docx
+++ b/Fase 2/Informe intermedio de avance - ShelfVision AI.docx
@@ -7187,7 +7187,7 @@
                 <w:sz w:val="20"/>
                 <w:szCs w:val="20"/>
               </w:rPr>
-              <w:t>Por asignar</w:t>
+              <w:t>Mariana</w:t>
             </w:r>
           </w:p>
         </w:tc>
@@ -17625,7 +17625,7 @@
                 <w:sz w:val="20"/>
                 <w:szCs w:val="20"/>
               </w:rPr>
-              <w:t>Por asignar</w:t>
+              <w:t>Mariana</w:t>
             </w:r>
           </w:p>
         </w:tc>

</xml_diff>

<commit_message>
docs: reassign audit items #49, #51 and #54 to Mariana
</commit_message>
<xml_diff>
--- a/Fase 2/Informe intermedio de avance - ShelfVision AI.docx
+++ b/Fase 2/Informe intermedio de avance - ShelfVision AI.docx
@@ -3967,7 +3967,7 @@
                 <w:sz w:val="20"/>
                 <w:szCs w:val="20"/>
               </w:rPr>
-              <w:t>Abierto. Francisco, 2026-10-27</w:t>
+              <w:t>Abierto. Mariana, 2026-10-27</w:t>
             </w:r>
           </w:p>
         </w:tc>
@@ -4179,7 +4179,7 @@
                 <w:sz w:val="20"/>
                 <w:szCs w:val="20"/>
               </w:rPr>
-              <w:t>Abierto. Francisco, 2026-10-28</w:t>
+              <w:t>Abierto. Mariana, 2026-10-28</w:t>
             </w:r>
           </w:p>
         </w:tc>
@@ -4497,7 +4497,7 @@
                 <w:sz w:val="20"/>
                 <w:szCs w:val="20"/>
               </w:rPr>
-              <w:t>Abierto. Nicko, 2026-10-30</w:t>
+              <w:t>Abierto. Mariana, 2026-10-30</w:t>
             </w:r>
           </w:p>
         </w:tc>
@@ -6657,7 +6657,7 @@
                 <w:sz w:val="20"/>
                 <w:szCs w:val="20"/>
               </w:rPr>
-              <w:t>Francisco</w:t>
+              <w:t>Mariana (#49), Francisco (#50)</w:t>
             </w:r>
           </w:p>
         </w:tc>
@@ -6763,7 +6763,7 @@
                 <w:sz w:val="20"/>
                 <w:szCs w:val="20"/>
               </w:rPr>
-              <w:t>Francisco</w:t>
+              <w:t>Mariana</w:t>
             </w:r>
           </w:p>
         </w:tc>
@@ -6975,7 +6975,7 @@
                 <w:sz w:val="20"/>
                 <w:szCs w:val="20"/>
               </w:rPr>
-              <w:t>Nicko</w:t>
+              <w:t>Mariana</w:t>
             </w:r>
           </w:p>
         </w:tc>
@@ -16988,7 +16988,7 @@
                 <w:sz w:val="20"/>
                 <w:szCs w:val="20"/>
               </w:rPr>
-              <w:t>Francisco</w:t>
+              <w:t>Mariana (#49), Francisco (#50)</w:t>
             </w:r>
           </w:p>
         </w:tc>
@@ -17095,7 +17095,7 @@
                 <w:sz w:val="20"/>
                 <w:szCs w:val="20"/>
               </w:rPr>
-              <w:t>Francisco</w:t>
+              <w:t>Mariana</w:t>
             </w:r>
           </w:p>
         </w:tc>
@@ -17307,7 +17307,7 @@
                 <w:sz w:val="20"/>
                 <w:szCs w:val="20"/>
               </w:rPr>
-              <w:t>Nicko</w:t>
+              <w:t>Mariana</w:t>
             </w:r>
           </w:p>
         </w:tc>

</xml_diff>